<commit_message>
Fix MCP typo in Haystack lightning talk title
Co-Authored-By: Claude Sonnet 5.5 <noreply@anthropic.com>
</commit_message>
<xml_diff>
--- a/output/chuck_meyer_resume.docx
+++ b/output/chuck_meyer_resume.docx
@@ -2,13 +2,13 @@
 <file path=word/document.xml><?xml version="1.0" encoding="utf-8"?>
 <w:document xmlns:w="http://schemas.openxmlformats.org/wordprocessingml/2006/main" xmlns:m="http://schemas.openxmlformats.org/officeDocument/2006/math" xmlns:r="http://schemas.openxmlformats.org/officeDocument/2006/relationships" xmlns:o="urn:schemas-microsoft-com:office:office" xmlns:v="urn:schemas-microsoft-com:vml" xmlns:w10="urn:schemas-microsoft-com:office:word" xmlns:a="http://schemas.openxmlformats.org/drawingml/2006/main" xmlns:pic="http://schemas.openxmlformats.org/drawingml/2006/picture" xmlns:wp="http://schemas.openxmlformats.org/drawingml/2006/wordprocessingDrawing">
   <w:body>
-    <w:bookmarkStart w:id="37" w:name="section"/>
+    <w:bookmarkStart w:id="46" w:name="section"/>
     <w:p>
       <w:pPr>
         <w:pStyle w:val="Heading1"/>
       </w:pPr>
     </w:p>
-    <w:bookmarkStart w:id="36" w:name="charles-chuck-meyer"/>
+    <w:bookmarkStart w:id="45" w:name="charles-chuck-meyer"/>
     <w:p>
       <w:pPr>
         <w:pStyle w:val="Heading2"/>
@@ -52,7 +52,7 @@
         <w:pStyle w:val="FirstParagraph"/>
       </w:pPr>
       <w:r>
-        <w:t xml:space="preserve">Developer Relations leader with experience building and scaling developer communities from the ground up. Proven track record launching community platforms (2,000+ member Discord), migrating technical documentation, and establishing developer advocacy programs that drive adoption of API-first platforms. Deep security expertise working with CISOs and enterprise security teams on cloud infrastructure and compliance frameworks.</w:t>
+        <w:t xml:space="preserve">Developer Relations leader with experience building and scaling developer communities from the ground up. Proven track record launching community platforms (2,000+ member Discord), migrating technical documentation, and establishing developer advocacy programs that drive adoption of API-first platforms. Currently focused on developer experience for AI agents: building conversational search with MCP and tool-calling agents, and writing about agent-ready developer tooling. Deep security expertise working with CISOs and enterprise security teams on cloud infrastructure and compliance frameworks.</w:t>
       </w:r>
     </w:p>
     <w:bookmarkEnd w:id="20"/>
@@ -71,8 +71,8 @@
       </w:pPr>
       <w:r>
         <w:rPr>
-          <w:b/>
-          <w:bCs/>
+          <w:bCs/>
+          <w:b/>
         </w:rPr>
         <w:t xml:space="preserve">Developer Community Building</w:t>
       </w:r>
@@ -87,8 +87,8 @@
       </w:r>
       <w:r>
         <w:rPr>
-          <w:b/>
-          <w:bCs/>
+          <w:bCs/>
+          <w:b/>
         </w:rPr>
         <w:t xml:space="preserve">Technical Documentation</w:t>
       </w:r>
@@ -103,8 +103,8 @@
       </w:r>
       <w:r>
         <w:rPr>
-          <w:b/>
-          <w:bCs/>
+          <w:bCs/>
+          <w:b/>
         </w:rPr>
         <w:t xml:space="preserve">API Integration &amp; Support</w:t>
       </w:r>
@@ -113,8 +113,8 @@
       </w:r>
       <w:r>
         <w:rPr>
-          <w:b/>
-          <w:bCs/>
+          <w:bCs/>
+          <w:b/>
         </w:rPr>
         <w:t xml:space="preserve">JavaScript/React/Next.js</w:t>
       </w:r>
@@ -129,8 +129,8 @@
       </w:r>
       <w:r>
         <w:rPr>
-          <w:b/>
-          <w:bCs/>
+          <w:bCs/>
+          <w:b/>
         </w:rPr>
         <w:t xml:space="preserve">Python</w:t>
       </w:r>
@@ -145,8 +145,8 @@
       </w:r>
       <w:r>
         <w:rPr>
-          <w:b/>
-          <w:bCs/>
+          <w:bCs/>
+          <w:b/>
         </w:rPr>
         <w:t xml:space="preserve">Go</w:t>
       </w:r>
@@ -161,8 +161,8 @@
       </w:r>
       <w:r>
         <w:rPr>
-          <w:b/>
-          <w:bCs/>
+          <w:bCs/>
+          <w:b/>
         </w:rPr>
         <w:t xml:space="preserve">AWS Services &amp; Security</w:t>
       </w:r>
@@ -171,8 +171,8 @@
       </w:r>
       <w:r>
         <w:rPr>
-          <w:b/>
-          <w:bCs/>
+          <w:bCs/>
+          <w:b/>
         </w:rPr>
         <w:t xml:space="preserve">DevOps/CI/CD</w:t>
       </w:r>
@@ -187,8 +187,8 @@
       </w:r>
       <w:r>
         <w:rPr>
-          <w:b/>
-          <w:bCs/>
+          <w:bCs/>
+          <w:b/>
         </w:rPr>
         <w:t xml:space="preserve">Developer Advocacy</w:t>
       </w:r>
@@ -203,8 +203,8 @@
       </w:r>
       <w:r>
         <w:rPr>
-          <w:b/>
-          <w:bCs/>
+          <w:bCs/>
+          <w:b/>
         </w:rPr>
         <w:t xml:space="preserve">Technical Writing</w:t>
       </w:r>
@@ -219,8 +219,8 @@
       </w:r>
       <w:r>
         <w:rPr>
-          <w:b/>
-          <w:bCs/>
+          <w:bCs/>
+          <w:b/>
         </w:rPr>
         <w:t xml:space="preserve">Public Speaking</w:t>
       </w:r>
@@ -229,24 +229,24 @@
       </w:r>
       <w:r>
         <w:rPr>
-          <w:b/>
-          <w:bCs/>
-        </w:rPr>
-        <w:t xml:space="preserve">AI/ML Integration</w:t>
-      </w:r>
-      <w:r>
-        <w:t xml:space="preserve"> </w:t>
-      </w:r>
-      <w:r>
-        <w:t xml:space="preserve">(MCP, Agentic Workflows) -</w:t>
-      </w:r>
-      <w:r>
-        <w:t xml:space="preserve"> </w:t>
-      </w:r>
-      <w:r>
-        <w:rPr>
-          <w:b/>
-          <w:bCs/>
+          <w:bCs/>
+          <w:b/>
+        </w:rPr>
+        <w:t xml:space="preserve">AI Agents</w:t>
+      </w:r>
+      <w:r>
+        <w:t xml:space="preserve"> </w:t>
+      </w:r>
+      <w:r>
+        <w:t xml:space="preserve">(MCP, Tool Use, Agentic Workflows, Evals) -</w:t>
+      </w:r>
+      <w:r>
+        <w:t xml:space="preserve"> </w:t>
+      </w:r>
+      <w:r>
+        <w:rPr>
+          <w:bCs/>
+          <w:b/>
         </w:rPr>
         <w:t xml:space="preserve">Security Architecture</w:t>
       </w:r>
@@ -261,8 +261,8 @@
       </w:r>
       <w:r>
         <w:rPr>
-          <w:b/>
-          <w:bCs/>
+          <w:bCs/>
+          <w:b/>
         </w:rPr>
         <w:t xml:space="preserve">Compliance Frameworks</w:t>
       </w:r>
@@ -275,7 +275,7 @@
       </w:r>
     </w:p>
     <w:bookmarkEnd w:id="21"/>
-    <w:bookmarkStart w:id="31" w:name="technical-content"/>
+    <w:bookmarkStart w:id="37" w:name="technical-content"/>
     <w:p>
       <w:pPr>
         <w:pStyle w:val="Heading3"/>
@@ -290,21 +290,149 @@
       </w:pPr>
       <w:r>
         <w:rPr>
-          <w:b/>
-          <w:bCs/>
+          <w:bCs/>
+          <w:b/>
         </w:rPr>
         <w:t xml:space="preserve">Writing</w:t>
       </w:r>
     </w:p>
     <w:p>
       <w:pPr>
-        <w:pStyle w:val="Compact"/>
         <w:numPr>
           <w:ilvl w:val="0"/>
           <w:numId w:val="1001"/>
         </w:numPr>
+        <w:pStyle w:val="Compact"/>
       </w:pPr>
       <w:hyperlink r:id="rId22">
+        <w:r>
+          <w:rPr>
+            <w:rStyle w:val="Hyperlink"/>
+          </w:rPr>
+          <w:t xml:space="preserve">We rewrote the Algolia CLI for AI agents</w:t>
+        </w:r>
+      </w:hyperlink>
+      <w:r>
+        <w:t xml:space="preserve"> </w:t>
+      </w:r>
+      <w:r>
+        <w:t xml:space="preserve">- Algolia Engineering Blog, May 2026</w:t>
+      </w:r>
+    </w:p>
+    <w:p>
+      <w:pPr>
+        <w:numPr>
+          <w:ilvl w:val="0"/>
+          <w:numId w:val="1001"/>
+        </w:numPr>
+        <w:pStyle w:val="Compact"/>
+      </w:pPr>
+      <w:hyperlink r:id="rId23">
+        <w:r>
+          <w:rPr>
+            <w:rStyle w:val="Hyperlink"/>
+          </w:rPr>
+          <w:t xml:space="preserve">Chat, meet the Searchbox</w:t>
+        </w:r>
+      </w:hyperlink>
+      <w:r>
+        <w:t xml:space="preserve"> </w:t>
+      </w:r>
+      <w:r>
+        <w:t xml:space="preserve">- Algolia Engineering Blog, June 2026</w:t>
+      </w:r>
+    </w:p>
+    <w:p>
+      <w:pPr>
+        <w:numPr>
+          <w:ilvl w:val="0"/>
+          <w:numId w:val="1001"/>
+        </w:numPr>
+        <w:pStyle w:val="Compact"/>
+      </w:pPr>
+      <w:hyperlink r:id="rId24">
+        <w:r>
+          <w:rPr>
+            <w:rStyle w:val="Hyperlink"/>
+          </w:rPr>
+          <w:t xml:space="preserve">The Agent Factory: Building Consistent Agents at Scale</w:t>
+        </w:r>
+      </w:hyperlink>
+      <w:r>
+        <w:t xml:space="preserve"> </w:t>
+      </w:r>
+      <w:r>
+        <w:t xml:space="preserve">- DEV Community, March 2026</w:t>
+      </w:r>
+    </w:p>
+    <w:p>
+      <w:pPr>
+        <w:numPr>
+          <w:ilvl w:val="0"/>
+          <w:numId w:val="1001"/>
+        </w:numPr>
+        <w:pStyle w:val="Compact"/>
+      </w:pPr>
+      <w:hyperlink r:id="rId25">
+        <w:r>
+          <w:rPr>
+            <w:rStyle w:val="Hyperlink"/>
+          </w:rPr>
+          <w:t xml:space="preserve">Building a JavaScript</w:t>
+        </w:r>
+        <w:r>
+          <w:rPr>
+            <w:rStyle w:val="Hyperlink"/>
+          </w:rPr>
+          <w:t xml:space="preserve"> </w:t>
+        </w:r>
+        <w:r>
+          <w:rPr>
+            <w:rStyle w:val="Hyperlink"/>
+          </w:rPr>
+          <w:t xml:space="preserve">“</w:t>
+        </w:r>
+        <w:r>
+          <w:rPr>
+            <w:rStyle w:val="Hyperlink"/>
+          </w:rPr>
+          <w:t xml:space="preserve">Hello, World</w:t>
+        </w:r>
+        <w:r>
+          <w:rPr>
+            <w:rStyle w:val="Hyperlink"/>
+          </w:rPr>
+          <w:t xml:space="preserve">”</w:t>
+        </w:r>
+        <w:r>
+          <w:rPr>
+            <w:rStyle w:val="Hyperlink"/>
+          </w:rPr>
+          <w:t xml:space="preserve"> </w:t>
+        </w:r>
+        <w:r>
+          <w:rPr>
+            <w:rStyle w:val="Hyperlink"/>
+          </w:rPr>
+          <w:t xml:space="preserve">MCP server in 2026</w:t>
+        </w:r>
+      </w:hyperlink>
+      <w:r>
+        <w:t xml:space="preserve"> </w:t>
+      </w:r>
+      <w:r>
+        <w:t xml:space="preserve">- DEV Community, February 2026 (398 views, 8 reactions, 3 comments)</w:t>
+      </w:r>
+    </w:p>
+    <w:p>
+      <w:pPr>
+        <w:numPr>
+          <w:ilvl w:val="0"/>
+          <w:numId w:val="1001"/>
+        </w:numPr>
+        <w:pStyle w:val="Compact"/>
+      </w:pPr>
+      <w:hyperlink r:id="rId26">
         <w:r>
           <w:rPr>
             <w:rStyle w:val="Hyperlink"/>
@@ -321,13 +449,13 @@
     </w:p>
     <w:p>
       <w:pPr>
-        <w:pStyle w:val="Compact"/>
         <w:numPr>
           <w:ilvl w:val="0"/>
           <w:numId w:val="1001"/>
         </w:numPr>
-      </w:pPr>
-      <w:hyperlink r:id="rId23">
+        <w:pStyle w:val="Compact"/>
+      </w:pPr>
+      <w:hyperlink r:id="rId27">
         <w:r>
           <w:rPr>
             <w:rStyle w:val="Hyperlink"/>
@@ -347,13 +475,13 @@
     </w:p>
     <w:p>
       <w:pPr>
-        <w:pStyle w:val="Compact"/>
         <w:numPr>
           <w:ilvl w:val="0"/>
           <w:numId w:val="1001"/>
         </w:numPr>
-      </w:pPr>
-      <w:hyperlink r:id="rId24">
+        <w:pStyle w:val="Compact"/>
+      </w:pPr>
+      <w:hyperlink r:id="rId28">
         <w:r>
           <w:rPr>
             <w:rStyle w:val="Hyperlink"/>
@@ -370,28 +498,84 @@
     </w:p>
     <w:p>
       <w:pPr>
+        <w:numPr>
+          <w:ilvl w:val="0"/>
+          <w:numId w:val="1001"/>
+        </w:numPr>
+        <w:pStyle w:val="Compact"/>
+      </w:pPr>
+      <w:r>
+        <w:t xml:space="preserve">More at</w:t>
+      </w:r>
+      <w:r>
+        <w:t xml:space="preserve"> </w:t>
+      </w:r>
+      <w:hyperlink r:id="rId29">
+        <w:r>
+          <w:rPr>
+            <w:rStyle w:val="Hyperlink"/>
+          </w:rPr>
+          <w:t xml:space="preserve">dev.to/chuckm</w:t>
+        </w:r>
+      </w:hyperlink>
+    </w:p>
+    <w:p>
+      <w:pPr>
         <w:pStyle w:val="FirstParagraph"/>
       </w:pPr>
       <w:r>
         <w:rPr>
-          <w:b/>
-          <w:bCs/>
+          <w:bCs/>
+          <w:b/>
         </w:rPr>
         <w:t xml:space="preserve">Speaking &amp; Presentations</w:t>
       </w:r>
     </w:p>
     <w:p>
       <w:pPr>
-        <w:pStyle w:val="Compact"/>
         <w:numPr>
           <w:ilvl w:val="0"/>
           <w:numId w:val="1002"/>
         </w:numPr>
-      </w:pPr>
-      <w:r>
-        <w:rPr>
-          <w:b/>
-          <w:bCs/>
+        <w:pStyle w:val="Compact"/>
+      </w:pPr>
+      <w:r>
+        <w:rPr>
+          <w:bCs/>
+          <w:b/>
+        </w:rPr>
+        <w:t xml:space="preserve">DevRelCon 2026</w:t>
+      </w:r>
+      <w:r>
+        <w:t xml:space="preserve"> </w:t>
+      </w:r>
+      <w:r>
+        <w:t xml:space="preserve">-</w:t>
+      </w:r>
+      <w:r>
+        <w:t xml:space="preserve"> </w:t>
+      </w:r>
+      <w:hyperlink r:id="rId30">
+        <w:r>
+          <w:rPr>
+            <w:rStyle w:val="Hyperlink"/>
+          </w:rPr>
+          <w:t xml:space="preserve">Blog While the Context is Fresh</w:t>
+        </w:r>
+      </w:hyperlink>
+    </w:p>
+    <w:p>
+      <w:pPr>
+        <w:numPr>
+          <w:ilvl w:val="0"/>
+          <w:numId w:val="1002"/>
+        </w:numPr>
+        <w:pStyle w:val="Compact"/>
+      </w:pPr>
+      <w:r>
+        <w:rPr>
+          <w:bCs/>
+          <w:b/>
         </w:rPr>
         <w:t xml:space="preserve">AWS re:Invent 2018</w:t>
       </w:r>
@@ -404,7 +588,7 @@
       <w:r>
         <w:t xml:space="preserve"> </w:t>
       </w:r>
-      <w:hyperlink r:id="rId25">
+      <w:hyperlink r:id="rId31">
         <w:r>
           <w:rPr>
             <w:rStyle w:val="Hyperlink"/>
@@ -415,16 +599,16 @@
     </w:p>
     <w:p>
       <w:pPr>
-        <w:pStyle w:val="Compact"/>
         <w:numPr>
           <w:ilvl w:val="0"/>
           <w:numId w:val="1002"/>
         </w:numPr>
-      </w:pPr>
-      <w:r>
-        <w:rPr>
-          <w:b/>
-          <w:bCs/>
+        <w:pStyle w:val="Compact"/>
+      </w:pPr>
+      <w:r>
+        <w:rPr>
+          <w:bCs/>
+          <w:b/>
         </w:rPr>
         <w:t xml:space="preserve">Search Relevance Panel</w:t>
       </w:r>
@@ -437,7 +621,7 @@
       <w:r>
         <w:t xml:space="preserve"> </w:t>
       </w:r>
-      <w:hyperlink r:id="rId26">
+      <w:hyperlink r:id="rId32">
         <w:r>
           <w:rPr>
             <w:rStyle w:val="Hyperlink"/>
@@ -454,18 +638,18 @@
     </w:p>
     <w:p>
       <w:pPr>
-        <w:pStyle w:val="Compact"/>
         <w:numPr>
           <w:ilvl w:val="0"/>
           <w:numId w:val="1002"/>
         </w:numPr>
-      </w:pPr>
-      <w:r>
-        <w:rPr>
-          <w:b/>
-          <w:bCs/>
-        </w:rPr>
-        <w:t xml:space="preserve">Lightning Talk</w:t>
+        <w:pStyle w:val="Compact"/>
+      </w:pPr>
+      <w:r>
+        <w:rPr>
+          <w:bCs/>
+          <w:b/>
+        </w:rPr>
+        <w:t xml:space="preserve">Haystack US 2025 Lightning Talk</w:t>
       </w:r>
       <w:r>
         <w:t xml:space="preserve"> </w:t>
@@ -476,7 +660,7 @@
       <w:r>
         <w:t xml:space="preserve"> </w:t>
       </w:r>
-      <w:hyperlink r:id="rId27">
+      <w:hyperlink r:id="rId33">
         <w:r>
           <w:rPr>
             <w:rStyle w:val="Hyperlink"/>
@@ -491,24 +675,24 @@
       </w:pPr>
       <w:r>
         <w:rPr>
-          <w:b/>
-          <w:bCs/>
+          <w:bCs/>
+          <w:b/>
         </w:rPr>
         <w:t xml:space="preserve">Community Engagement</w:t>
       </w:r>
     </w:p>
     <w:p>
       <w:pPr>
-        <w:pStyle w:val="Compact"/>
         <w:numPr>
           <w:ilvl w:val="0"/>
           <w:numId w:val="1003"/>
         </w:numPr>
-      </w:pPr>
-      <w:r>
-        <w:rPr>
-          <w:b/>
-          <w:bCs/>
+        <w:pStyle w:val="Compact"/>
+      </w:pPr>
+      <w:r>
+        <w:rPr>
+          <w:bCs/>
+          <w:b/>
         </w:rPr>
         <w:t xml:space="preserve">Live Coding Series</w:t>
       </w:r>
@@ -521,7 +705,7 @@
       <w:r>
         <w:t xml:space="preserve"> </w:t>
       </w:r>
-      <w:hyperlink r:id="rId28">
+      <w:hyperlink r:id="rId34">
         <w:r>
           <w:rPr>
             <w:rStyle w:val="Hyperlink"/>
@@ -532,16 +716,16 @@
     </w:p>
     <w:p>
       <w:pPr>
-        <w:pStyle w:val="Compact"/>
         <w:numPr>
           <w:ilvl w:val="0"/>
           <w:numId w:val="1003"/>
         </w:numPr>
-      </w:pPr>
-      <w:r>
-        <w:rPr>
-          <w:b/>
-          <w:bCs/>
+        <w:pStyle w:val="Compact"/>
+      </w:pPr>
+      <w:r>
+        <w:rPr>
+          <w:bCs/>
+          <w:b/>
         </w:rPr>
         <w:t xml:space="preserve">Fireside Chat</w:t>
       </w:r>
@@ -554,7 +738,7 @@
       <w:r>
         <w:t xml:space="preserve"> </w:t>
       </w:r>
-      <w:hyperlink r:id="rId29">
+      <w:hyperlink r:id="rId35">
         <w:r>
           <w:rPr>
             <w:rStyle w:val="Hyperlink"/>
@@ -565,11 +749,11 @@
     </w:p>
     <w:p>
       <w:pPr>
-        <w:pStyle w:val="Compact"/>
         <w:numPr>
           <w:ilvl w:val="0"/>
           <w:numId w:val="1003"/>
         </w:numPr>
+        <w:pStyle w:val="Compact"/>
       </w:pPr>
       <w:r>
         <w:t xml:space="preserve">Sponsored Content -</w:t>
@@ -577,7 +761,7 @@
       <w:r>
         <w:t xml:space="preserve"> </w:t>
       </w:r>
-      <w:hyperlink r:id="rId30">
+      <w:hyperlink r:id="rId36">
         <w:r>
           <w:rPr>
             <w:rStyle w:val="Hyperlink"/>
@@ -593,8 +777,8 @@
         </w:pict>
       </w:r>
     </w:p>
-    <w:bookmarkEnd w:id="31"/>
-    <w:bookmarkStart w:id="33" w:name="recent-projects"/>
+    <w:bookmarkEnd w:id="37"/>
+    <w:bookmarkStart w:id="42" w:name="recent-projects"/>
     <w:p>
       <w:pPr>
         <w:pStyle w:val="Heading3"/>
@@ -609,8 +793,128 @@
       </w:pPr>
       <w:r>
         <w:rPr>
-          <w:b/>
-          <w:bCs/>
+          <w:bCs/>
+          <w:b/>
+        </w:rPr>
+        <w:t xml:space="preserve">Pokemon TCG Vending Machine Search</w:t>
+      </w:r>
+      <w:r>
+        <w:t xml:space="preserve"> </w:t>
+      </w:r>
+      <w:r>
+        <w:t xml:space="preserve">-</w:t>
+      </w:r>
+      <w:r>
+        <w:t xml:space="preserve"> </w:t>
+      </w:r>
+      <w:hyperlink r:id="rId38">
+        <w:r>
+          <w:rPr>
+            <w:rStyle w:val="Hyperlink"/>
+          </w:rPr>
+          <w:t xml:space="preserve">GitHub: algolia-samples/algolia-tcg-search</w:t>
+        </w:r>
+      </w:hyperlink>
+      <w:r>
+        <w:br/>
+      </w:r>
+      <w:r>
+        <w:t xml:space="preserve">Full-stack conference-booth demo: a React/InstantSearch app with an Algolia Agent Studio chat agent (search tools, grouped-results rendering, evals), a card scanner, serverless claim APIs on Vercel with a Supabase backend, and Python tooling that stands up a new event’s indices from a spreadsheet. Rebuilt around unified search and AI chat, as described in</w:t>
+      </w:r>
+      <w:r>
+        <w:t xml:space="preserve"> </w:t>
+      </w:r>
+      <w:r>
+        <w:t xml:space="preserve">“</w:t>
+      </w:r>
+      <w:r>
+        <w:t xml:space="preserve">Chat, meet the Searchbox</w:t>
+      </w:r>
+      <w:r>
+        <w:t xml:space="preserve">”</w:t>
+      </w:r>
+      <w:r>
+        <w:t xml:space="preserve">.</w:t>
+      </w:r>
+    </w:p>
+    <w:p>
+      <w:pPr>
+        <w:pStyle w:val="BodyText"/>
+      </w:pPr>
+      <w:r>
+        <w:rPr>
+          <w:bCs/>
+          <w:b/>
+        </w:rPr>
+        <w:t xml:space="preserve">Hello MCP</w:t>
+      </w:r>
+      <w:r>
+        <w:t xml:space="preserve"> </w:t>
+      </w:r>
+      <w:r>
+        <w:t xml:space="preserve">-</w:t>
+      </w:r>
+      <w:r>
+        <w:t xml:space="preserve"> </w:t>
+      </w:r>
+      <w:hyperlink r:id="rId39">
+        <w:r>
+          <w:rPr>
+            <w:rStyle w:val="Hyperlink"/>
+          </w:rPr>
+          <w:t xml:space="preserve">GitHub: chuckmeyer/hello-mcp</w:t>
+        </w:r>
+      </w:hyperlink>
+      <w:r>
+        <w:br/>
+      </w:r>
+      <w:r>
+        <w:t xml:space="preserve">Minimal MCP server over Streamable HTTP demonstrating tools and resources, with a companion tutorial.</w:t>
+      </w:r>
+    </w:p>
+    <w:p>
+      <w:pPr>
+        <w:pStyle w:val="BodyText"/>
+      </w:pPr>
+      <w:r>
+        <w:rPr>
+          <w:bCs/>
+          <w:b/>
+        </w:rPr>
+        <w:t xml:space="preserve">Agent Studio CLI</w:t>
+      </w:r>
+      <w:r>
+        <w:t xml:space="preserve"> </w:t>
+      </w:r>
+      <w:r>
+        <w:t xml:space="preserve">-</w:t>
+      </w:r>
+      <w:r>
+        <w:t xml:space="preserve"> </w:t>
+      </w:r>
+      <w:hyperlink r:id="rId40">
+        <w:r>
+          <w:rPr>
+            <w:rStyle w:val="Hyperlink"/>
+          </w:rPr>
+          <w:t xml:space="preserve">GitHub: algolia-samples/algolia-agent-cli</w:t>
+        </w:r>
+      </w:hyperlink>
+      <w:r>
+        <w:br/>
+      </w:r>
+      <w:r>
+        <w:t xml:space="preserve">Standalone command-line tool for Algolia’s Agent Studio, taken from idea to working tool in a week.</w:t>
+      </w:r>
+    </w:p>
+    <w:p>
+      <w:pPr>
+        <w:pStyle w:val="BodyText"/>
+      </w:pPr>
+      <w:r>
+        <w:rPr>
+          <w:bCs/>
+          <w:b/>
         </w:rPr>
         <w:t xml:space="preserve">Video Transcription Search Application</w:t>
       </w:r>
@@ -623,7 +927,7 @@
       <w:r>
         <w:t xml:space="preserve"> </w:t>
       </w:r>
-      <w:hyperlink r:id="rId32">
+      <w:hyperlink r:id="rId41">
         <w:r>
           <w:rPr>
             <w:rStyle w:val="Hyperlink"/>
@@ -639,32 +943,14 @@
       </w:r>
     </w:p>
     <w:p>
-      <w:pPr>
-        <w:pStyle w:val="BodyText"/>
-      </w:pPr>
-      <w:r>
-        <w:rPr>
-          <w:b/>
-          <w:bCs/>
-        </w:rPr>
-        <w:t xml:space="preserve">AI-Powered Developer Workflows</w:t>
-      </w:r>
-      <w:r>
-        <w:t xml:space="preserve"> </w:t>
-      </w:r>
-      <w:r>
-        <w:t xml:space="preserve">- Implementing MCP (Model Context Protocol) and agentic workflows using n8n for automated developer support and community engagement.</w:t>
-      </w:r>
-    </w:p>
-    <w:p>
       <w:r>
         <w:pict>
           <v:rect style="width:0;height:1.5pt" o:hralign="center" o:hrstd="t" o:hr="t"/>
         </w:pict>
       </w:r>
     </w:p>
-    <w:bookmarkEnd w:id="33"/>
-    <w:bookmarkStart w:id="34" w:name="professional-experience"/>
+    <w:bookmarkEnd w:id="42"/>
+    <w:bookmarkStart w:id="43" w:name="professional-experience"/>
     <w:p>
       <w:pPr>
         <w:pStyle w:val="Heading3"/>
@@ -679,8 +965,8 @@
       </w:pPr>
       <w:r>
         <w:rPr>
-          <w:b/>
-          <w:bCs/>
+          <w:bCs/>
+          <w:b/>
         </w:rPr>
         <w:t xml:space="preserve">Senior Manager, Developer Relations</w:t>
       </w:r>
@@ -701,10 +987,44 @@
       </w:r>
       <w:r>
         <w:rPr>
+          <w:iCs/>
           <w:i/>
+        </w:rPr>
+        <w:t xml:space="preserve">August 2025 to present</w:t>
+      </w:r>
+    </w:p>
+    <w:p>
+      <w:pPr>
+        <w:pStyle w:val="BodyText"/>
+      </w:pPr>
+      <w:r>
+        <w:rPr>
+          <w:bCs/>
+          <w:b/>
+        </w:rPr>
+        <w:t xml:space="preserve">Lead Developer Advocate</w:t>
+      </w:r>
+      <w:r>
+        <w:t xml:space="preserve"> </w:t>
+      </w:r>
+      <w:r>
+        <w:t xml:space="preserve">| Algolia</w:t>
+      </w:r>
+      <w:r>
+        <w:t xml:space="preserve"> </w:t>
+      </w:r>
+      <w:r>
+        <w:t xml:space="preserve">-</w:t>
+      </w:r>
+      <w:r>
+        <w:t xml:space="preserve"> </w:t>
+      </w:r>
+      <w:r>
+        <w:rPr>
           <w:iCs/>
-        </w:rPr>
-        <w:t xml:space="preserve">August 2025 to present</w:t>
+          <w:i/>
+        </w:rPr>
+        <w:t xml:space="preserve">August 2021 to August 2025</w:t>
       </w:r>
     </w:p>
     <w:p>
@@ -712,33 +1032,7 @@
         <w:pStyle w:val="BodyText"/>
       </w:pPr>
       <w:r>
-        <w:rPr>
-          <w:b/>
-          <w:bCs/>
-        </w:rPr>
-        <w:t xml:space="preserve">Lead Developer Advocate</w:t>
-      </w:r>
-      <w:r>
-        <w:t xml:space="preserve"> </w:t>
-      </w:r>
-      <w:r>
-        <w:t xml:space="preserve">| Algolia</w:t>
-      </w:r>
-      <w:r>
-        <w:t xml:space="preserve"> </w:t>
-      </w:r>
-      <w:r>
-        <w:t xml:space="preserve">-</w:t>
-      </w:r>
-      <w:r>
-        <w:t xml:space="preserve"> </w:t>
-      </w:r>
-      <w:r>
-        <w:rPr>
-          <w:i/>
-          <w:iCs/>
-        </w:rPr>
-        <w:t xml:space="preserve">August 2021 to August 2025</w:t>
+        <w:t xml:space="preserve">Leading a cross-functional team of developer advocates, technical writers, and developer marketers supporting Algolia’s API-first search platform.</w:t>
       </w:r>
     </w:p>
     <w:p>
@@ -746,33 +1040,25 @@
         <w:pStyle w:val="BodyText"/>
       </w:pPr>
       <w:r>
-        <w:t xml:space="preserve">Leading a cross-functional team of developer advocates, technical writers, and developer marketers supporting Algolia’s API-first search platform.</w:t>
-      </w:r>
-    </w:p>
-    <w:p>
-      <w:pPr>
-        <w:pStyle w:val="BodyText"/>
-      </w:pPr>
-      <w:r>
-        <w:rPr>
-          <w:b/>
-          <w:bCs/>
+        <w:rPr>
+          <w:bCs/>
+          <w:b/>
         </w:rPr>
         <w:t xml:space="preserve">Key Achievements:</w:t>
       </w:r>
     </w:p>
     <w:p>
       <w:pPr>
-        <w:pStyle w:val="Compact"/>
         <w:numPr>
           <w:ilvl w:val="0"/>
           <w:numId w:val="1004"/>
         </w:numPr>
-      </w:pPr>
-      <w:r>
-        <w:rPr>
-          <w:b/>
-          <w:bCs/>
+        <w:pStyle w:val="Compact"/>
+      </w:pPr>
+      <w:r>
+        <w:rPr>
+          <w:bCs/>
+          <w:b/>
         </w:rPr>
         <w:t xml:space="preserve">Launched Algolia Discord Server</w:t>
       </w:r>
@@ -785,38 +1071,38 @@
     </w:p>
     <w:p>
       <w:pPr>
-        <w:pStyle w:val="Compact"/>
         <w:numPr>
           <w:ilvl w:val="0"/>
           <w:numId w:val="1004"/>
         </w:numPr>
-      </w:pPr>
-      <w:r>
-        <w:rPr>
-          <w:b/>
-          <w:bCs/>
-        </w:rPr>
-        <w:t xml:space="preserve">Managing documentation migration</w:t>
-      </w:r>
-      <w:r>
-        <w:t xml:space="preserve"> </w:t>
-      </w:r>
-      <w:r>
-        <w:t xml:space="preserve">to Mintlify platform, improving developer onboarding experience</w:t>
-      </w:r>
-    </w:p>
-    <w:p>
-      <w:pPr>
-        <w:pStyle w:val="Compact"/>
+        <w:pStyle w:val="Compact"/>
+      </w:pPr>
+      <w:r>
+        <w:rPr>
+          <w:bCs/>
+          <w:b/>
+        </w:rPr>
+        <w:t xml:space="preserve">Led documentation migration</w:t>
+      </w:r>
+      <w:r>
+        <w:t xml:space="preserve"> </w:t>
+      </w:r>
+      <w:r>
+        <w:t xml:space="preserve">to Mintlify with zero downtime, improving developer onboarding experience</w:t>
+      </w:r>
+    </w:p>
+    <w:p>
+      <w:pPr>
         <w:numPr>
           <w:ilvl w:val="0"/>
           <w:numId w:val="1004"/>
         </w:numPr>
-      </w:pPr>
-      <w:r>
-        <w:rPr>
-          <w:b/>
-          <w:bCs/>
+        <w:pStyle w:val="Compact"/>
+      </w:pPr>
+      <w:r>
+        <w:rPr>
+          <w:bCs/>
+          <w:b/>
         </w:rPr>
         <w:t xml:space="preserve">Organize and host quarterly Developer Livestream</w:t>
       </w:r>
@@ -829,16 +1115,35 @@
     </w:p>
     <w:p>
       <w:pPr>
-        <w:pStyle w:val="Compact"/>
         <w:numPr>
           <w:ilvl w:val="0"/>
           <w:numId w:val="1004"/>
         </w:numPr>
-      </w:pPr>
-      <w:r>
-        <w:rPr>
-          <w:b/>
-          <w:bCs/>
+        <w:pStyle w:val="Compact"/>
+      </w:pPr>
+      <w:r>
+        <w:rPr>
+          <w:bCs/>
+          <w:b/>
+        </w:rPr>
+        <w:t xml:space="preserve">Host Algolia DevCon</w:t>
+      </w:r>
+      <w:r>
+        <w:t xml:space="preserve">, the annual developer conference, for five consecutive years (2026 edition on October 1), tracking the shift from fusion ranking to RAG to production agents</w:t>
+      </w:r>
+    </w:p>
+    <w:p>
+      <w:pPr>
+        <w:numPr>
+          <w:ilvl w:val="0"/>
+          <w:numId w:val="1004"/>
+        </w:numPr>
+        <w:pStyle w:val="Compact"/>
+      </w:pPr>
+      <w:r>
+        <w:rPr>
+          <w:bCs/>
+          <w:b/>
         </w:rPr>
         <w:t xml:space="preserve">Host live coding sessions</w:t>
       </w:r>
@@ -851,23 +1156,191 @@
     </w:p>
     <w:p>
       <w:pPr>
+        <w:numPr>
+          <w:ilvl w:val="0"/>
+          <w:numId w:val="1004"/>
+        </w:numPr>
+        <w:pStyle w:val="Compact"/>
+      </w:pPr>
+      <w:r>
+        <w:rPr>
+          <w:bCs/>
+          <w:b/>
+        </w:rPr>
+        <w:t xml:space="preserve">Published agent-focused engineering content</w:t>
+      </w:r>
+      <w:r>
+        <w:t xml:space="preserve"> </w:t>
+      </w:r>
+      <w:r>
+        <w:t xml:space="preserve">in 2026:</w:t>
+      </w:r>
+      <w:r>
+        <w:t xml:space="preserve"> </w:t>
+      </w:r>
+      <w:r>
+        <w:t xml:space="preserve">“</w:t>
+      </w:r>
+      <w:r>
+        <w:t xml:space="preserve">We rewrote the Algolia CLI for AI agents</w:t>
+      </w:r>
+      <w:r>
+        <w:t xml:space="preserve">”</w:t>
+      </w:r>
+      <w:r>
+        <w:t xml:space="preserve"> </w:t>
+      </w:r>
+      <w:r>
+        <w:t xml:space="preserve">drew 419 views and was the 4th most-viewed Algolia engineering post of the half;</w:t>
+      </w:r>
+      <w:r>
+        <w:t xml:space="preserve"> </w:t>
+      </w:r>
+      <w:r>
+        <w:t xml:space="preserve">“</w:t>
+      </w:r>
+      <w:r>
+        <w:t xml:space="preserve">Chat, meet the Searchbox</w:t>
+      </w:r>
+      <w:r>
+        <w:t xml:space="preserve">”</w:t>
+      </w:r>
+      <w:r>
+        <w:t xml:space="preserve"> </w:t>
+      </w:r>
+      <w:r>
+        <w:t xml:space="preserve">followed with 267 views</w:t>
+      </w:r>
+    </w:p>
+    <w:p>
+      <w:pPr>
+        <w:numPr>
+          <w:ilvl w:val="0"/>
+          <w:numId w:val="1004"/>
+        </w:numPr>
+        <w:pStyle w:val="Compact"/>
+      </w:pPr>
+      <w:r>
+        <w:rPr>
+          <w:bCs/>
+          <w:b/>
+        </w:rPr>
+        <w:t xml:space="preserve">Produced the Quick Start video</w:t>
+      </w:r>
+      <w:r>
+        <w:t xml:space="preserve"> </w:t>
+      </w:r>
+      <w:r>
+        <w:t xml:space="preserve">embedded in the getting-started docs, drawing 811 views in its first month</w:t>
+      </w:r>
+    </w:p>
+    <w:p>
+      <w:pPr>
+        <w:numPr>
+          <w:ilvl w:val="0"/>
+          <w:numId w:val="1004"/>
+        </w:numPr>
+        <w:pStyle w:val="Compact"/>
+      </w:pPr>
+      <w:r>
+        <w:rPr>
+          <w:bCs/>
+          <w:b/>
+        </w:rPr>
+        <w:t xml:space="preserve">Built reusable demo platforms</w:t>
+      </w:r>
+      <w:r>
+        <w:t xml:space="preserve"> </w:t>
+      </w:r>
+      <w:r>
+        <w:t xml:space="preserve">(TCG Search and SwagSearch) and deployed them at seven conferences in six months, including Adobe Summit, Shoptalk and eTail, each turned around in a week or less</w:t>
+      </w:r>
+    </w:p>
+    <w:p>
+      <w:pPr>
+        <w:numPr>
+          <w:ilvl w:val="0"/>
+          <w:numId w:val="1004"/>
+        </w:numPr>
+        <w:pStyle w:val="Compact"/>
+      </w:pPr>
+      <w:r>
+        <w:rPr>
+          <w:bCs/>
+          <w:b/>
+        </w:rPr>
+        <w:t xml:space="preserve">Claimed Algolia’s library on Context7</w:t>
+      </w:r>
+      <w:r>
+        <w:t xml:space="preserve"> </w:t>
+      </w:r>
+      <w:r>
+        <w:t xml:space="preserve">and moved llms.txt to its canonical location to make the docs readable by AI tools</w:t>
+      </w:r>
+    </w:p>
+    <w:p>
+      <w:pPr>
+        <w:numPr>
+          <w:ilvl w:val="0"/>
+          <w:numId w:val="1004"/>
+        </w:numPr>
+        <w:pStyle w:val="Compact"/>
+      </w:pPr>
+      <w:r>
+        <w:rPr>
+          <w:bCs/>
+          <w:b/>
+        </w:rPr>
+        <w:t xml:space="preserve">Reviewed roughly 15 pieces of content</w:t>
+      </w:r>
+      <w:r>
+        <w:t xml:space="preserve"> </w:t>
+      </w:r>
+      <w:r>
+        <w:t xml:space="preserve">for colleagues in six months, nearly all inside a week</w:t>
+      </w:r>
+    </w:p>
+    <w:p>
+      <w:pPr>
+        <w:numPr>
+          <w:ilvl w:val="0"/>
+          <w:numId w:val="1004"/>
+        </w:numPr>
+        <w:pStyle w:val="Compact"/>
+      </w:pPr>
+      <w:r>
+        <w:rPr>
+          <w:bCs/>
+          <w:b/>
+        </w:rPr>
+        <w:t xml:space="preserve">Spoke to Algolia’s Aspiring Managers Program</w:t>
+      </w:r>
+      <w:r>
+        <w:t xml:space="preserve"> </w:t>
+      </w:r>
+      <w:r>
+        <w:t xml:space="preserve">on the transition from IC to manager</w:t>
+      </w:r>
+    </w:p>
+    <w:p>
+      <w:pPr>
         <w:pStyle w:val="FirstParagraph"/>
       </w:pPr>
       <w:r>
         <w:rPr>
-          <w:b/>
-          <w:bCs/>
+          <w:bCs/>
+          <w:b/>
         </w:rPr>
         <w:t xml:space="preserve">Responsibilities:</w:t>
       </w:r>
     </w:p>
     <w:p>
       <w:pPr>
-        <w:pStyle w:val="Compact"/>
         <w:numPr>
           <w:ilvl w:val="0"/>
           <w:numId w:val="1005"/>
         </w:numPr>
+        <w:pStyle w:val="Compact"/>
       </w:pPr>
       <w:r>
         <w:t xml:space="preserve">Built demo applications showcasing platform capabilities, including video transcription search solutions</w:t>
@@ -875,23 +1348,23 @@
     </w:p>
     <w:p>
       <w:pPr>
-        <w:pStyle w:val="Compact"/>
         <w:numPr>
           <w:ilvl w:val="0"/>
           <w:numId w:val="1005"/>
         </w:numPr>
-      </w:pPr>
-      <w:r>
-        <w:t xml:space="preserve">Managed developer advocacy team and coordinated with product teams on new feature awareness</w:t>
-      </w:r>
-    </w:p>
-    <w:p>
-      <w:pPr>
-        <w:pStyle w:val="Compact"/>
+        <w:pStyle w:val="Compact"/>
+      </w:pPr>
+      <w:r>
+        <w:t xml:space="preserve">Managed the docs and developer advocacy teams (up to five direct reports) and coordinated with product teams on new feature awareness</w:t>
+      </w:r>
+    </w:p>
+    <w:p>
+      <w:pPr>
         <w:numPr>
           <w:ilvl w:val="0"/>
           <w:numId w:val="1005"/>
         </w:numPr>
+        <w:pStyle w:val="Compact"/>
       </w:pPr>
       <w:r>
         <w:t xml:space="preserve">Created technical content strategy spanning blogs, video tutorials, and conference presentations</w:t>
@@ -910,8 +1383,8 @@
       </w:pPr>
       <w:r>
         <w:rPr>
-          <w:b/>
-          <w:bCs/>
+          <w:bCs/>
+          <w:b/>
         </w:rPr>
         <w:t xml:space="preserve">Senior Engineer, Developer Relations and Integrations</w:t>
       </w:r>
@@ -932,8 +1405,8 @@
       </w:r>
       <w:r>
         <w:rPr>
+          <w:iCs/>
           <w:i/>
-          <w:iCs/>
         </w:rPr>
         <w:t xml:space="preserve">March 2019 to August 2021</w:t>
       </w:r>
@@ -952,24 +1425,24 @@
       </w:pPr>
       <w:r>
         <w:rPr>
-          <w:b/>
-          <w:bCs/>
+          <w:bCs/>
+          <w:b/>
         </w:rPr>
         <w:t xml:space="preserve">Key Achievements:</w:t>
       </w:r>
     </w:p>
     <w:p>
       <w:pPr>
-        <w:pStyle w:val="Compact"/>
         <w:numPr>
           <w:ilvl w:val="0"/>
           <w:numId w:val="1006"/>
         </w:numPr>
-      </w:pPr>
-      <w:r>
-        <w:rPr>
-          <w:b/>
-          <w:bCs/>
+        <w:pStyle w:val="Compact"/>
+      </w:pPr>
+      <w:r>
+        <w:rPr>
+          <w:bCs/>
+          <w:b/>
         </w:rPr>
         <w:t xml:space="preserve">Built comprehensive Developers Portal</w:t>
       </w:r>
@@ -982,16 +1455,16 @@
     </w:p>
     <w:p>
       <w:pPr>
-        <w:pStyle w:val="Compact"/>
         <w:numPr>
           <w:ilvl w:val="0"/>
           <w:numId w:val="1006"/>
         </w:numPr>
-      </w:pPr>
-      <w:r>
-        <w:rPr>
-          <w:b/>
-          <w:bCs/>
+        <w:pStyle w:val="Compact"/>
+      </w:pPr>
+      <w:r>
+        <w:rPr>
+          <w:bCs/>
+          <w:b/>
         </w:rPr>
         <w:t xml:space="preserve">Maintained product documentation</w:t>
       </w:r>
@@ -1004,16 +1477,16 @@
     </w:p>
     <w:p>
       <w:pPr>
-        <w:pStyle w:val="Compact"/>
         <w:numPr>
           <w:ilvl w:val="0"/>
           <w:numId w:val="1006"/>
         </w:numPr>
-      </w:pPr>
-      <w:r>
-        <w:rPr>
-          <w:b/>
-          <w:bCs/>
+        <w:pStyle w:val="Compact"/>
+      </w:pPr>
+      <w:r>
+        <w:rPr>
+          <w:bCs/>
+          <w:b/>
         </w:rPr>
         <w:t xml:space="preserve">Advocated for partner-requested enhancements</w:t>
       </w:r>
@@ -1037,8 +1510,8 @@
       </w:pPr>
       <w:r>
         <w:rPr>
-          <w:b/>
-          <w:bCs/>
+          <w:bCs/>
+          <w:b/>
         </w:rPr>
         <w:t xml:space="preserve">Senior Developer Advocate, AWS CloudFormation</w:t>
       </w:r>
@@ -1059,8 +1532,8 @@
       </w:r>
       <w:r>
         <w:rPr>
+          <w:iCs/>
           <w:i/>
-          <w:iCs/>
         </w:rPr>
         <w:t xml:space="preserve">August 2017 to March 2019</w:t>
       </w:r>
@@ -1079,24 +1552,24 @@
       </w:pPr>
       <w:r>
         <w:rPr>
-          <w:b/>
-          <w:bCs/>
+          <w:bCs/>
+          <w:b/>
         </w:rPr>
         <w:t xml:space="preserve">Key Achievements:</w:t>
       </w:r>
     </w:p>
     <w:p>
       <w:pPr>
-        <w:pStyle w:val="Compact"/>
         <w:numPr>
           <w:ilvl w:val="0"/>
           <w:numId w:val="1007"/>
         </w:numPr>
-      </w:pPr>
-      <w:r>
-        <w:rPr>
-          <w:b/>
-          <w:bCs/>
+        <w:pStyle w:val="Compact"/>
+      </w:pPr>
+      <w:r>
+        <w:rPr>
+          <w:bCs/>
+          <w:b/>
         </w:rPr>
         <w:t xml:space="preserve">Represented developer community</w:t>
       </w:r>
@@ -1109,16 +1582,16 @@
     </w:p>
     <w:p>
       <w:pPr>
-        <w:pStyle w:val="Compact"/>
         <w:numPr>
           <w:ilvl w:val="0"/>
           <w:numId w:val="1007"/>
         </w:numPr>
-      </w:pPr>
-      <w:r>
-        <w:rPr>
-          <w:b/>
-          <w:bCs/>
+        <w:pStyle w:val="Compact"/>
+      </w:pPr>
+      <w:r>
+        <w:rPr>
+          <w:bCs/>
+          <w:b/>
         </w:rPr>
         <w:t xml:space="preserve">Maintained open source repositories</w:t>
       </w:r>
@@ -1131,16 +1604,16 @@
     </w:p>
     <w:p>
       <w:pPr>
-        <w:pStyle w:val="Compact"/>
         <w:numPr>
           <w:ilvl w:val="0"/>
           <w:numId w:val="1007"/>
         </w:numPr>
-      </w:pPr>
-      <w:r>
-        <w:rPr>
-          <w:b/>
-          <w:bCs/>
+        <w:pStyle w:val="Compact"/>
+      </w:pPr>
+      <w:r>
+        <w:rPr>
+          <w:bCs/>
+          <w:b/>
         </w:rPr>
         <w:t xml:space="preserve">Published best practices content</w:t>
       </w:r>
@@ -1153,16 +1626,16 @@
     </w:p>
     <w:p>
       <w:pPr>
-        <w:pStyle w:val="Compact"/>
         <w:numPr>
           <w:ilvl w:val="0"/>
           <w:numId w:val="1007"/>
         </w:numPr>
-      </w:pPr>
-      <w:r>
-        <w:rPr>
-          <w:b/>
-          <w:bCs/>
+        <w:pStyle w:val="Compact"/>
+      </w:pPr>
+      <w:r>
+        <w:rPr>
+          <w:bCs/>
+          <w:b/>
         </w:rPr>
         <w:t xml:space="preserve">Engaged enterprise customers</w:t>
       </w:r>
@@ -1186,8 +1659,8 @@
       </w:pPr>
       <w:r>
         <w:rPr>
-          <w:b/>
-          <w:bCs/>
+          <w:bCs/>
+          <w:b/>
         </w:rPr>
         <w:t xml:space="preserve">Security Solution Architect</w:t>
       </w:r>
@@ -1208,8 +1681,8 @@
       </w:r>
       <w:r>
         <w:rPr>
+          <w:iCs/>
           <w:i/>
-          <w:iCs/>
         </w:rPr>
         <w:t xml:space="preserve">April 2016 to August 2017</w:t>
       </w:r>
@@ -1228,24 +1701,24 @@
       </w:pPr>
       <w:r>
         <w:rPr>
-          <w:b/>
-          <w:bCs/>
+          <w:bCs/>
+          <w:b/>
         </w:rPr>
         <w:t xml:space="preserve">Key Achievements:</w:t>
       </w:r>
     </w:p>
     <w:p>
       <w:pPr>
-        <w:pStyle w:val="Compact"/>
         <w:numPr>
           <w:ilvl w:val="0"/>
           <w:numId w:val="1008"/>
         </w:numPr>
-      </w:pPr>
-      <w:r>
-        <w:rPr>
-          <w:b/>
-          <w:bCs/>
+        <w:pStyle w:val="Compact"/>
+      </w:pPr>
+      <w:r>
+        <w:rPr>
+          <w:bCs/>
+          <w:b/>
         </w:rPr>
         <w:t xml:space="preserve">Reviewed customer cloud network topologies</w:t>
       </w:r>
@@ -1258,16 +1731,16 @@
     </w:p>
     <w:p>
       <w:pPr>
-        <w:pStyle w:val="Compact"/>
         <w:numPr>
           <w:ilvl w:val="0"/>
           <w:numId w:val="1008"/>
         </w:numPr>
-      </w:pPr>
-      <w:r>
-        <w:rPr>
-          <w:b/>
-          <w:bCs/>
+        <w:pStyle w:val="Compact"/>
+      </w:pPr>
+      <w:r>
+        <w:rPr>
+          <w:bCs/>
+          <w:b/>
         </w:rPr>
         <w:t xml:space="preserve">Created AWS security labs</w:t>
       </w:r>
@@ -1280,16 +1753,16 @@
     </w:p>
     <w:p>
       <w:pPr>
-        <w:pStyle w:val="Compact"/>
         <w:numPr>
           <w:ilvl w:val="0"/>
           <w:numId w:val="1008"/>
         </w:numPr>
-      </w:pPr>
-      <w:r>
-        <w:rPr>
-          <w:b/>
-          <w:bCs/>
+        <w:pStyle w:val="Compact"/>
+      </w:pPr>
+      <w:r>
+        <w:rPr>
+          <w:bCs/>
+          <w:b/>
         </w:rPr>
         <w:t xml:space="preserve">Advised on security frameworks</w:t>
       </w:r>
@@ -1313,8 +1786,8 @@
       </w:pPr>
       <w:r>
         <w:rPr>
-          <w:b/>
-          <w:bCs/>
+          <w:bCs/>
+          <w:b/>
         </w:rPr>
         <w:t xml:space="preserve">Senior Professional Services Consultant</w:t>
       </w:r>
@@ -1335,8 +1808,8 @@
       </w:r>
       <w:r>
         <w:rPr>
+          <w:iCs/>
           <w:i/>
-          <w:iCs/>
         </w:rPr>
         <w:t xml:space="preserve">July 2013 to April 2016</w:t>
       </w:r>
@@ -1355,24 +1828,24 @@
       </w:pPr>
       <w:r>
         <w:rPr>
-          <w:b/>
-          <w:bCs/>
+          <w:bCs/>
+          <w:b/>
         </w:rPr>
         <w:t xml:space="preserve">Key Projects:</w:t>
       </w:r>
     </w:p>
     <w:p>
       <w:pPr>
-        <w:pStyle w:val="Compact"/>
         <w:numPr>
           <w:ilvl w:val="0"/>
           <w:numId w:val="1009"/>
         </w:numPr>
-      </w:pPr>
-      <w:r>
-        <w:rPr>
-          <w:b/>
-          <w:bCs/>
+        <w:pStyle w:val="Compact"/>
+      </w:pPr>
+      <w:r>
+        <w:rPr>
+          <w:bCs/>
+          <w:b/>
         </w:rPr>
         <w:t xml:space="preserve">PCI-compliant infrastructure</w:t>
       </w:r>
@@ -1385,16 +1858,16 @@
     </w:p>
     <w:p>
       <w:pPr>
-        <w:pStyle w:val="Compact"/>
         <w:numPr>
           <w:ilvl w:val="0"/>
           <w:numId w:val="1009"/>
         </w:numPr>
-      </w:pPr>
-      <w:r>
-        <w:rPr>
-          <w:b/>
-          <w:bCs/>
+        <w:pStyle w:val="Compact"/>
+      </w:pPr>
+      <w:r>
+        <w:rPr>
+          <w:bCs/>
+          <w:b/>
         </w:rPr>
         <w:t xml:space="preserve">CI/CD pipeline for IAM governance</w:t>
       </w:r>
@@ -1412,8 +1885,8 @@
         </w:pict>
       </w:r>
     </w:p>
-    <w:bookmarkEnd w:id="34"/>
-    <w:bookmarkStart w:id="35" w:name="education"/>
+    <w:bookmarkEnd w:id="43"/>
+    <w:bookmarkStart w:id="44" w:name="education"/>
     <w:p>
       <w:pPr>
         <w:pStyle w:val="Heading3"/>
@@ -1428,8 +1901,8 @@
       </w:pPr>
       <w:r>
         <w:rPr>
-          <w:b/>
-          <w:bCs/>
+          <w:bCs/>
+          <w:b/>
         </w:rPr>
         <w:t xml:space="preserve">Bachelor of Science</w:t>
       </w:r>
@@ -1444,8 +1917,8 @@
       </w:r>
       <w:r>
         <w:rPr>
-          <w:b/>
-          <w:bCs/>
+          <w:bCs/>
+          <w:b/>
         </w:rPr>
         <w:t xml:space="preserve">Bachelor of Arts</w:t>
       </w:r>
@@ -1460,8 +1933,8 @@
       </w:r>
       <w:r>
         <w:rPr>
+          <w:iCs/>
           <w:i/>
-          <w:iCs/>
         </w:rPr>
         <w:t xml:space="preserve">Northern Kentucky University</w:t>
       </w:r>
@@ -1472,14 +1945,10 @@
         <w:t xml:space="preserve">| 1997</w:t>
       </w:r>
     </w:p>
-    <w:bookmarkEnd w:id="35"/>
-    <w:bookmarkEnd w:id="36"/>
-    <w:bookmarkEnd w:id="37"/>
-    <w:sectPr>
-      <w:footnotePr>
-        <w:numRestart w:val="eachSect"/>
-      </w:footnotePr>
-    </w:sectPr>
+    <w:bookmarkEnd w:id="44"/>
+    <w:bookmarkEnd w:id="45"/>
+    <w:bookmarkEnd w:id="46"/>
+    <w:sectPr/>
   </w:body>
 </w:document>
 </file>
@@ -1510,14 +1979,14 @@
 <file path=word/numbering.xml><?xml version="1.0" encoding="utf-8"?>
 <w:numbering xmlns:w="http://schemas.openxmlformats.org/wordprocessingml/2006/main">
   <w:abstractNum w:abstractNumId="990">
-    <w:nsid w:val="0000A990"/>
+    <w:nsid w:val="2c1ae401"/>
     <w:multiLevelType w:val="multilevel"/>
     <w:lvl w:ilvl="0">
       <w:numFmt w:val="bullet"/>
       <w:lvlText w:val=" "/>
       <w:lvlJc w:val="left"/>
       <w:pPr>
-        <w:ind w:left="720" w:hanging="360"/>
+        <w:ind w:left="720" w:hanging="480"/>
       </w:pPr>
     </w:lvl>
     <w:lvl w:ilvl="1">
@@ -1525,7 +1994,7 @@
       <w:lvlText w:val=" "/>
       <w:lvlJc w:val="left"/>
       <w:pPr>
-        <w:ind w:left="1440" w:hanging="360"/>
+        <w:ind w:left="1440" w:hanging="480"/>
       </w:pPr>
     </w:lvl>
     <w:lvl w:ilvl="2">
@@ -1533,7 +2002,7 @@
       <w:lvlText w:val=" "/>
       <w:lvlJc w:val="left"/>
       <w:pPr>
-        <w:ind w:left="2160" w:hanging="360"/>
+        <w:ind w:left="2160" w:hanging="480"/>
       </w:pPr>
     </w:lvl>
     <w:lvl w:ilvl="3">
@@ -1541,7 +2010,7 @@
       <w:lvlText w:val=" "/>
       <w:lvlJc w:val="left"/>
       <w:pPr>
-        <w:ind w:left="2880" w:hanging="360"/>
+        <w:ind w:left="2880" w:hanging="480"/>
       </w:pPr>
     </w:lvl>
     <w:lvl w:ilvl="4">
@@ -1549,7 +2018,7 @@
       <w:lvlText w:val=" "/>
       <w:lvlJc w:val="left"/>
       <w:pPr>
-        <w:ind w:left="3600" w:hanging="360"/>
+        <w:ind w:left="3600" w:hanging="480"/>
       </w:pPr>
     </w:lvl>
     <w:lvl w:ilvl="5">
@@ -1557,7 +2026,7 @@
       <w:lvlText w:val=" "/>
       <w:lvlJc w:val="left"/>
       <w:pPr>
-        <w:ind w:left="4320" w:hanging="360"/>
+        <w:ind w:left="4320" w:hanging="480"/>
       </w:pPr>
     </w:lvl>
     <w:lvl w:ilvl="6">
@@ -1565,7 +2034,7 @@
       <w:lvlText w:val=" "/>
       <w:lvlJc w:val="left"/>
       <w:pPr>
-        <w:ind w:left="5040" w:hanging="360"/>
+        <w:ind w:left="5040" w:hanging="480"/>
       </w:pPr>
     </w:lvl>
     <w:lvl w:ilvl="7">
@@ -1573,7 +2042,7 @@
       <w:lvlText w:val=" "/>
       <w:lvlJc w:val="left"/>
       <w:pPr>
-        <w:ind w:left="5760" w:hanging="360"/>
+        <w:ind w:left="5760" w:hanging="480"/>
       </w:pPr>
     </w:lvl>
     <w:lvl w:ilvl="8">
@@ -1581,111 +2050,84 @@
       <w:lvlText w:val=" "/>
       <w:lvlJc w:val="left"/>
       <w:pPr>
-        <w:ind w:left="6480" w:hanging="360"/>
+        <w:ind w:left="6480" w:hanging="480"/>
       </w:pPr>
     </w:lvl>
   </w:abstractNum>
   <w:abstractNum w:abstractNumId="991">
-    <w:nsid w:val="0000A991"/>
+    <w:nsid w:val="ea454b4c"/>
     <w:multiLevelType w:val="multilevel"/>
     <w:lvl w:ilvl="0">
       <w:numFmt w:val="bullet"/>
-      <w:lvlText w:val=""/>
+      <w:lvlText w:val="•"/>
       <w:lvlJc w:val="left"/>
       <w:pPr>
-        <w:ind w:left="720" w:hanging="360"/>
-      </w:pPr>
-      <w:rPr>
-        <w:rFonts w:ascii="Symbol" w:hAnsi="Symbol" w:cs="Symbol" w:hint="default"/>
-      </w:rPr>
+        <w:ind w:left="720" w:hanging="480"/>
+      </w:pPr>
     </w:lvl>
     <w:lvl w:ilvl="1">
       <w:numFmt w:val="bullet"/>
-      <w:lvlText w:val="o"/>
+      <w:lvlText w:val="–"/>
       <w:lvlJc w:val="left"/>
       <w:pPr>
-        <w:ind w:left="1440" w:hanging="360"/>
-      </w:pPr>
-      <w:rPr>
-        <w:rFonts w:ascii="Courier New" w:hAnsi="Courier New" w:cs="Courier New" w:hint="default"/>
-      </w:rPr>
+        <w:ind w:left="1440" w:hanging="480"/>
+      </w:pPr>
     </w:lvl>
     <w:lvl w:ilvl="2">
       <w:numFmt w:val="bullet"/>
-      <w:lvlText w:val=""/>
+      <w:lvlText w:val="•"/>
       <w:lvlJc w:val="left"/>
       <w:pPr>
-        <w:ind w:left="2160" w:hanging="360"/>
-      </w:pPr>
-      <w:rPr>
-        <w:rFonts w:ascii="Wingdings" w:hAnsi="Wingdings" w:cs="Wingdings" w:hint="default"/>
-      </w:rPr>
+        <w:ind w:left="2160" w:hanging="480"/>
+      </w:pPr>
     </w:lvl>
     <w:lvl w:ilvl="3">
       <w:numFmt w:val="bullet"/>
-      <w:lvlText w:val=""/>
+      <w:lvlText w:val="–"/>
       <w:lvlJc w:val="left"/>
       <w:pPr>
-        <w:ind w:left="2880" w:hanging="360"/>
-      </w:pPr>
-      <w:rPr>
-        <w:rFonts w:ascii="Symbol" w:hAnsi="Symbol" w:cs="Symbol" w:hint="default"/>
-      </w:rPr>
+        <w:ind w:left="2880" w:hanging="480"/>
+      </w:pPr>
     </w:lvl>
     <w:lvl w:ilvl="4">
       <w:numFmt w:val="bullet"/>
-      <w:lvlText w:val="o"/>
+      <w:lvlText w:val="•"/>
       <w:lvlJc w:val="left"/>
       <w:pPr>
-        <w:ind w:left="3600" w:hanging="360"/>
-      </w:pPr>
-      <w:rPr>
-        <w:rFonts w:ascii="Courier New" w:hAnsi="Courier New" w:cs="Courier New" w:hint="default"/>
-      </w:rPr>
+        <w:ind w:left="3600" w:hanging="480"/>
+      </w:pPr>
     </w:lvl>
     <w:lvl w:ilvl="5">
       <w:numFmt w:val="bullet"/>
-      <w:lvlText w:val=""/>
+      <w:lvlText w:val="–"/>
       <w:lvlJc w:val="left"/>
       <w:pPr>
-        <w:ind w:left="4320" w:hanging="360"/>
-      </w:pPr>
-      <w:rPr>
-        <w:rFonts w:ascii="Wingdings" w:hAnsi="Wingdings" w:cs="Wingdings" w:hint="default"/>
-      </w:rPr>
+        <w:ind w:left="4320" w:hanging="480"/>
+      </w:pPr>
     </w:lvl>
     <w:lvl w:ilvl="6">
       <w:numFmt w:val="bullet"/>
-      <w:lvlText w:val=""/>
+      <w:lvlText w:val="•"/>
       <w:lvlJc w:val="left"/>
       <w:pPr>
-        <w:ind w:left="5040" w:hanging="360"/>
-      </w:pPr>
-      <w:rPr>
-        <w:rFonts w:ascii="Symbol" w:hAnsi="Symbol" w:cs="Symbol" w:hint="default"/>
-      </w:rPr>
+        <w:ind w:left="5040" w:hanging="480"/>
+      </w:pPr>
     </w:lvl>
     <w:lvl w:ilvl="7">
       <w:numFmt w:val="bullet"/>
-      <w:lvlText w:val="o"/>
+      <w:lvlText w:val="–"/>
       <w:lvlJc w:val="left"/>
       <w:pPr>
-        <w:ind w:left="5760" w:hanging="360"/>
-      </w:pPr>
-      <w:rPr>
-        <w:rFonts w:ascii="Courier New" w:hAnsi="Courier New" w:cs="Courier New" w:hint="default"/>
-      </w:rPr>
+        <w:ind w:left="5760" w:hanging="480"/>
+      </w:pPr>
     </w:lvl>
     <w:lvl w:ilvl="8">
       <w:numFmt w:val="bullet"/>
-      <w:lvlText w:val=""/>
+      <w:lvlText w:val="•"/>
       <w:lvlJc w:val="left"/>
       <w:pPr>
-        <w:ind w:left="6480" w:hanging="360"/>
-      </w:pPr>
-      <w:rPr>
-        <w:rFonts w:ascii="Wingdings" w:hAnsi="Wingdings" w:cs="Wingdings" w:hint="default"/>
-      </w:rPr>
+        <w:ind w:left="6480" w:hanging="480"/>
+      </w:pPr>
     </w:lvl>
   </w:abstractNum>
   <w:num w:numId="1000">
@@ -1747,10 +2189,10 @@
     <w:name w:val="Body Text"/>
     <w:basedOn w:val="Normal"/>
     <w:link w:val="BodyTextChar"/>
-    <w:qFormat/>
     <w:pPr>
       <w:spacing w:after="180" w:before="180"/>
     </w:pPr>
+    <w:qFormat/>
   </w:style>
   <w:style w:customStyle="1" w:styleId="FirstParagraph" w:type="paragraph">
     <w:name w:val="First Paragraph"/>
@@ -1770,69 +2212,36 @@
     <w:name w:val="Title"/>
     <w:basedOn w:val="Normal"/>
     <w:next w:val="BodyText"/>
-    <w:link w:val="TitleChar"/>
-    <w:uiPriority w:val="10"/>
     <w:qFormat/>
-    <w:rsid w:val="00A10FD9"/>
     <w:pPr>
-      <w:spacing w:after="80" w:line="240" w:lineRule="auto"/>
-      <w:contextualSpacing/>
+      <w:keepNext/>
+      <w:keepLines/>
+      <w:spacing w:after="240" w:before="480"/>
       <w:jc w:val="center"/>
     </w:pPr>
     <w:rPr>
       <w:rFonts w:asciiTheme="majorHAnsi" w:cstheme="majorBidi" w:eastAsiaTheme="majorEastAsia" w:hAnsiTheme="majorHAnsi"/>
-      <w:spacing w:val="-10"/>
-      <w:kern w:val="28"/>
-      <w:sz w:val="56"/>
-      <w:szCs w:val="56"/>
-    </w:rPr>
-  </w:style>
-  <w:style w:customStyle="1" w:styleId="TitleChar" w:type="character">
-    <w:name w:val="Title Char"/>
-    <w:basedOn w:val="DefaultParagraphFont"/>
-    <w:link w:val="Title"/>
-    <w:uiPriority w:val="10"/>
-    <w:rsid w:val="00A10FD9"/>
-    <w:rPr>
-      <w:rFonts w:asciiTheme="majorHAnsi" w:cstheme="majorBidi" w:eastAsiaTheme="majorEastAsia" w:hAnsiTheme="majorHAnsi"/>
-      <w:spacing w:val="-10"/>
-      <w:kern w:val="28"/>
-      <w:sz w:val="56"/>
-      <w:szCs w:val="56"/>
+      <w:b/>
+      <w:bCs/>
+      <w:color w:themeColor="accent1" w:themeShade="B5" w:val="345A8A"/>
+      <w:sz w:val="36"/>
+      <w:szCs w:val="36"/>
     </w:rPr>
   </w:style>
   <w:style w:styleId="Subtitle" w:type="paragraph">
     <w:name w:val="Subtitle"/>
     <w:basedOn w:val="Title"/>
     <w:next w:val="BodyText"/>
-    <w:link w:val="SubtitleChar"/>
-    <w:uiPriority w:val="11"/>
     <w:qFormat/>
-    <w:rsid w:val="00A10FD9"/>
     <w:pPr>
-      <w:numPr>
-        <w:ilvl w:val="1"/>
-      </w:numPr>
+      <w:keepNext/>
+      <w:keepLines/>
+      <w:spacing w:after="240" w:before="240"/>
+      <w:jc w:val="center"/>
     </w:pPr>
     <w:rPr>
-      <w:rFonts w:cstheme="majorBidi" w:eastAsiaTheme="majorEastAsia"/>
-      <w:spacing w:val="15"/>
-      <w:sz w:val="28"/>
-      <w:szCs w:val="28"/>
-    </w:rPr>
-  </w:style>
-  <w:style w:customStyle="1" w:styleId="SubtitleChar" w:type="character">
-    <w:name w:val="Subtitle Char"/>
-    <w:basedOn w:val="DefaultParagraphFont"/>
-    <w:link w:val="Subtitle"/>
-    <w:uiPriority w:val="11"/>
-    <w:rsid w:val="00A10FD9"/>
-    <w:rPr>
-      <w:rFonts w:cstheme="majorBidi" w:eastAsiaTheme="majorEastAsia"/>
-      <w:color w:themeColor="text1" w:themeTint="A6" w:val="595959"/>
-      <w:spacing w:val="15"/>
-      <w:sz w:val="28"/>
-      <w:szCs w:val="28"/>
+      <w:sz w:val="30"/>
+      <w:szCs w:val="30"/>
     </w:rPr>
   </w:style>
   <w:style w:customStyle="1" w:styleId="Author" w:type="paragraph">
@@ -1855,23 +2264,6 @@
       <w:jc w:val="center"/>
     </w:pPr>
   </w:style>
-  <w:style w:customStyle="1" w:styleId="AbstractTitle" w:type="paragraph">
-    <w:name w:val="Abstract Title"/>
-    <w:basedOn w:val="Normal"/>
-    <w:next w:val="Abstract"/>
-    <w:qFormat/>
-    <w:pPr>
-      <w:keepNext/>
-      <w:keepLines/>
-      <w:spacing w:after="0" w:before="300"/>
-      <w:jc w:val="center"/>
-    </w:pPr>
-    <w:rPr>
-      <w:b/>
-      <w:sz w:val="20"/>
-      <w:szCs w:val="20"/>
-    </w:rPr>
-  </w:style>
   <w:style w:customStyle="1" w:styleId="Abstract" w:type="paragraph">
     <w:name w:val="Abstract"/>
     <w:basedOn w:val="Normal"/>
@@ -1880,7 +2272,7 @@
     <w:pPr>
       <w:keepNext/>
       <w:keepLines/>
-      <w:spacing w:after="300" w:before="100"/>
+      <w:spacing w:after="300" w:before="300"/>
     </w:pPr>
     <w:rPr>
       <w:sz w:val="20"/>
@@ -1896,321 +2288,191 @@
     <w:rPr/>
   </w:style>
   <w:style w:styleId="Heading1" w:type="paragraph">
-    <w:name w:val="heading 1"/>
+    <w:name w:val="Heading 1"/>
     <w:basedOn w:val="Normal"/>
     <w:next w:val="BodyText"/>
-    <w:link w:val="Heading1Char"/>
     <w:uiPriority w:val="9"/>
     <w:qFormat/>
-    <w:rsid w:val="00A10FD9"/>
     <w:pPr>
       <w:keepNext/>
       <w:keepLines/>
-      <w:spacing w:after="80" w:before="360"/>
+      <w:spacing w:after="0" w:before="480"/>
       <w:outlineLvl w:val="0"/>
     </w:pPr>
     <w:rPr>
       <w:rFonts w:asciiTheme="majorHAnsi" w:cstheme="majorBidi" w:eastAsiaTheme="majorEastAsia" w:hAnsiTheme="majorHAnsi"/>
-      <w:color w:themeColor="accent1" w:themeShade="BF" w:val="0F4761"/>
-      <w:sz w:val="40"/>
-      <w:szCs w:val="40"/>
+      <w:b/>
+      <w:bCs/>
+      <w:color w:themeColor="accent1" w:val="4F81BD"/>
+      <w:sz w:val="32"/>
+      <w:szCs w:val="32"/>
     </w:rPr>
   </w:style>
   <w:style w:styleId="Heading2" w:type="paragraph">
-    <w:name w:val="heading 2"/>
+    <w:name w:val="Heading 2"/>
     <w:basedOn w:val="Normal"/>
     <w:next w:val="BodyText"/>
-    <w:link w:val="Heading2Char"/>
     <w:uiPriority w:val="9"/>
-    <w:semiHidden/>
     <w:unhideWhenUsed/>
     <w:qFormat/>
-    <w:rsid w:val="00A10FD9"/>
     <w:pPr>
       <w:keepNext/>
       <w:keepLines/>
-      <w:spacing w:after="80" w:before="160"/>
+      <w:spacing w:after="0" w:before="200"/>
       <w:outlineLvl w:val="1"/>
     </w:pPr>
     <w:rPr>
       <w:rFonts w:asciiTheme="majorHAnsi" w:cstheme="majorBidi" w:eastAsiaTheme="majorEastAsia" w:hAnsiTheme="majorHAnsi"/>
-      <w:color w:themeColor="accent1" w:themeShade="BF" w:val="0F4761"/>
-      <w:sz w:val="32"/>
-      <w:szCs w:val="32"/>
+      <w:b/>
+      <w:bCs/>
+      <w:color w:themeColor="accent1" w:val="4F81BD"/>
+      <w:sz w:val="28"/>
+      <w:szCs w:val="28"/>
     </w:rPr>
   </w:style>
   <w:style w:styleId="Heading3" w:type="paragraph">
-    <w:name w:val="heading 3"/>
+    <w:name w:val="Heading 3"/>
     <w:basedOn w:val="Normal"/>
     <w:next w:val="BodyText"/>
-    <w:link w:val="Heading3Char"/>
     <w:uiPriority w:val="9"/>
-    <w:semiHidden/>
     <w:unhideWhenUsed/>
     <w:qFormat/>
-    <w:rsid w:val="00A10FD9"/>
     <w:pPr>
       <w:keepNext/>
       <w:keepLines/>
-      <w:spacing w:after="80" w:before="160"/>
+      <w:spacing w:after="0" w:before="200"/>
       <w:outlineLvl w:val="2"/>
     </w:pPr>
     <w:rPr>
-      <w:rFonts w:cstheme="majorBidi" w:eastAsiaTheme="majorEastAsia"/>
-      <w:color w:themeColor="accent1" w:themeShade="BF" w:val="0F4761"/>
-      <w:sz w:val="28"/>
-      <w:szCs w:val="28"/>
+      <w:rFonts w:asciiTheme="majorHAnsi" w:cstheme="majorBidi" w:eastAsiaTheme="majorEastAsia" w:hAnsiTheme="majorHAnsi"/>
+      <w:b/>
+      <w:bCs/>
+      <w:color w:themeColor="accent1" w:val="4F81BD"/>
+      <w:sz w:val="24"/>
+      <w:szCs w:val="24"/>
     </w:rPr>
   </w:style>
   <w:style w:styleId="Heading4" w:type="paragraph">
-    <w:name w:val="heading 4"/>
+    <w:name w:val="Heading 4"/>
     <w:basedOn w:val="Normal"/>
     <w:next w:val="BodyText"/>
-    <w:link w:val="Heading4Char"/>
     <w:uiPriority w:val="9"/>
-    <w:semiHidden/>
     <w:unhideWhenUsed/>
     <w:qFormat/>
-    <w:rsid w:val="00A10FD9"/>
     <w:pPr>
       <w:keepNext/>
       <w:keepLines/>
-      <w:spacing w:after="40" w:before="80"/>
+      <w:spacing w:after="0" w:before="200"/>
       <w:outlineLvl w:val="3"/>
     </w:pPr>
     <w:rPr>
-      <w:rFonts w:cstheme="majorBidi" w:eastAsiaTheme="majorEastAsia"/>
+      <w:rFonts w:asciiTheme="majorHAnsi" w:cstheme="majorBidi" w:eastAsiaTheme="majorEastAsia" w:hAnsiTheme="majorHAnsi"/>
       <w:i/>
-      <w:iCs/>
-      <w:color w:themeColor="accent1" w:themeShade="BF" w:val="0F4761"/>
+      <w:bCs/>
+      <w:color w:themeColor="accent1" w:val="4F81BD"/>
+      <w:sz w:val="24"/>
+      <w:szCs w:val="24"/>
     </w:rPr>
   </w:style>
   <w:style w:styleId="Heading5" w:type="paragraph">
-    <w:name w:val="heading 5"/>
+    <w:name w:val="Heading 5"/>
     <w:basedOn w:val="Normal"/>
     <w:next w:val="BodyText"/>
-    <w:link w:val="Heading5Char"/>
     <w:uiPriority w:val="9"/>
-    <w:semiHidden/>
     <w:unhideWhenUsed/>
     <w:qFormat/>
-    <w:rsid w:val="00A10FD9"/>
     <w:pPr>
       <w:keepNext/>
       <w:keepLines/>
-      <w:spacing w:after="40" w:before="80"/>
+      <w:spacing w:after="0" w:before="200"/>
       <w:outlineLvl w:val="4"/>
     </w:pPr>
     <w:rPr>
-      <w:rFonts w:cstheme="majorBidi" w:eastAsiaTheme="majorEastAsia"/>
-      <w:color w:themeColor="accent1" w:themeShade="BF" w:val="0F4761"/>
+      <w:rFonts w:asciiTheme="majorHAnsi" w:cstheme="majorBidi" w:eastAsiaTheme="majorEastAsia" w:hAnsiTheme="majorHAnsi"/>
+      <w:iCs/>
+      <w:color w:themeColor="accent1" w:val="4F81BD"/>
+      <w:sz w:val="24"/>
+      <w:szCs w:val="24"/>
     </w:rPr>
   </w:style>
   <w:style w:styleId="Heading6" w:type="paragraph">
-    <w:name w:val="heading 6"/>
+    <w:name w:val="Heading 6"/>
     <w:basedOn w:val="Normal"/>
     <w:next w:val="BodyText"/>
-    <w:link w:val="Heading6Char"/>
     <w:uiPriority w:val="9"/>
-    <w:semiHidden/>
     <w:unhideWhenUsed/>
     <w:qFormat/>
-    <w:rsid w:val="00A10FD9"/>
     <w:pPr>
       <w:keepNext/>
       <w:keepLines/>
-      <w:spacing w:after="0" w:before="40"/>
+      <w:spacing w:after="0" w:before="200"/>
       <w:outlineLvl w:val="5"/>
     </w:pPr>
     <w:rPr>
-      <w:rFonts w:cstheme="majorBidi" w:eastAsiaTheme="majorEastAsia"/>
-      <w:i/>
-      <w:iCs/>
-      <w:color w:themeColor="text1" w:themeTint="A6" w:val="595959"/>
+      <w:rFonts w:asciiTheme="majorHAnsi" w:cstheme="majorBidi" w:eastAsiaTheme="majorEastAsia" w:hAnsiTheme="majorHAnsi"/>
+      <w:color w:themeColor="accent1" w:val="4F81BD"/>
+      <w:sz w:val="24"/>
+      <w:szCs w:val="24"/>
     </w:rPr>
   </w:style>
   <w:style w:styleId="Heading7" w:type="paragraph">
-    <w:name w:val="heading 7"/>
+    <w:name w:val="Heading 7"/>
     <w:basedOn w:val="Normal"/>
     <w:next w:val="BodyText"/>
-    <w:link w:val="Heading7Char"/>
     <w:uiPriority w:val="9"/>
-    <w:semiHidden/>
     <w:unhideWhenUsed/>
     <w:qFormat/>
-    <w:rsid w:val="00A10FD9"/>
     <w:pPr>
       <w:keepNext/>
       <w:keepLines/>
-      <w:spacing w:after="0" w:before="40"/>
+      <w:spacing w:after="0" w:before="200"/>
       <w:outlineLvl w:val="6"/>
     </w:pPr>
     <w:rPr>
-      <w:rFonts w:cstheme="majorBidi" w:eastAsiaTheme="majorEastAsia"/>
-      <w:color w:themeColor="text1" w:themeTint="A6" w:val="595959"/>
+      <w:rFonts w:asciiTheme="majorHAnsi" w:cstheme="majorBidi" w:eastAsiaTheme="majorEastAsia" w:hAnsiTheme="majorHAnsi"/>
+      <w:color w:themeColor="accent1" w:val="4F81BD"/>
+      <w:sz w:val="24"/>
+      <w:szCs w:val="24"/>
     </w:rPr>
   </w:style>
   <w:style w:styleId="Heading8" w:type="paragraph">
-    <w:name w:val="heading 8"/>
+    <w:name w:val="Heading 8"/>
     <w:basedOn w:val="Normal"/>
     <w:next w:val="BodyText"/>
-    <w:link w:val="Heading8Char"/>
     <w:uiPriority w:val="9"/>
-    <w:semiHidden/>
     <w:unhideWhenUsed/>
     <w:qFormat/>
-    <w:rsid w:val="00A10FD9"/>
     <w:pPr>
       <w:keepNext/>
       <w:keepLines/>
-      <w:spacing w:after="0"/>
+      <w:spacing w:after="0" w:before="200"/>
       <w:outlineLvl w:val="7"/>
     </w:pPr>
     <w:rPr>
-      <w:rFonts w:cstheme="majorBidi" w:eastAsiaTheme="majorEastAsia"/>
-      <w:i/>
-      <w:iCs/>
-      <w:color w:themeColor="text1" w:themeTint="D8" w:val="272727"/>
+      <w:rFonts w:asciiTheme="majorHAnsi" w:cstheme="majorBidi" w:eastAsiaTheme="majorEastAsia" w:hAnsiTheme="majorHAnsi"/>
+      <w:color w:themeColor="accent1" w:val="4F81BD"/>
+      <w:sz w:val="24"/>
+      <w:szCs w:val="24"/>
     </w:rPr>
   </w:style>
   <w:style w:styleId="Heading9" w:type="paragraph">
-    <w:name w:val="heading 9"/>
+    <w:name w:val="Heading 9"/>
     <w:basedOn w:val="Normal"/>
     <w:next w:val="BodyText"/>
-    <w:link w:val="Heading9Char"/>
     <w:uiPriority w:val="9"/>
-    <w:semiHidden/>
     <w:unhideWhenUsed/>
     <w:qFormat/>
-    <w:rsid w:val="00A10FD9"/>
     <w:pPr>
       <w:keepNext/>
       <w:keepLines/>
-      <w:spacing w:after="0"/>
+      <w:spacing w:after="0" w:before="200"/>
       <w:outlineLvl w:val="8"/>
     </w:pPr>
     <w:rPr>
-      <w:rFonts w:cstheme="majorBidi" w:eastAsiaTheme="majorEastAsia"/>
-      <w:color w:themeColor="text1" w:themeTint="D8" w:val="272727"/>
-    </w:rPr>
-  </w:style>
-  <w:style w:customStyle="1" w:styleId="Heading1Char" w:type="character">
-    <w:name w:val="Heading 1 Char"/>
-    <w:basedOn w:val="DefaultParagraphFont"/>
-    <w:link w:val="Heading1"/>
-    <w:uiPriority w:val="9"/>
-    <w:rsid w:val="00A10FD9"/>
-    <w:rPr>
       <w:rFonts w:asciiTheme="majorHAnsi" w:cstheme="majorBidi" w:eastAsiaTheme="majorEastAsia" w:hAnsiTheme="majorHAnsi"/>
-      <w:color w:themeColor="accent1" w:themeShade="BF" w:val="0F4761"/>
-      <w:sz w:val="40"/>
-      <w:szCs w:val="40"/>
-    </w:rPr>
-  </w:style>
-  <w:style w:customStyle="1" w:styleId="Heading2Char" w:type="character">
-    <w:name w:val="Heading 2 Char"/>
-    <w:basedOn w:val="DefaultParagraphFont"/>
-    <w:link w:val="Heading2"/>
-    <w:uiPriority w:val="9"/>
-    <w:semiHidden/>
-    <w:rsid w:val="00A10FD9"/>
-    <w:rPr>
-      <w:rFonts w:asciiTheme="majorHAnsi" w:cstheme="majorBidi" w:eastAsiaTheme="majorEastAsia" w:hAnsiTheme="majorHAnsi"/>
-      <w:color w:themeColor="accent1" w:themeShade="BF" w:val="0F4761"/>
-      <w:sz w:val="32"/>
-      <w:szCs w:val="32"/>
-    </w:rPr>
-  </w:style>
-  <w:style w:customStyle="1" w:styleId="Heading3Char" w:type="character">
-    <w:name w:val="Heading 3 Char"/>
-    <w:basedOn w:val="DefaultParagraphFont"/>
-    <w:link w:val="Heading3"/>
-    <w:uiPriority w:val="9"/>
-    <w:semiHidden/>
-    <w:rsid w:val="00A10FD9"/>
-    <w:rPr>
-      <w:rFonts w:cstheme="majorBidi" w:eastAsiaTheme="majorEastAsia"/>
-      <w:color w:themeColor="accent1" w:themeShade="BF" w:val="0F4761"/>
-      <w:sz w:val="28"/>
-      <w:szCs w:val="28"/>
-    </w:rPr>
-  </w:style>
-  <w:style w:customStyle="1" w:styleId="Heading4Char" w:type="character">
-    <w:name w:val="Heading 4 Char"/>
-    <w:basedOn w:val="DefaultParagraphFont"/>
-    <w:link w:val="Heading4"/>
-    <w:uiPriority w:val="9"/>
-    <w:semiHidden/>
-    <w:rsid w:val="00A10FD9"/>
-    <w:rPr>
-      <w:rFonts w:cstheme="majorBidi" w:eastAsiaTheme="majorEastAsia"/>
-      <w:i/>
-      <w:iCs/>
-      <w:color w:themeColor="accent1" w:themeShade="BF" w:val="0F4761"/>
-    </w:rPr>
-  </w:style>
-  <w:style w:customStyle="1" w:styleId="Heading5Char" w:type="character">
-    <w:name w:val="Heading 5 Char"/>
-    <w:basedOn w:val="DefaultParagraphFont"/>
-    <w:link w:val="Heading5"/>
-    <w:uiPriority w:val="9"/>
-    <w:semiHidden/>
-    <w:rsid w:val="00A10FD9"/>
-    <w:rPr>
-      <w:rFonts w:cstheme="majorBidi" w:eastAsiaTheme="majorEastAsia"/>
-      <w:color w:themeColor="accent1" w:themeShade="BF" w:val="0F4761"/>
-    </w:rPr>
-  </w:style>
-  <w:style w:customStyle="1" w:styleId="Heading6Char" w:type="character">
-    <w:name w:val="Heading 6 Char"/>
-    <w:basedOn w:val="DefaultParagraphFont"/>
-    <w:link w:val="Heading6"/>
-    <w:uiPriority w:val="9"/>
-    <w:semiHidden/>
-    <w:rsid w:val="00A10FD9"/>
-    <w:rPr>
-      <w:rFonts w:cstheme="majorBidi" w:eastAsiaTheme="majorEastAsia"/>
-      <w:i/>
-      <w:iCs/>
-      <w:color w:themeColor="text1" w:themeTint="A6" w:val="595959"/>
-    </w:rPr>
-  </w:style>
-  <w:style w:customStyle="1" w:styleId="Heading7Char" w:type="character">
-    <w:name w:val="Heading 7 Char"/>
-    <w:basedOn w:val="DefaultParagraphFont"/>
-    <w:link w:val="Heading7"/>
-    <w:uiPriority w:val="9"/>
-    <w:semiHidden/>
-    <w:rsid w:val="00A10FD9"/>
-    <w:rPr>
-      <w:rFonts w:cstheme="majorBidi" w:eastAsiaTheme="majorEastAsia"/>
-      <w:color w:themeColor="text1" w:themeTint="A6" w:val="595959"/>
-    </w:rPr>
-  </w:style>
-  <w:style w:customStyle="1" w:styleId="Heading8Char" w:type="character">
-    <w:name w:val="Heading 8 Char"/>
-    <w:basedOn w:val="DefaultParagraphFont"/>
-    <w:link w:val="Heading8"/>
-    <w:uiPriority w:val="9"/>
-    <w:semiHidden/>
-    <w:rsid w:val="00A10FD9"/>
-    <w:rPr>
-      <w:rFonts w:cstheme="majorBidi" w:eastAsiaTheme="majorEastAsia"/>
-      <w:i/>
-      <w:iCs/>
-      <w:color w:themeColor="text1" w:themeTint="D8" w:val="272727"/>
-    </w:rPr>
-  </w:style>
-  <w:style w:customStyle="1" w:styleId="Heading9Char" w:type="character">
-    <w:name w:val="Heading 9 Char"/>
-    <w:basedOn w:val="DefaultParagraphFont"/>
-    <w:link w:val="Heading9"/>
-    <w:uiPriority w:val="9"/>
-    <w:semiHidden/>
-    <w:rsid w:val="00A10FD9"/>
-    <w:rPr>
-      <w:rFonts w:cstheme="majorBidi" w:eastAsiaTheme="majorEastAsia"/>
-      <w:color w:themeColor="text1" w:themeTint="D8" w:val="272727"/>
+      <w:color w:themeColor="accent1" w:val="4F81BD"/>
+      <w:sz w:val="24"/>
+      <w:szCs w:val="24"/>
     </w:rPr>
   </w:style>
   <w:style w:styleId="BlockText" w:type="paragraph">
@@ -2232,18 +2494,6 @@
     <w:uiPriority w:val="9"/>
     <w:unhideWhenUsed/>
     <w:qFormat/>
-  </w:style>
-  <w:style w:styleId="FootnoteBlockText" w:type="paragraph">
-    <w:name w:val="Footnote Block Text"/>
-    <w:basedOn w:val="FootnoteText"/>
-    <w:next w:val="FootnoteText"/>
-    <w:uiPriority w:val="9"/>
-    <w:unhideWhenUsed/>
-    <w:qFormat/>
-    <w:pPr>
-      <w:spacing w:after="100" w:before="100"/>
-      <w:ind w:firstLine="0" w:left="480" w:right="480"/>
-    </w:pPr>
   </w:style>
   <w:style w:default="1" w:styleId="DefaultParagraphFont" w:type="character">
     <w:name w:val="Default Paragraph Font"/>
@@ -2274,10 +2524,10 @@
         <w:jc w:val="left"/>
       </w:trPr>
       <w:tcPr>
+        <w:vAlign w:val="bottom"/>
         <w:tcBorders>
           <w:bottom w:val="single"/>
         </w:tcBorders>
-        <w:vAlign w:val="bottom"/>
       </w:tcPr>
     </w:tblStylePr>
   </w:style>
@@ -2392,8 +2642,8 @@
     <w:name w:val="KeywordTok"/>
     <w:basedOn w:val="VerbatimChar"/>
     <w:rPr>
+      <w:color w:val="007020"/>
       <w:b/>
-      <w:color w:val="007020"/>
     </w:rPr>
   </w:style>
   <w:style w:type="character" w:customStyle="1" w:styleId="DataTypeTok">
@@ -2469,43 +2719,40 @@
   <w:style w:type="character" w:customStyle="1" w:styleId="ImportTok">
     <w:name w:val="ImportTok"/>
     <w:basedOn w:val="VerbatimChar"/>
-    <w:rPr>
-      <w:b/>
-      <w:color w:val="008000"/>
-    </w:rPr>
+    <w:rPr/>
   </w:style>
   <w:style w:type="character" w:customStyle="1" w:styleId="CommentTok">
     <w:name w:val="CommentTok"/>
     <w:basedOn w:val="VerbatimChar"/>
     <w:rPr>
+      <w:color w:val="60a0b0"/>
       <w:i/>
-      <w:color w:val="60a0b0"/>
     </w:rPr>
   </w:style>
   <w:style w:type="character" w:customStyle="1" w:styleId="DocumentationTok">
     <w:name w:val="DocumentationTok"/>
     <w:basedOn w:val="VerbatimChar"/>
     <w:rPr>
+      <w:color w:val="ba2121"/>
       <w:i/>
-      <w:color w:val="ba2121"/>
     </w:rPr>
   </w:style>
   <w:style w:type="character" w:customStyle="1" w:styleId="AnnotationTok">
     <w:name w:val="AnnotationTok"/>
     <w:basedOn w:val="VerbatimChar"/>
     <w:rPr>
+      <w:color w:val="60a0b0"/>
       <w:b/>
       <w:i/>
-      <w:color w:val="60a0b0"/>
     </w:rPr>
   </w:style>
   <w:style w:type="character" w:customStyle="1" w:styleId="CommentVarTok">
     <w:name w:val="CommentVarTok"/>
     <w:basedOn w:val="VerbatimChar"/>
     <w:rPr>
+      <w:color w:val="60a0b0"/>
       <w:b/>
       <w:i/>
-      <w:color w:val="60a0b0"/>
     </w:rPr>
   </w:style>
   <w:style w:type="character" w:customStyle="1" w:styleId="OtherTok">
@@ -2533,8 +2780,8 @@
     <w:name w:val="ControlFlowTok"/>
     <w:basedOn w:val="VerbatimChar"/>
     <w:rPr>
+      <w:color w:val="007020"/>
       <w:b/>
-      <w:color w:val="007020"/>
     </w:rPr>
   </w:style>
   <w:style w:type="character" w:customStyle="1" w:styleId="OperatorTok">
@@ -2547,9 +2794,7 @@
   <w:style w:type="character" w:customStyle="1" w:styleId="BuiltInTok">
     <w:name w:val="BuiltInTok"/>
     <w:basedOn w:val="VerbatimChar"/>
-    <w:rPr>
-      <w:color w:val="008000"/>
-    </w:rPr>
+    <w:rPr/>
   </w:style>
   <w:style w:type="character" w:customStyle="1" w:styleId="ExtensionTok">
     <w:name w:val="ExtensionTok"/>
@@ -2579,34 +2824,34 @@
     <w:name w:val="InformationTok"/>
     <w:basedOn w:val="VerbatimChar"/>
     <w:rPr>
+      <w:color w:val="60a0b0"/>
       <w:b/>
       <w:i/>
-      <w:color w:val="60a0b0"/>
     </w:rPr>
   </w:style>
   <w:style w:type="character" w:customStyle="1" w:styleId="WarningTok">
     <w:name w:val="WarningTok"/>
     <w:basedOn w:val="VerbatimChar"/>
     <w:rPr>
+      <w:color w:val="60a0b0"/>
       <w:b/>
       <w:i/>
-      <w:color w:val="60a0b0"/>
     </w:rPr>
   </w:style>
   <w:style w:type="character" w:customStyle="1" w:styleId="AlertTok">
     <w:name w:val="AlertTok"/>
     <w:basedOn w:val="VerbatimChar"/>
     <w:rPr>
+      <w:color w:val="ff0000"/>
       <w:b/>
-      <w:color w:val="ff0000"/>
     </w:rPr>
   </w:style>
   <w:style w:type="character" w:customStyle="1" w:styleId="ErrorTok">
     <w:name w:val="ErrorTok"/>
     <w:basedOn w:val="VerbatimChar"/>
     <w:rPr>
+      <w:color w:val="ff0000"/>
       <w:b/>
-      <w:color w:val="ff0000"/>
     </w:rPr>
   </w:style>
   <w:style w:type="character" w:customStyle="1" w:styleId="NormalTok">
@@ -2628,44 +2873,44 @@
         <a:sysClr val="window" lastClr="FFFFFF"/>
       </a:lt1>
       <a:dk2>
-        <a:srgbClr val="0E2841"/>
+        <a:srgbClr val="1F497D"/>
       </a:dk2>
       <a:lt2>
-        <a:srgbClr val="E8E8E8"/>
+        <a:srgbClr val="EEECE1"/>
       </a:lt2>
       <a:accent1>
-        <a:srgbClr val="156082"/>
+        <a:srgbClr val="4F81BD"/>
       </a:accent1>
       <a:accent2>
-        <a:srgbClr val="E97132"/>
+        <a:srgbClr val="C0504D"/>
       </a:accent2>
       <a:accent3>
-        <a:srgbClr val="196B24"/>
+        <a:srgbClr val="9BBB59"/>
       </a:accent3>
       <a:accent4>
-        <a:srgbClr val="0F9ED5"/>
+        <a:srgbClr val="8064A2"/>
       </a:accent4>
       <a:accent5>
-        <a:srgbClr val="A02B93"/>
+        <a:srgbClr val="4BACC6"/>
       </a:accent5>
       <a:accent6>
-        <a:srgbClr val="4EA72E"/>
+        <a:srgbClr val="F79646"/>
       </a:accent6>
       <a:hlink>
-        <a:srgbClr val="467886"/>
+        <a:srgbClr val="0000FF"/>
       </a:hlink>
       <a:folHlink>
-        <a:srgbClr val="96607D"/>
+        <a:srgbClr val="800080"/>
       </a:folHlink>
     </a:clrScheme>
     <a:fontScheme name="Office">
       <a:majorFont>
-        <a:latin typeface="Aptos Display" panose="02110004020202020204"/>
+        <a:latin typeface="Calibri"/>
         <a:ea typeface=""/>
         <a:cs typeface=""/>
-        <a:font script="Jpan" typeface="游ゴシック Light"/>
+        <a:font script="Jpan" typeface="ＭＳ ゴシック"/>
         <a:font script="Hang" typeface="맑은 고딕"/>
-        <a:font script="Hans" typeface="等线 Light"/>
+        <a:font script="Hans" typeface="宋体"/>
         <a:font script="Hant" typeface="新細明體"/>
         <a:font script="Arab" typeface="Times New Roman"/>
         <a:font script="Hebr" typeface="Times New Roman"/>
@@ -2692,32 +2937,14 @@
         <a:font script="Mong" typeface="Mongolian Baiti"/>
         <a:font script="Viet" typeface="Times New Roman"/>
         <a:font script="Uigh" typeface="Microsoft Uighur"/>
-        <a:font script="Geor" typeface="Sylfaen"/>
-        <a:font script="Armn" typeface="Arial"/>
-        <a:font script="Bugi" typeface="Leelawadee UI"/>
-        <a:font script="Bopo" typeface="Microsoft JhengHei"/>
-        <a:font script="Java" typeface="Javanese Text"/>
-        <a:font script="Lisu" typeface="Segoe UI"/>
-        <a:font script="Mymr" typeface="Myanmar Text"/>
-        <a:font script="Nkoo" typeface="Ebrima"/>
-        <a:font script="Olck" typeface="Nirmala UI"/>
-        <a:font script="Osma" typeface="Ebrima"/>
-        <a:font script="Phag" typeface="Phagspa"/>
-        <a:font script="Syrn" typeface="Estrangelo Edessa"/>
-        <a:font script="Syrj" typeface="Estrangelo Edessa"/>
-        <a:font script="Syre" typeface="Estrangelo Edessa"/>
-        <a:font script="Sora" typeface="Nirmala UI"/>
-        <a:font script="Tale" typeface="Microsoft Tai Le"/>
-        <a:font script="Talu" typeface="Microsoft New Tai Lue"/>
-        <a:font script="Tfng" typeface="Ebrima"/>
       </a:majorFont>
       <a:minorFont>
-        <a:latin typeface="Aptos" panose="02110004020202020204"/>
+        <a:latin typeface="Cambria"/>
         <a:ea typeface=""/>
         <a:cs typeface=""/>
-        <a:font script="Jpan" typeface="游明朝"/>
+        <a:font script="Jpan" typeface="ＭＳ 明朝"/>
         <a:font script="Hang" typeface="맑은 고딕"/>
-        <a:font script="Hans" typeface="等线"/>
+        <a:font script="Hans" typeface="宋体"/>
         <a:font script="Hant" typeface="新細明體"/>
         <a:font script="Arab" typeface="Arial"/>
         <a:font script="Hebr" typeface="Arial"/>
@@ -2744,24 +2971,6 @@
         <a:font script="Mong" typeface="Mongolian Baiti"/>
         <a:font script="Viet" typeface="Arial"/>
         <a:font script="Uigh" typeface="Microsoft Uighur"/>
-        <a:font script="Geor" typeface="Sylfaen"/>
-        <a:font script="Armn" typeface="Arial"/>
-        <a:font script="Bugi" typeface="Leelawadee UI"/>
-        <a:font script="Bopo" typeface="Microsoft JhengHei"/>
-        <a:font script="Java" typeface="Javanese Text"/>
-        <a:font script="Lisu" typeface="Segoe UI"/>
-        <a:font script="Mymr" typeface="Myanmar Text"/>
-        <a:font script="Nkoo" typeface="Ebrima"/>
-        <a:font script="Olck" typeface="Nirmala UI"/>
-        <a:font script="Osma" typeface="Ebrima"/>
-        <a:font script="Phag" typeface="Phagspa"/>
-        <a:font script="Syrn" typeface="Estrangelo Edessa"/>
-        <a:font script="Syrj" typeface="Estrangelo Edessa"/>
-        <a:font script="Syre" typeface="Estrangelo Edessa"/>
-        <a:font script="Sora" typeface="Nirmala UI"/>
-        <a:font script="Tale" typeface="Microsoft Tai Le"/>
-        <a:font script="Talu" typeface="Microsoft New Tai Lue"/>
-        <a:font script="Tfng" typeface="Ebrima"/>
       </a:minorFont>
     </a:fontScheme>
     <a:fmtScheme name="Office">
@@ -2773,141 +2982,200 @@
           <a:gsLst>
             <a:gs pos="0">
               <a:schemeClr val="phClr">
-                <a:lumMod val="110000"/>
-                <a:satMod val="105000"/>
-                <a:tint val="67000"/>
+                <a:tint val="50000"/>
+                <a:satMod val="300000"/>
               </a:schemeClr>
             </a:gs>
-            <a:gs pos="50000">
+            <a:gs pos="35000">
               <a:schemeClr val="phClr">
-                <a:lumMod val="105000"/>
-                <a:satMod val="103000"/>
-                <a:tint val="73000"/>
+                <a:tint val="37000"/>
+                <a:satMod val="300000"/>
               </a:schemeClr>
             </a:gs>
             <a:gs pos="100000">
               <a:schemeClr val="phClr">
-                <a:lumMod val="105000"/>
-                <a:satMod val="109000"/>
-                <a:tint val="81000"/>
+                <a:tint val="15000"/>
+                <a:satMod val="350000"/>
               </a:schemeClr>
             </a:gs>
           </a:gsLst>
-          <a:lin ang="5400000" scaled="0"/>
+          <a:lin ang="16200000" scaled="1"/>
         </a:gradFill>
         <a:gradFill rotWithShape="1">
           <a:gsLst>
             <a:gs pos="0">
               <a:schemeClr val="phClr">
-                <a:satMod val="103000"/>
-                <a:lumMod val="102000"/>
-                <a:tint val="94000"/>
-              </a:schemeClr>
-            </a:gs>
-            <a:gs pos="50000">
-              <a:schemeClr val="phClr">
-                <a:satMod val="110000"/>
-                <a:lumMod val="100000"/>
+                <a:tint val="100000"/>
                 <a:shade val="100000"/>
+                <a:satMod val="130000"/>
               </a:schemeClr>
             </a:gs>
             <a:gs pos="100000">
               <a:schemeClr val="phClr">
-                <a:lumMod val="99000"/>
-                <a:satMod val="120000"/>
-                <a:shade val="78000"/>
+                <a:tint val="50000"/>
+                <a:shade val="100000"/>
+                <a:satMod val="350000"/>
               </a:schemeClr>
             </a:gs>
           </a:gsLst>
-          <a:lin ang="5400000" scaled="0"/>
+          <a:lin ang="16200000" scaled="0"/>
         </a:gradFill>
       </a:fillStyleLst>
       <a:lnStyleLst>
-        <a:ln w="6350" cap="flat" cmpd="sng" algn="ctr">
+        <a:ln w="9525" cap="flat" cmpd="sng" algn="ctr">
+          <a:solidFill>
+            <a:schemeClr val="phClr">
+              <a:shade val="95000"/>
+              <a:satMod val="105000"/>
+            </a:schemeClr>
+          </a:solidFill>
+          <a:prstDash val="solid"/>
+        </a:ln>
+        <a:ln w="25400" cap="flat" cmpd="sng" algn="ctr">
           <a:solidFill>
             <a:schemeClr val="phClr"/>
           </a:solidFill>
           <a:prstDash val="solid"/>
-          <a:miter lim="800000"/>
         </a:ln>
-        <a:ln w="12700" cap="flat" cmpd="sng" algn="ctr">
+        <a:ln w="38100" cap="flat" cmpd="sng" algn="ctr">
           <a:solidFill>
             <a:schemeClr val="phClr"/>
           </a:solidFill>
           <a:prstDash val="solid"/>
-          <a:miter lim="800000"/>
-        </a:ln>
-        <a:ln w="19050" cap="flat" cmpd="sng" algn="ctr">
-          <a:solidFill>
-            <a:schemeClr val="phClr"/>
-          </a:solidFill>
-          <a:prstDash val="solid"/>
-          <a:miter lim="800000"/>
         </a:ln>
       </a:lnStyleLst>
       <a:effectStyleLst>
         <a:effectStyle>
-          <a:effectLst/>
-        </a:effectStyle>
-        <a:effectStyle>
-          <a:effectLst/>
+          <a:effectLst>
+            <a:outerShdw blurRad="40000" dist="20000" dir="5400000" rotWithShape="0">
+              <a:srgbClr val="000000">
+                <a:alpha val="38000"/>
+              </a:srgbClr>
+            </a:outerShdw>
+          </a:effectLst>
         </a:effectStyle>
         <a:effectStyle>
           <a:effectLst>
-            <a:outerShdw blurRad="57150" dist="19050" dir="5400000" algn="ctr" rotWithShape="0">
+            <a:outerShdw blurRad="40000" dist="23000" dir="5400000" rotWithShape="0">
               <a:srgbClr val="000000">
-                <a:alpha val="63000"/>
+                <a:alpha val="35000"/>
               </a:srgbClr>
             </a:outerShdw>
           </a:effectLst>
+        </a:effectStyle>
+        <a:effectStyle>
+          <a:effectLst>
+            <a:outerShdw blurRad="40000" dist="23000" dir="5400000" rotWithShape="0">
+              <a:srgbClr val="000000">
+                <a:alpha val="35000"/>
+              </a:srgbClr>
+            </a:outerShdw>
+          </a:effectLst>
+          <a:scene3d>
+            <a:camera prst="orthographicFront">
+              <a:rot lat="0" lon="0" rev="0"/>
+            </a:camera>
+            <a:lightRig rig="threePt" dir="t">
+              <a:rot lat="0" lon="0" rev="1200000"/>
+            </a:lightRig>
+          </a:scene3d>
+          <a:sp3d>
+            <a:bevelT w="63500" h="25400"/>
+          </a:sp3d>
         </a:effectStyle>
       </a:effectStyleLst>
       <a:bgFillStyleLst>
         <a:solidFill>
           <a:schemeClr val="phClr"/>
         </a:solidFill>
-        <a:solidFill>
-          <a:schemeClr val="phClr">
-            <a:tint val="95000"/>
-            <a:satMod val="170000"/>
-          </a:schemeClr>
-        </a:solidFill>
         <a:gradFill rotWithShape="1">
           <a:gsLst>
             <a:gs pos="0">
               <a:schemeClr val="phClr">
-                <a:tint val="93000"/>
-                <a:satMod val="150000"/>
-                <a:shade val="98000"/>
-                <a:lumMod val="102000"/>
+                <a:tint val="40000"/>
+                <a:satMod val="350000"/>
               </a:schemeClr>
             </a:gs>
-            <a:gs pos="50000">
+            <a:gs pos="40000">
               <a:schemeClr val="phClr">
-                <a:tint val="98000"/>
-                <a:satMod val="130000"/>
-                <a:shade val="90000"/>
-                <a:lumMod val="103000"/>
+                <a:tint val="45000"/>
+                <a:shade val="99000"/>
+                <a:satMod val="350000"/>
               </a:schemeClr>
             </a:gs>
             <a:gs pos="100000">
               <a:schemeClr val="phClr">
-                <a:shade val="63000"/>
-                <a:satMod val="120000"/>
+                <a:shade val="20000"/>
+                <a:satMod val="255000"/>
               </a:schemeClr>
             </a:gs>
           </a:gsLst>
-          <a:lin ang="5400000" scaled="0"/>
+          <a:path path="circle">
+            <a:fillToRect l="50000" t="-80000" r="50000" b="180000"/>
+          </a:path>
+        </a:gradFill>
+        <a:gradFill rotWithShape="1">
+          <a:gsLst>
+            <a:gs pos="0">
+              <a:schemeClr val="phClr">
+                <a:tint val="80000"/>
+                <a:satMod val="300000"/>
+              </a:schemeClr>
+            </a:gs>
+            <a:gs pos="100000">
+              <a:schemeClr val="phClr">
+                <a:shade val="30000"/>
+                <a:satMod val="200000"/>
+              </a:schemeClr>
+            </a:gs>
+          </a:gsLst>
+          <a:path path="circle">
+            <a:fillToRect l="50000" t="50000" r="50000" b="50000"/>
+          </a:path>
         </a:gradFill>
       </a:bgFillStyleLst>
     </a:fmtScheme>
   </a:themeElements>
-  <a:objectDefaults/>
+  <a:objectDefaults>
+    <a:spDef>
+      <a:spPr/>
+      <a:bodyPr/>
+      <a:lstStyle/>
+      <a:style>
+        <a:lnRef idx="1">
+          <a:schemeClr val="accent1"/>
+        </a:lnRef>
+        <a:fillRef idx="3">
+          <a:schemeClr val="accent1"/>
+        </a:fillRef>
+        <a:effectRef idx="2">
+          <a:schemeClr val="accent1"/>
+        </a:effectRef>
+        <a:fontRef idx="minor">
+          <a:schemeClr val="lt1"/>
+        </a:fontRef>
+      </a:style>
+    </a:spDef>
+    <a:lnDef>
+      <a:spPr/>
+      <a:bodyPr/>
+      <a:lstStyle/>
+      <a:style>
+        <a:lnRef idx="2">
+          <a:schemeClr val="accent1"/>
+        </a:lnRef>
+        <a:fillRef idx="0">
+          <a:schemeClr val="accent1"/>
+        </a:fillRef>
+        <a:effectRef idx="1">
+          <a:schemeClr val="accent1"/>
+        </a:effectRef>
+        <a:fontRef idx="minor">
+          <a:schemeClr val="tx1"/>
+        </a:fontRef>
+      </a:style>
+    </a:lnDef>
+  </a:objectDefaults>
   <a:extraClrSchemeLst/>
-  <a:extLst>
-    <a:ext uri="{05A4C25C-085E-4340-85A3-A5531E510DB2}">
-      <thm15:themeFamily xmlns:thm15="http://schemas.microsoft.com/office/thememl/2012/main" name="Office Theme" id="{2E142A2C-CD16-42D6-873A-C26D2A0506FA}" vid="{1BDDFF52-6CD6-40A5-AB3C-68EB2F1E4D0A}"/>
-    </a:ext>
-  </a:extLst>
 </a:theme>
 </file>
</xml_diff>

<commit_message>
Drop SwagSearch and link TCG Search demo platform
Co-Authored-By: Claude Sonnet 5.5 <noreply@anthropic.com>
</commit_message>
<xml_diff>
--- a/output/chuck_meyer_resume.docx
+++ b/output/chuck_meyer_resume.docx
@@ -2,7 +2,7 @@
 <file path=word/document.xml><?xml version="1.0" encoding="utf-8"?>
 <w:document xmlns:w="http://schemas.openxmlformats.org/wordprocessingml/2006/main" xmlns:m="http://schemas.openxmlformats.org/officeDocument/2006/math" xmlns:r="http://schemas.openxmlformats.org/officeDocument/2006/relationships" xmlns:o="urn:schemas-microsoft-com:office:office" xmlns:v="urn:schemas-microsoft-com:vml" xmlns:w10="urn:schemas-microsoft-com:office:word" xmlns:a="http://schemas.openxmlformats.org/drawingml/2006/main" xmlns:pic="http://schemas.openxmlformats.org/drawingml/2006/picture" xmlns:wp="http://schemas.openxmlformats.org/drawingml/2006/wordprocessingDrawing">
   <w:body>
-    <w:bookmarkStart w:id="47" w:name="charles-chuck-meyer"/>
+    <w:bookmarkStart w:id="48" w:name="charles-chuck-meyer"/>
     <w:p>
       <w:pPr>
         <w:pStyle w:val="Heading1"/>
@@ -277,7 +277,7 @@
       </w:r>
     </w:p>
     <w:bookmarkEnd w:id="23"/>
-    <w:bookmarkStart w:id="24" w:name="experience"/>
+    <w:bookmarkStart w:id="25" w:name="experience"/>
     <w:p>
       <w:pPr>
         <w:pStyle w:val="Heading2"/>
@@ -397,7 +397,21 @@
         <w:pStyle w:val="Compact"/>
       </w:pPr>
       <w:r>
-        <w:t xml:space="preserve">Built reusable demo platforms (TCG Search, SwagSearch) and deployed them at eight conferences in six months, including Microsoft Build, Adobe Summit, Shoptalk and eTail, each in a week or less</w:t>
+        <w:t xml:space="preserve">Built a reusable agentic demo platform,</w:t>
+      </w:r>
+      <w:r>
+        <w:t xml:space="preserve"> </w:t>
+      </w:r>
+      <w:hyperlink r:id="rId24">
+        <w:r>
+          <w:rPr>
+            <w:rStyle w:val="Hyperlink"/>
+          </w:rPr>
+          <w:t xml:space="preserve">TCG Search</w:t>
+        </w:r>
+      </w:hyperlink>
+      <w:r>
+        <w:t xml:space="preserve">, and deployed it at six conferences in six months, including Microsoft Build, Adobe Summit, Shoptalk and eTail, each in a week or less</w:t>
       </w:r>
     </w:p>
     <w:p>
@@ -728,8 +742,8 @@
         <w:t xml:space="preserve">Built PCI-compliant infrastructure with Elastic Beanstalk, Packer, Puppet and CloudFormation, and a CI/CD pipeline for IAM governance with CodePipeline, Ansible and CloudFormation</w:t>
       </w:r>
     </w:p>
-    <w:bookmarkEnd w:id="24"/>
-    <w:bookmarkStart w:id="29" w:name="selected-projects"/>
+    <w:bookmarkEnd w:id="25"/>
+    <w:bookmarkStart w:id="30" w:name="selected-projects"/>
     <w:p>
       <w:pPr>
         <w:pStyle w:val="Heading2"/>
@@ -746,7 +760,7 @@
         </w:numPr>
         <w:pStyle w:val="Compact"/>
       </w:pPr>
-      <w:hyperlink r:id="rId25">
+      <w:hyperlink r:id="rId26">
         <w:r>
           <w:rPr>
             <w:rStyle w:val="Hyperlink"/>
@@ -768,7 +782,7 @@
         </w:numPr>
         <w:pStyle w:val="Compact"/>
       </w:pPr>
-      <w:hyperlink r:id="rId26">
+      <w:hyperlink r:id="rId27">
         <w:r>
           <w:rPr>
             <w:rStyle w:val="Hyperlink"/>
@@ -790,7 +804,7 @@
         </w:numPr>
         <w:pStyle w:val="Compact"/>
       </w:pPr>
-      <w:hyperlink r:id="rId27">
+      <w:hyperlink r:id="rId28">
         <w:r>
           <w:rPr>
             <w:rStyle w:val="Hyperlink"/>
@@ -812,7 +826,7 @@
         </w:numPr>
         <w:pStyle w:val="Compact"/>
       </w:pPr>
-      <w:hyperlink r:id="rId28">
+      <w:hyperlink r:id="rId29">
         <w:r>
           <w:rPr>
             <w:rStyle w:val="Hyperlink"/>
@@ -826,8 +840,8 @@
         <w:t xml:space="preserve">: minimal MCP server over Streamable HTTP, with a companion tutorial</w:t>
       </w:r>
     </w:p>
-    <w:bookmarkEnd w:id="29"/>
-    <w:bookmarkStart w:id="45" w:name="writing-and-speaking"/>
+    <w:bookmarkEnd w:id="30"/>
+    <w:bookmarkStart w:id="46" w:name="writing-and-speaking"/>
     <w:p>
       <w:pPr>
         <w:pStyle w:val="Heading2"/>
@@ -854,7 +868,7 @@
       <w:r>
         <w:t xml:space="preserve"> </w:t>
       </w:r>
-      <w:hyperlink r:id="rId30">
+      <w:hyperlink r:id="rId31">
         <w:r>
           <w:rPr>
             <w:rStyle w:val="Hyperlink"/>
@@ -871,7 +885,7 @@
       <w:r>
         <w:t xml:space="preserve"> </w:t>
       </w:r>
-      <w:hyperlink r:id="rId31">
+      <w:hyperlink r:id="rId32">
         <w:r>
           <w:rPr>
             <w:rStyle w:val="Hyperlink"/>
@@ -888,7 +902,7 @@
       <w:r>
         <w:t xml:space="preserve"> </w:t>
       </w:r>
-      <w:hyperlink r:id="rId32">
+      <w:hyperlink r:id="rId33">
         <w:r>
           <w:rPr>
             <w:rStyle w:val="Hyperlink"/>
@@ -905,7 +919,7 @@
       <w:r>
         <w:t xml:space="preserve"> </w:t>
       </w:r>
-      <w:hyperlink r:id="rId33">
+      <w:hyperlink r:id="rId34">
         <w:r>
           <w:rPr>
             <w:rStyle w:val="Hyperlink"/>
@@ -958,7 +972,7 @@
       <w:r>
         <w:t xml:space="preserve"> </w:t>
       </w:r>
-      <w:hyperlink r:id="rId34">
+      <w:hyperlink r:id="rId35">
         <w:r>
           <w:rPr>
             <w:rStyle w:val="Hyperlink"/>
@@ -972,7 +986,7 @@
       <w:r>
         <w:t xml:space="preserve"> </w:t>
       </w:r>
-      <w:hyperlink r:id="rId35">
+      <w:hyperlink r:id="rId36">
         <w:r>
           <w:rPr>
             <w:rStyle w:val="Hyperlink"/>
@@ -986,7 +1000,7 @@
       <w:r>
         <w:t xml:space="preserve"> </w:t>
       </w:r>
-      <w:hyperlink r:id="rId36">
+      <w:hyperlink r:id="rId37">
         <w:r>
           <w:rPr>
             <w:rStyle w:val="Hyperlink"/>
@@ -1003,7 +1017,7 @@
       <w:r>
         <w:t xml:space="preserve"> </w:t>
       </w:r>
-      <w:hyperlink r:id="rId37">
+      <w:hyperlink r:id="rId38">
         <w:r>
           <w:rPr>
             <w:rStyle w:val="Hyperlink"/>
@@ -1030,7 +1044,7 @@
       <w:r>
         <w:t xml:space="preserve"> </w:t>
       </w:r>
-      <w:hyperlink r:id="rId38">
+      <w:hyperlink r:id="rId39">
         <w:r>
           <w:rPr>
             <w:rStyle w:val="Hyperlink"/>
@@ -1047,7 +1061,7 @@
       <w:r>
         <w:t xml:space="preserve"> </w:t>
       </w:r>
-      <w:hyperlink r:id="rId39">
+      <w:hyperlink r:id="rId40">
         <w:r>
           <w:rPr>
             <w:rStyle w:val="Hyperlink"/>
@@ -1064,7 +1078,7 @@
       <w:r>
         <w:t xml:space="preserve"> </w:t>
       </w:r>
-      <w:hyperlink r:id="rId40">
+      <w:hyperlink r:id="rId41">
         <w:r>
           <w:rPr>
             <w:rStyle w:val="Hyperlink"/>
@@ -1081,7 +1095,7 @@
       <w:r>
         <w:t xml:space="preserve"> </w:t>
       </w:r>
-      <w:hyperlink r:id="rId41">
+      <w:hyperlink r:id="rId42">
         <w:r>
           <w:rPr>
             <w:rStyle w:val="Hyperlink"/>
@@ -1108,7 +1122,7 @@
       <w:r>
         <w:t xml:space="preserve"> </w:t>
       </w:r>
-      <w:hyperlink r:id="rId42">
+      <w:hyperlink r:id="rId43">
         <w:r>
           <w:rPr>
             <w:rStyle w:val="Hyperlink"/>
@@ -1125,7 +1139,7 @@
       <w:r>
         <w:t xml:space="preserve"> </w:t>
       </w:r>
-      <w:hyperlink r:id="rId43">
+      <w:hyperlink r:id="rId44">
         <w:r>
           <w:rPr>
             <w:rStyle w:val="Hyperlink"/>
@@ -1142,7 +1156,7 @@
       <w:r>
         <w:t xml:space="preserve"> </w:t>
       </w:r>
-      <w:hyperlink r:id="rId44">
+      <w:hyperlink r:id="rId45">
         <w:r>
           <w:rPr>
             <w:rStyle w:val="Hyperlink"/>
@@ -1151,8 +1165,8 @@
         </w:r>
       </w:hyperlink>
     </w:p>
-    <w:bookmarkEnd w:id="45"/>
-    <w:bookmarkStart w:id="46" w:name="education"/>
+    <w:bookmarkEnd w:id="46"/>
+    <w:bookmarkStart w:id="47" w:name="education"/>
     <w:p>
       <w:pPr>
         <w:pStyle w:val="Heading2"/>
@@ -1195,8 +1209,8 @@
         <w:t xml:space="preserve">Northern Kentucky University | 1997</w:t>
       </w:r>
     </w:p>
-    <w:bookmarkEnd w:id="46"/>
     <w:bookmarkEnd w:id="47"/>
+    <w:bookmarkEnd w:id="48"/>
     <w:sectPr/>
   </w:body>
 </w:document>

</xml_diff>

<commit_message>
Reword content review bullet as editor and coach role
Co-Authored-By: Claude Sonnet 5.5 <noreply@anthropic.com>
</commit_message>
<xml_diff>
--- a/output/chuck_meyer_resume.docx
+++ b/output/chuck_meyer_resume.docx
@@ -507,7 +507,19 @@
         <w:pStyle w:val="Compact"/>
       </w:pPr>
       <w:r>
-        <w:t xml:space="preserve">Reviewed roughly 15 pieces of colleagues’ content in six months, nearly all inside a week, and spoke to Algolia’s Aspiring Managers Program on moving from IC to manager</w:t>
+        <w:t xml:space="preserve">Editor and coach for internal and external technical content, giving pre-publication feedback on blogs, tutorials and speaker sessions</w:t>
+      </w:r>
+    </w:p>
+    <w:p>
+      <w:pPr>
+        <w:numPr>
+          <w:ilvl w:val="0"/>
+          <w:numId w:val="1001"/>
+        </w:numPr>
+        <w:pStyle w:val="Compact"/>
+      </w:pPr>
+      <w:r>
+        <w:t xml:space="preserve">Spoke to Algolia’s Aspiring Managers Program on moving from IC to manager</w:t>
       </w:r>
     </w:p>
     <w:p>

</xml_diff>

<commit_message>
Restore cfn-lint to AWS CloudFormation role
Co-Authored-By: Claude Sonnet 5.5 <noreply@anthropic.com>
</commit_message>
<xml_diff>
--- a/output/chuck_meyer_resume.docx
+++ b/output/chuck_meyer_resume.docx
@@ -2,7 +2,7 @@
 <file path=word/document.xml><?xml version="1.0" encoding="utf-8"?>
 <w:document xmlns:w="http://schemas.openxmlformats.org/wordprocessingml/2006/main" xmlns:m="http://schemas.openxmlformats.org/officeDocument/2006/math" xmlns:r="http://schemas.openxmlformats.org/officeDocument/2006/relationships" xmlns:o="urn:schemas-microsoft-com:office:office" xmlns:v="urn:schemas-microsoft-com:vml" xmlns:w10="urn:schemas-microsoft-com:office:word" xmlns:a="http://schemas.openxmlformats.org/drawingml/2006/main" xmlns:pic="http://schemas.openxmlformats.org/drawingml/2006/picture" xmlns:wp="http://schemas.openxmlformats.org/drawingml/2006/wordprocessingDrawing">
   <w:body>
-    <w:bookmarkStart w:id="48" w:name="charles-chuck-meyer"/>
+    <w:bookmarkStart w:id="49" w:name="charles-chuck-meyer"/>
     <w:p>
       <w:pPr>
         <w:pStyle w:val="Heading1"/>
@@ -277,7 +277,7 @@
       </w:r>
     </w:p>
     <w:bookmarkEnd w:id="23"/>
-    <w:bookmarkStart w:id="25" w:name="experience"/>
+    <w:bookmarkStart w:id="26" w:name="experience"/>
     <w:p>
       <w:pPr>
         <w:pStyle w:val="Heading2"/>
@@ -635,7 +635,21 @@
         <w:pStyle w:val="Compact"/>
       </w:pPr>
       <w:r>
-        <w:t xml:space="preserve">Maintained CloudFormation’s open source repositories with an active contributor community</w:t>
+        <w:t xml:space="preserve">Maintained CloudFormation’s open source repositories, including</w:t>
+      </w:r>
+      <w:r>
+        <w:t xml:space="preserve"> </w:t>
+      </w:r>
+      <w:hyperlink r:id="rId25">
+        <w:r>
+          <w:rPr>
+            <w:rStyle w:val="Hyperlink"/>
+          </w:rPr>
+          <w:t xml:space="preserve">cfn-lint</w:t>
+        </w:r>
+      </w:hyperlink>
+      <w:r>
+        <w:t xml:space="preserve">, the CloudFormation template linter, with an active contributor community</w:t>
       </w:r>
     </w:p>
     <w:p>
@@ -647,7 +661,7 @@
         <w:pStyle w:val="Compact"/>
       </w:pPr>
       <w:r>
-        <w:t xml:space="preserve">Published best-practices content on the AWS management tools blog and engaged enterprise customers at meetups and conferences on infrastructure as code</w:t>
+        <w:t xml:space="preserve">Published best-practices content on the AWS management tools blog, including a guide to pre-commit validation with cfn-lint, and engaged enterprise customers at meetups and conferences on infrastructure as code</w:t>
       </w:r>
     </w:p>
     <w:p>
@@ -754,8 +768,8 @@
         <w:t xml:space="preserve">Built PCI-compliant infrastructure with Elastic Beanstalk, Packer, Puppet and CloudFormation, and a CI/CD pipeline for IAM governance with CodePipeline, Ansible and CloudFormation</w:t>
       </w:r>
     </w:p>
-    <w:bookmarkEnd w:id="25"/>
-    <w:bookmarkStart w:id="30" w:name="selected-projects"/>
+    <w:bookmarkEnd w:id="26"/>
+    <w:bookmarkStart w:id="31" w:name="selected-projects"/>
     <w:p>
       <w:pPr>
         <w:pStyle w:val="Heading2"/>
@@ -772,7 +786,7 @@
         </w:numPr>
         <w:pStyle w:val="Compact"/>
       </w:pPr>
-      <w:hyperlink r:id="rId26">
+      <w:hyperlink r:id="rId27">
         <w:r>
           <w:rPr>
             <w:rStyle w:val="Hyperlink"/>
@@ -794,7 +808,7 @@
         </w:numPr>
         <w:pStyle w:val="Compact"/>
       </w:pPr>
-      <w:hyperlink r:id="rId27">
+      <w:hyperlink r:id="rId28">
         <w:r>
           <w:rPr>
             <w:rStyle w:val="Hyperlink"/>
@@ -816,7 +830,7 @@
         </w:numPr>
         <w:pStyle w:val="Compact"/>
       </w:pPr>
-      <w:hyperlink r:id="rId28">
+      <w:hyperlink r:id="rId29">
         <w:r>
           <w:rPr>
             <w:rStyle w:val="Hyperlink"/>
@@ -838,7 +852,7 @@
         </w:numPr>
         <w:pStyle w:val="Compact"/>
       </w:pPr>
-      <w:hyperlink r:id="rId29">
+      <w:hyperlink r:id="rId30">
         <w:r>
           <w:rPr>
             <w:rStyle w:val="Hyperlink"/>
@@ -852,8 +866,8 @@
         <w:t xml:space="preserve">: minimal MCP server over Streamable HTTP, with a companion tutorial</w:t>
       </w:r>
     </w:p>
-    <w:bookmarkEnd w:id="30"/>
-    <w:bookmarkStart w:id="46" w:name="writing-and-speaking"/>
+    <w:bookmarkEnd w:id="31"/>
+    <w:bookmarkStart w:id="47" w:name="writing-and-speaking"/>
     <w:p>
       <w:pPr>
         <w:pStyle w:val="Heading2"/>
@@ -880,7 +894,7 @@
       <w:r>
         <w:t xml:space="preserve"> </w:t>
       </w:r>
-      <w:hyperlink r:id="rId31">
+      <w:hyperlink r:id="rId32">
         <w:r>
           <w:rPr>
             <w:rStyle w:val="Hyperlink"/>
@@ -897,7 +911,7 @@
       <w:r>
         <w:t xml:space="preserve"> </w:t>
       </w:r>
-      <w:hyperlink r:id="rId32">
+      <w:hyperlink r:id="rId33">
         <w:r>
           <w:rPr>
             <w:rStyle w:val="Hyperlink"/>
@@ -914,7 +928,7 @@
       <w:r>
         <w:t xml:space="preserve"> </w:t>
       </w:r>
-      <w:hyperlink r:id="rId33">
+      <w:hyperlink r:id="rId34">
         <w:r>
           <w:rPr>
             <w:rStyle w:val="Hyperlink"/>
@@ -931,7 +945,7 @@
       <w:r>
         <w:t xml:space="preserve"> </w:t>
       </w:r>
-      <w:hyperlink r:id="rId34">
+      <w:hyperlink r:id="rId35">
         <w:r>
           <w:rPr>
             <w:rStyle w:val="Hyperlink"/>
@@ -984,7 +998,7 @@
       <w:r>
         <w:t xml:space="preserve"> </w:t>
       </w:r>
-      <w:hyperlink r:id="rId35">
+      <w:hyperlink r:id="rId36">
         <w:r>
           <w:rPr>
             <w:rStyle w:val="Hyperlink"/>
@@ -998,7 +1012,7 @@
       <w:r>
         <w:t xml:space="preserve"> </w:t>
       </w:r>
-      <w:hyperlink r:id="rId36">
+      <w:hyperlink r:id="rId37">
         <w:r>
           <w:rPr>
             <w:rStyle w:val="Hyperlink"/>
@@ -1012,7 +1026,7 @@
       <w:r>
         <w:t xml:space="preserve"> </w:t>
       </w:r>
-      <w:hyperlink r:id="rId37">
+      <w:hyperlink r:id="rId38">
         <w:r>
           <w:rPr>
             <w:rStyle w:val="Hyperlink"/>
@@ -1029,7 +1043,7 @@
       <w:r>
         <w:t xml:space="preserve"> </w:t>
       </w:r>
-      <w:hyperlink r:id="rId38">
+      <w:hyperlink r:id="rId39">
         <w:r>
           <w:rPr>
             <w:rStyle w:val="Hyperlink"/>
@@ -1056,7 +1070,7 @@
       <w:r>
         <w:t xml:space="preserve"> </w:t>
       </w:r>
-      <w:hyperlink r:id="rId39">
+      <w:hyperlink r:id="rId40">
         <w:r>
           <w:rPr>
             <w:rStyle w:val="Hyperlink"/>
@@ -1073,7 +1087,7 @@
       <w:r>
         <w:t xml:space="preserve"> </w:t>
       </w:r>
-      <w:hyperlink r:id="rId40">
+      <w:hyperlink r:id="rId41">
         <w:r>
           <w:rPr>
             <w:rStyle w:val="Hyperlink"/>
@@ -1090,7 +1104,7 @@
       <w:r>
         <w:t xml:space="preserve"> </w:t>
       </w:r>
-      <w:hyperlink r:id="rId41">
+      <w:hyperlink r:id="rId42">
         <w:r>
           <w:rPr>
             <w:rStyle w:val="Hyperlink"/>
@@ -1107,7 +1121,7 @@
       <w:r>
         <w:t xml:space="preserve"> </w:t>
       </w:r>
-      <w:hyperlink r:id="rId42">
+      <w:hyperlink r:id="rId43">
         <w:r>
           <w:rPr>
             <w:rStyle w:val="Hyperlink"/>
@@ -1134,7 +1148,7 @@
       <w:r>
         <w:t xml:space="preserve"> </w:t>
       </w:r>
-      <w:hyperlink r:id="rId43">
+      <w:hyperlink r:id="rId44">
         <w:r>
           <w:rPr>
             <w:rStyle w:val="Hyperlink"/>
@@ -1151,7 +1165,7 @@
       <w:r>
         <w:t xml:space="preserve"> </w:t>
       </w:r>
-      <w:hyperlink r:id="rId44">
+      <w:hyperlink r:id="rId45">
         <w:r>
           <w:rPr>
             <w:rStyle w:val="Hyperlink"/>
@@ -1168,7 +1182,7 @@
       <w:r>
         <w:t xml:space="preserve"> </w:t>
       </w:r>
-      <w:hyperlink r:id="rId45">
+      <w:hyperlink r:id="rId46">
         <w:r>
           <w:rPr>
             <w:rStyle w:val="Hyperlink"/>
@@ -1177,8 +1191,8 @@
         </w:r>
       </w:hyperlink>
     </w:p>
-    <w:bookmarkEnd w:id="46"/>
-    <w:bookmarkStart w:id="47" w:name="education"/>
+    <w:bookmarkEnd w:id="47"/>
+    <w:bookmarkStart w:id="48" w:name="education"/>
     <w:p>
       <w:pPr>
         <w:pStyle w:val="Heading2"/>
@@ -1221,8 +1235,8 @@
         <w:t xml:space="preserve">Northern Kentucky University | 1997</w:t>
       </w:r>
     </w:p>
-    <w:bookmarkEnd w:id="47"/>
     <w:bookmarkEnd w:id="48"/>
+    <w:bookmarkEnd w:id="49"/>
     <w:sectPr/>
   </w:body>
 </w:document>

</xml_diff>

<commit_message>
Credit founding developer role on cfn-lint
Co-Authored-By: Claude Sonnet 5.5 <noreply@anthropic.com>
</commit_message>
<xml_diff>
--- a/output/chuck_meyer_resume.docx
+++ b/output/chuck_meyer_resume.docx
@@ -635,7 +635,7 @@
         <w:pStyle w:val="Compact"/>
       </w:pPr>
       <w:r>
-        <w:t xml:space="preserve">Maintained CloudFormation’s open source repositories, including</w:t>
+        <w:t xml:space="preserve">One of the two founding developers of</w:t>
       </w:r>
       <w:r>
         <w:t xml:space="preserve"> </w:t>
@@ -649,7 +649,7 @@
         </w:r>
       </w:hyperlink>
       <w:r>
-        <w:t xml:space="preserve">, the CloudFormation template linter (2,600+ GitHub stars), with an active contributor community</w:t>
+        <w:t xml:space="preserve">, the open source CloudFormation template linter (2,600+ GitHub stars), and maintained CloudFormation’s other open source repositories with an active contributor community</w:t>
       </w:r>
     </w:p>
     <w:p>

</xml_diff>

<commit_message>
Split other CloudFormation open source repos into own bullet
Co-Authored-By: Claude Sonnet 5.5 <noreply@anthropic.com>
</commit_message>
<xml_diff>
--- a/output/chuck_meyer_resume.docx
+++ b/output/chuck_meyer_resume.docx
@@ -649,7 +649,19 @@
         </w:r>
       </w:hyperlink>
       <w:r>
-        <w:t xml:space="preserve">, the open source CloudFormation template linter (2,600+ GitHub stars), including commissioning its logo and launch stickers, and maintained CloudFormation’s other open source repositories with an active contributor community</w:t>
+        <w:t xml:space="preserve">, the open source CloudFormation template linter (2,600+ GitHub stars), including commissioning its logo and launch stickers</w:t>
+      </w:r>
+    </w:p>
+    <w:p>
+      <w:pPr>
+        <w:numPr>
+          <w:ilvl w:val="0"/>
+          <w:numId w:val="1003"/>
+        </w:numPr>
+        <w:pStyle w:val="Compact"/>
+      </w:pPr>
+      <w:r>
+        <w:t xml:space="preserve">Maintained CloudFormation’s other open source repositories with an active contributor community</w:t>
       </w:r>
     </w:p>
     <w:p>

</xml_diff>

<commit_message>
Use Geist and a two-column contact header
</commit_message>
<xml_diff>
--- a/output/chuck_meyer_resume.docx
+++ b/output/chuck_meyer_resume.docx
@@ -16,11 +16,27 @@
         <w:pStyle w:val="FirstParagraph"/>
       </w:pPr>
       <w:r>
-        <w:t xml:space="preserve">chuckmeyer@gmail.com | +1 (347) 419-0836 | Columbus, OH |</w:t>
-      </w:r>
-      <w:r>
-        <w:t xml:space="preserve"> </w:t>
-      </w:r>
+        <w:t xml:space="preserve">Columbus, OH</w:t>
+      </w:r>
+    </w:p>
+    <w:p>
+      <w:pPr>
+        <w:pStyle w:val="BodyText"/>
+      </w:pPr>
+      <w:r>
+        <w:t xml:space="preserve">chuckmeyer@gmail.com</w:t>
+      </w:r>
+      <w:r>
+        <w:br/>
+      </w:r>
+      <w:r>
+        <w:t xml:space="preserve">+1 (347) 419-0836</w:t>
+      </w:r>
+    </w:p>
+    <w:p>
+      <w:pPr>
+        <w:pStyle w:val="BodyText"/>
+      </w:pPr>
       <w:hyperlink r:id="rId20">
         <w:r>
           <w:rPr>
@@ -30,13 +46,7 @@
         </w:r>
       </w:hyperlink>
       <w:r>
-        <w:t xml:space="preserve"> </w:t>
-      </w:r>
-      <w:r>
-        <w:t xml:space="preserve">|</w:t>
-      </w:r>
-      <w:r>
-        <w:t xml:space="preserve"> </w:t>
+        <w:br/>
       </w:r>
       <w:hyperlink r:id="rId21">
         <w:r>

</xml_diff>

<commit_message>
Add Geist Mono accents, trim competencies, use relative metrics
Switch contact and dates to Geist Mono accents, shorten Core Competencies to three lines led by AI agents, and replace raw view counts with relative metrics.

Co-Authored-By: Claude Sonnet 5.5 <noreply@anthropic.com>
</commit_message>
<xml_diff>
--- a/output/chuck_meyer_resume.docx
+++ b/output/chuck_meyer_resume.docx
@@ -93,13 +93,13 @@
           <w:bCs/>
           <w:b/>
         </w:rPr>
-        <w:t xml:space="preserve">Developer Community Building</w:t>
-      </w:r>
-      <w:r>
-        <w:t xml:space="preserve"> </w:t>
-      </w:r>
-      <w:r>
-        <w:t xml:space="preserve">·</w:t>
+        <w:t xml:space="preserve">AI Agents</w:t>
+      </w:r>
+      <w:r>
+        <w:t xml:space="preserve"> </w:t>
+      </w:r>
+      <w:r>
+        <w:t xml:space="preserve">(MCP, Tool Use, Evals, multi-model; Algolia Agent Studio) ·</w:t>
       </w:r>
       <w:r>
         <w:t xml:space="preserve"> </w:t>
@@ -109,33 +109,33 @@
           <w:bCs/>
           <w:b/>
         </w:rPr>
-        <w:t xml:space="preserve">Technical Documentation</w:t>
-      </w:r>
-      <w:r>
-        <w:t xml:space="preserve"> </w:t>
-      </w:r>
-      <w:r>
-        <w:t xml:space="preserve">·</w:t>
-      </w:r>
-      <w:r>
-        <w:t xml:space="preserve"> </w:t>
+        <w:t xml:space="preserve">Claude Code</w:t>
+      </w:r>
+      <w:r>
+        <w:br/>
       </w:r>
       <w:r>
         <w:rPr>
           <w:bCs/>
           <w:b/>
         </w:rPr>
-        <w:t xml:space="preserve">API Integration &amp; Support</w:t>
-      </w:r>
-      <w:r>
-        <w:br/>
+        <w:t xml:space="preserve">Developer Community</w:t>
+      </w:r>
+      <w:r>
+        <w:t xml:space="preserve"> </w:t>
+      </w:r>
+      <w:r>
+        <w:t xml:space="preserve">·</w:t>
+      </w:r>
+      <w:r>
+        <w:t xml:space="preserve"> </w:t>
       </w:r>
       <w:r>
         <w:rPr>
           <w:bCs/>
           <w:b/>
         </w:rPr>
-        <w:t xml:space="preserve">JavaScript/React/Next.js</w:t>
+        <w:t xml:space="preserve">Documentation</w:t>
       </w:r>
       <w:r>
         <w:t xml:space="preserve"> </w:t>
@@ -151,7 +151,7 @@
           <w:bCs/>
           <w:b/>
         </w:rPr>
-        <w:t xml:space="preserve">Python</w:t>
+        <w:t xml:space="preserve">Technical Content</w:t>
       </w:r>
       <w:r>
         <w:t xml:space="preserve"> </w:t>
@@ -167,33 +167,33 @@
           <w:bCs/>
           <w:b/>
         </w:rPr>
-        <w:t xml:space="preserve">Go</w:t>
-      </w:r>
-      <w:r>
-        <w:t xml:space="preserve"> </w:t>
-      </w:r>
-      <w:r>
-        <w:t xml:space="preserve">·</w:t>
-      </w:r>
-      <w:r>
-        <w:t xml:space="preserve"> </w:t>
+        <w:t xml:space="preserve">Public Speaking</w:t>
+      </w:r>
+      <w:r>
+        <w:br/>
       </w:r>
       <w:r>
         <w:rPr>
           <w:bCs/>
           <w:b/>
         </w:rPr>
-        <w:t xml:space="preserve">AWS Services &amp; Security</w:t>
-      </w:r>
-      <w:r>
-        <w:br/>
+        <w:t xml:space="preserve">JavaScript/React</w:t>
+      </w:r>
+      <w:r>
+        <w:t xml:space="preserve"> </w:t>
+      </w:r>
+      <w:r>
+        <w:t xml:space="preserve">·</w:t>
+      </w:r>
+      <w:r>
+        <w:t xml:space="preserve"> </w:t>
       </w:r>
       <w:r>
         <w:rPr>
           <w:bCs/>
           <w:b/>
         </w:rPr>
-        <w:t xml:space="preserve">DevOps/CI/CD</w:t>
+        <w:t xml:space="preserve">Python</w:t>
       </w:r>
       <w:r>
         <w:t xml:space="preserve"> </w:t>
@@ -209,7 +209,7 @@
           <w:bCs/>
           <w:b/>
         </w:rPr>
-        <w:t xml:space="preserve">Developer Advocacy</w:t>
+        <w:t xml:space="preserve">Go</w:t>
       </w:r>
       <w:r>
         <w:t xml:space="preserve"> </w:t>
@@ -225,7 +225,7 @@
           <w:bCs/>
           <w:b/>
         </w:rPr>
-        <w:t xml:space="preserve">Technical Writing</w:t>
+        <w:t xml:space="preserve">AWS</w:t>
       </w:r>
       <w:r>
         <w:t xml:space="preserve"> </w:t>
@@ -241,59 +241,311 @@
           <w:bCs/>
           <w:b/>
         </w:rPr>
-        <w:t xml:space="preserve">Public Speaking</w:t>
-      </w:r>
-      <w:r>
-        <w:br/>
-      </w:r>
+        <w:t xml:space="preserve">Security &amp; Compliance</w:t>
+      </w:r>
+    </w:p>
+    <w:bookmarkEnd w:id="23"/>
+    <w:bookmarkStart w:id="26" w:name="experience"/>
+    <w:p>
+      <w:pPr>
+        <w:pStyle w:val="Heading2"/>
+      </w:pPr>
+      <w:r>
+        <w:t xml:space="preserve">EXPERIENCE</w:t>
+      </w:r>
+    </w:p>
+    <w:p>
+      <w:pPr>
+        <w:pStyle w:val="FirstParagraph"/>
+      </w:pPr>
       <w:r>
         <w:rPr>
           <w:bCs/>
           <w:b/>
         </w:rPr>
-        <w:t xml:space="preserve">AI Agents</w:t>
-      </w:r>
-      <w:r>
-        <w:t xml:space="preserve"> </w:t>
-      </w:r>
-      <w:r>
-        <w:t xml:space="preserve">(MCP, Tool Use, Agentic Workflows, Evals; multi-model via Algolia Agent Studio, Claude daily for AI-assisted development) ·</w:t>
-      </w:r>
-      <w:r>
-        <w:t xml:space="preserve"> </w:t>
+        <w:t xml:space="preserve">Senior Manager, Developer Relations</w:t>
+      </w:r>
+      <w:r>
+        <w:t xml:space="preserve"> </w:t>
+      </w:r>
+      <w:r>
+        <w:t xml:space="preserve">| Algolia |</w:t>
+      </w:r>
+      <w:r>
+        <w:t xml:space="preserve"> </w:t>
+      </w:r>
+      <w:r>
+        <w:rPr>
+          <w:iCs/>
+          <w:i/>
+        </w:rPr>
+        <w:t xml:space="preserve">August 2025 to present</w:t>
+      </w:r>
+      <w:r>
+        <w:br/>
       </w:r>
       <w:r>
         <w:rPr>
           <w:bCs/>
           <w:b/>
         </w:rPr>
-        <w:t xml:space="preserve">Security Architecture</w:t>
-      </w:r>
-      <w:r>
-        <w:t xml:space="preserve"> </w:t>
-      </w:r>
-      <w:r>
-        <w:t xml:space="preserve">·</w:t>
-      </w:r>
-      <w:r>
-        <w:t xml:space="preserve"> </w:t>
-      </w:r>
+        <w:t xml:space="preserve">Lead Developer Advocate</w:t>
+      </w:r>
+      <w:r>
+        <w:t xml:space="preserve"> </w:t>
+      </w:r>
+      <w:r>
+        <w:t xml:space="preserve">| Algolia |</w:t>
+      </w:r>
+      <w:r>
+        <w:t xml:space="preserve"> </w:t>
+      </w:r>
+      <w:r>
+        <w:rPr>
+          <w:iCs/>
+          <w:i/>
+        </w:rPr>
+        <w:t xml:space="preserve">August 2021 to August 2025</w:t>
+      </w:r>
+    </w:p>
+    <w:p>
+      <w:pPr>
+        <w:numPr>
+          <w:ilvl w:val="0"/>
+          <w:numId w:val="1001"/>
+        </w:numPr>
+        <w:pStyle w:val="Compact"/>
+      </w:pPr>
+      <w:r>
+        <w:t xml:space="preserve">Lead the docs and developer advocacy teams (up to five direct reports: advocates, technical writers, developer marketers) for Algolia’s API-first search platform</w:t>
+      </w:r>
+    </w:p>
+    <w:p>
+      <w:pPr>
+        <w:numPr>
+          <w:ilvl w:val="0"/>
+          <w:numId w:val="1001"/>
+        </w:numPr>
+        <w:pStyle w:val="Compact"/>
+      </w:pPr>
+      <w:r>
+        <w:t xml:space="preserve">Led the Algolia documentation migration from a homegrown platform to Mintlify with zero downtime</w:t>
+      </w:r>
+    </w:p>
+    <w:p>
+      <w:pPr>
+        <w:numPr>
+          <w:ilvl w:val="0"/>
+          <w:numId w:val="1001"/>
+        </w:numPr>
+        <w:pStyle w:val="Compact"/>
+      </w:pPr>
+      <w:r>
+        <w:t xml:space="preserve">Launched the Algolia Discord from 0 to 2,000+ active developers in one year</w:t>
+      </w:r>
+    </w:p>
+    <w:p>
+      <w:pPr>
+        <w:numPr>
+          <w:ilvl w:val="0"/>
+          <w:numId w:val="1001"/>
+        </w:numPr>
+        <w:pStyle w:val="Compact"/>
+      </w:pPr>
+      <w:r>
+        <w:t xml:space="preserve">Host Algolia DevCon, the annual developer conference, for five consecutive years (2026 edition on October 1), plus quarterly developer livestreams with 200-500 concurrent attendees</w:t>
+      </w:r>
+    </w:p>
+    <w:p>
+      <w:pPr>
+        <w:numPr>
+          <w:ilvl w:val="0"/>
+          <w:numId w:val="1001"/>
+        </w:numPr>
+        <w:pStyle w:val="Compact"/>
+      </w:pPr>
+      <w:r>
+        <w:t xml:space="preserve">Built a reusable agentic demo platform,</w:t>
+      </w:r>
+      <w:r>
+        <w:t xml:space="preserve"> </w:t>
+      </w:r>
+      <w:hyperlink r:id="rId24">
+        <w:r>
+          <w:rPr>
+            <w:rStyle w:val="Hyperlink"/>
+          </w:rPr>
+          <w:t xml:space="preserve">TCG Search</w:t>
+        </w:r>
+      </w:hyperlink>
+      <w:r>
+        <w:t xml:space="preserve">, and deployed it at eight conferences in six months, including Microsoft Build, Gartner, Adobe Summit, Shoptalk and eTail, each in a week or less</w:t>
+      </w:r>
+    </w:p>
+    <w:p>
+      <w:pPr>
+        <w:numPr>
+          <w:ilvl w:val="0"/>
+          <w:numId w:val="1001"/>
+        </w:numPr>
+        <w:pStyle w:val="Compact"/>
+      </w:pPr>
+      <w:r>
+        <w:t xml:space="preserve">Published agent-focused engineering content:</w:t>
+      </w:r>
+      <w:r>
+        <w:t xml:space="preserve"> </w:t>
+      </w:r>
+      <w:r>
+        <w:t xml:space="preserve">“</w:t>
+      </w:r>
+      <w:r>
+        <w:t xml:space="preserve">We rewrote the Algolia CLI for AI agents</w:t>
+      </w:r>
+      <w:r>
+        <w:t xml:space="preserve">”</w:t>
+      </w:r>
+      <w:r>
+        <w:t xml:space="preserve"> </w:t>
+      </w:r>
+      <w:r>
+        <w:t xml:space="preserve">(a top-five Algolia engineering blog post for February to August 2026) and</w:t>
+      </w:r>
+      <w:r>
+        <w:t xml:space="preserve"> </w:t>
+      </w:r>
+      <w:r>
+        <w:t xml:space="preserve">“</w:t>
+      </w:r>
+      <w:r>
+        <w:t xml:space="preserve">Chat, meet the Searchbox</w:t>
+      </w:r>
+      <w:r>
+        <w:t xml:space="preserve">”</w:t>
+      </w:r>
+    </w:p>
+    <w:p>
+      <w:pPr>
+        <w:numPr>
+          <w:ilvl w:val="0"/>
+          <w:numId w:val="1001"/>
+        </w:numPr>
+        <w:pStyle w:val="Compact"/>
+      </w:pPr>
+      <w:r>
+        <w:t xml:space="preserve">Host live coding sessions with partners, cross-pollinating user communities, and built demo applications such as a video transcription search (avsearch)</w:t>
+      </w:r>
+    </w:p>
+    <w:p>
+      <w:pPr>
+        <w:numPr>
+          <w:ilvl w:val="0"/>
+          <w:numId w:val="1001"/>
+        </w:numPr>
+        <w:pStyle w:val="Compact"/>
+      </w:pPr>
+      <w:r>
+        <w:t xml:space="preserve">Produced the Quick Start video embedded in the getting-started docs (more first-month views than any Algolia engineering blog post that half)</w:t>
+      </w:r>
+    </w:p>
+    <w:p>
+      <w:pPr>
+        <w:numPr>
+          <w:ilvl w:val="0"/>
+          <w:numId w:val="1001"/>
+        </w:numPr>
+        <w:pStyle w:val="Compact"/>
+      </w:pPr>
+      <w:r>
+        <w:t xml:space="preserve">Claimed Algolia’s library on Context7 and moved llms.txt to its canonical location so AI tools can read the docs</w:t>
+      </w:r>
+    </w:p>
+    <w:p>
+      <w:pPr>
+        <w:numPr>
+          <w:ilvl w:val="0"/>
+          <w:numId w:val="1001"/>
+        </w:numPr>
+        <w:pStyle w:val="Compact"/>
+      </w:pPr>
+      <w:r>
+        <w:t xml:space="preserve">Editor and coach for internal and external technical content, giving pre-publication feedback on blogs, tutorials and speaker sessions</w:t>
+      </w:r>
+    </w:p>
+    <w:p>
+      <w:pPr>
+        <w:numPr>
+          <w:ilvl w:val="0"/>
+          <w:numId w:val="1001"/>
+        </w:numPr>
+        <w:pStyle w:val="Compact"/>
+      </w:pPr>
+      <w:r>
+        <w:t xml:space="preserve">Spoke to Algolia’s Aspiring Managers Program on moving from IC to manager</w:t>
+      </w:r>
+    </w:p>
+    <w:p>
+      <w:pPr>
+        <w:pStyle w:val="FirstParagraph"/>
+      </w:pPr>
       <w:r>
         <w:rPr>
           <w:bCs/>
           <w:b/>
         </w:rPr>
-        <w:t xml:space="preserve">Compliance Frameworks</w:t>
-      </w:r>
-    </w:p>
-    <w:bookmarkEnd w:id="23"/>
-    <w:bookmarkStart w:id="26" w:name="experience"/>
-    <w:p>
-      <w:pPr>
-        <w:pStyle w:val="Heading2"/>
-      </w:pPr>
-      <w:r>
-        <w:t xml:space="preserve">EXPERIENCE</w:t>
+        <w:t xml:space="preserve">Senior Engineer, Developer Relations and Integrations</w:t>
+      </w:r>
+      <w:r>
+        <w:t xml:space="preserve"> </w:t>
+      </w:r>
+      <w:r>
+        <w:t xml:space="preserve">| Bold Penguin |</w:t>
+      </w:r>
+      <w:r>
+        <w:t xml:space="preserve"> </w:t>
+      </w:r>
+      <w:r>
+        <w:rPr>
+          <w:iCs/>
+          <w:i/>
+        </w:rPr>
+        <w:t xml:space="preserve">March 2019 to August 2021</w:t>
+      </w:r>
+    </w:p>
+    <w:p>
+      <w:pPr>
+        <w:numPr>
+          <w:ilvl w:val="0"/>
+          <w:numId w:val="1002"/>
+        </w:numPr>
+        <w:pStyle w:val="Compact"/>
+      </w:pPr>
+      <w:r>
+        <w:t xml:space="preserve">Built the Developers Portal that streamlined partner onboarding, and maintained the product documentation for integration partners from single agencies to large enterprises</w:t>
+      </w:r>
+    </w:p>
+    <w:p>
+      <w:pPr>
+        <w:numPr>
+          <w:ilvl w:val="0"/>
+          <w:numId w:val="1002"/>
+        </w:numPr>
+        <w:pStyle w:val="Compact"/>
+      </w:pPr>
+      <w:r>
+        <w:t xml:space="preserve">Advocated for partner-requested enhancements with product teams, improving API usability</w:t>
+      </w:r>
+    </w:p>
+    <w:p>
+      <w:pPr>
+        <w:numPr>
+          <w:ilvl w:val="0"/>
+          <w:numId w:val="1002"/>
+        </w:numPr>
+        <w:pStyle w:val="Compact"/>
+      </w:pPr>
+      <w:r>
+        <w:t xml:space="preserve">Wrote coding examples and best practices for integration partners</w:t>
       </w:r>
     </w:p>
     <w:p>
@@ -305,13 +557,13 @@
           <w:bCs/>
           <w:b/>
         </w:rPr>
-        <w:t xml:space="preserve">Senior Manager, Developer Relations</w:t>
-      </w:r>
-      <w:r>
-        <w:t xml:space="preserve"> </w:t>
-      </w:r>
-      <w:r>
-        <w:t xml:space="preserve">| Algolia |</w:t>
+        <w:t xml:space="preserve">Senior Developer Advocate, AWS CloudFormation</w:t>
+      </w:r>
+      <w:r>
+        <w:t xml:space="preserve"> </w:t>
+      </w:r>
+      <w:r>
+        <w:t xml:space="preserve">| Amazon Web Services |</w:t>
       </w:r>
       <w:r>
         <w:t xml:space="preserve"> </w:t>
@@ -321,23 +573,87 @@
           <w:iCs/>
           <w:i/>
         </w:rPr>
-        <w:t xml:space="preserve">August 2025 to present</w:t>
-      </w:r>
-      <w:r>
-        <w:br/>
-      </w:r>
+        <w:t xml:space="preserve">August 2017 to March 2019</w:t>
+      </w:r>
+    </w:p>
+    <w:p>
+      <w:pPr>
+        <w:numPr>
+          <w:ilvl w:val="0"/>
+          <w:numId w:val="1003"/>
+        </w:numPr>
+        <w:pStyle w:val="Compact"/>
+      </w:pPr>
+      <w:r>
+        <w:t xml:space="preserve">Reported to the service director and represented the developer community in service team planning, influencing the roadmap</w:t>
+      </w:r>
+    </w:p>
+    <w:p>
+      <w:pPr>
+        <w:numPr>
+          <w:ilvl w:val="0"/>
+          <w:numId w:val="1003"/>
+        </w:numPr>
+        <w:pStyle w:val="Compact"/>
+      </w:pPr>
+      <w:r>
+        <w:t xml:space="preserve">One of the two founding developers of</w:t>
+      </w:r>
+      <w:r>
+        <w:t xml:space="preserve"> </w:t>
+      </w:r>
+      <w:hyperlink r:id="rId25">
+        <w:r>
+          <w:rPr>
+            <w:rStyle w:val="Hyperlink"/>
+          </w:rPr>
+          <w:t xml:space="preserve">cfn-lint</w:t>
+        </w:r>
+      </w:hyperlink>
+      <w:r>
+        <w:t xml:space="preserve">, the open source CloudFormation template linter (2,600+ GitHub stars), including commissioning its logo and launch stickers</w:t>
+      </w:r>
+    </w:p>
+    <w:p>
+      <w:pPr>
+        <w:numPr>
+          <w:ilvl w:val="0"/>
+          <w:numId w:val="1003"/>
+        </w:numPr>
+        <w:pStyle w:val="Compact"/>
+      </w:pPr>
+      <w:r>
+        <w:t xml:space="preserve">Maintained CloudFormation’s other open source repositories with an active contributor community</w:t>
+      </w:r>
+    </w:p>
+    <w:p>
+      <w:pPr>
+        <w:numPr>
+          <w:ilvl w:val="0"/>
+          <w:numId w:val="1003"/>
+        </w:numPr>
+        <w:pStyle w:val="Compact"/>
+      </w:pPr>
+      <w:r>
+        <w:t xml:space="preserve">Published best-practices content on the AWS management tools blog, including a guide to pre-commit validation with cfn-lint, and engaged enterprise customers at meetups and conferences on infrastructure as code</w:t>
+      </w:r>
+    </w:p>
+    <w:p>
+      <w:pPr>
+        <w:pStyle w:val="FirstParagraph"/>
+      </w:pPr>
       <w:r>
         <w:rPr>
           <w:bCs/>
           <w:b/>
         </w:rPr>
-        <w:t xml:space="preserve">Lead Developer Advocate</w:t>
-      </w:r>
-      <w:r>
-        <w:t xml:space="preserve"> </w:t>
-      </w:r>
-      <w:r>
-        <w:t xml:space="preserve">| Algolia |</w:t>
+        <w:t xml:space="preserve">Security Solution Architect</w:t>
+      </w:r>
+      <w:r>
+        <w:t xml:space="preserve"> </w:t>
+      </w:r>
+      <w:r>
+        <w:t xml:space="preserve">| Amazon Web Services |</w:t>
       </w:r>
       <w:r>
         <w:t xml:space="preserve"> </w:t>
@@ -347,189 +663,31 @@
           <w:iCs/>
           <w:i/>
         </w:rPr>
-        <w:t xml:space="preserve">August 2021 to August 2025</w:t>
-      </w:r>
-    </w:p>
-    <w:p>
-      <w:pPr>
-        <w:numPr>
-          <w:ilvl w:val="0"/>
-          <w:numId w:val="1001"/>
-        </w:numPr>
-        <w:pStyle w:val="Compact"/>
-      </w:pPr>
-      <w:r>
-        <w:t xml:space="preserve">Lead the docs and developer advocacy teams (up to five direct reports: advocates, technical writers, developer marketers) for Algolia’s API-first search platform</w:t>
-      </w:r>
-    </w:p>
-    <w:p>
-      <w:pPr>
-        <w:numPr>
-          <w:ilvl w:val="0"/>
-          <w:numId w:val="1001"/>
-        </w:numPr>
-        <w:pStyle w:val="Compact"/>
-      </w:pPr>
-      <w:r>
-        <w:t xml:space="preserve">Led the Algolia documentation migration from a homegrown platform to Mintlify with zero downtime</w:t>
-      </w:r>
-    </w:p>
-    <w:p>
-      <w:pPr>
-        <w:numPr>
-          <w:ilvl w:val="0"/>
-          <w:numId w:val="1001"/>
-        </w:numPr>
-        <w:pStyle w:val="Compact"/>
-      </w:pPr>
-      <w:r>
-        <w:t xml:space="preserve">Launched the Algolia Discord from 0 to 2,000+ active developers in one year</w:t>
-      </w:r>
-    </w:p>
-    <w:p>
-      <w:pPr>
-        <w:numPr>
-          <w:ilvl w:val="0"/>
-          <w:numId w:val="1001"/>
-        </w:numPr>
-        <w:pStyle w:val="Compact"/>
-      </w:pPr>
-      <w:r>
-        <w:t xml:space="preserve">Host Algolia DevCon, the annual developer conference, for five consecutive years (2026 edition on October 1), plus quarterly developer livestreams with 200-500 concurrent attendees</w:t>
-      </w:r>
-    </w:p>
-    <w:p>
-      <w:pPr>
-        <w:numPr>
-          <w:ilvl w:val="0"/>
-          <w:numId w:val="1001"/>
-        </w:numPr>
-        <w:pStyle w:val="Compact"/>
-      </w:pPr>
-      <w:r>
-        <w:t xml:space="preserve">Built a reusable agentic demo platform,</w:t>
-      </w:r>
-      <w:r>
-        <w:t xml:space="preserve"> </w:t>
-      </w:r>
-      <w:hyperlink r:id="rId24">
-        <w:r>
-          <w:rPr>
-            <w:rStyle w:val="Hyperlink"/>
-          </w:rPr>
-          <w:t xml:space="preserve">TCG Search</w:t>
-        </w:r>
-      </w:hyperlink>
-      <w:r>
-        <w:t xml:space="preserve">, and deployed it at eight conferences in six months, including Microsoft Build, Gartner, Adobe Summit, Shoptalk and eTail, each in a week or less</w:t>
-      </w:r>
-    </w:p>
-    <w:p>
-      <w:pPr>
-        <w:numPr>
-          <w:ilvl w:val="0"/>
-          <w:numId w:val="1001"/>
-        </w:numPr>
-        <w:pStyle w:val="Compact"/>
-      </w:pPr>
-      <w:r>
-        <w:t xml:space="preserve">Published agent-focused engineering content:</w:t>
-      </w:r>
-      <w:r>
-        <w:t xml:space="preserve"> </w:t>
-      </w:r>
-      <w:r>
-        <w:t xml:space="preserve">“</w:t>
-      </w:r>
-      <w:r>
-        <w:t xml:space="preserve">We rewrote the Algolia CLI for AI agents</w:t>
-      </w:r>
-      <w:r>
-        <w:t xml:space="preserve">”</w:t>
-      </w:r>
-      <w:r>
-        <w:t xml:space="preserve"> </w:t>
-      </w:r>
-      <w:r>
-        <w:t xml:space="preserve">(419 views, a top-five Algolia engineering blog post for February to August 2026) and</w:t>
-      </w:r>
-      <w:r>
-        <w:t xml:space="preserve"> </w:t>
-      </w:r>
-      <w:r>
-        <w:t xml:space="preserve">“</w:t>
-      </w:r>
-      <w:r>
-        <w:t xml:space="preserve">Chat, meet the Searchbox</w:t>
-      </w:r>
-      <w:r>
-        <w:t xml:space="preserve">”</w:t>
-      </w:r>
-      <w:r>
-        <w:t xml:space="preserve"> </w:t>
-      </w:r>
-      <w:r>
-        <w:t xml:space="preserve">(267 views)</w:t>
-      </w:r>
-    </w:p>
-    <w:p>
-      <w:pPr>
-        <w:numPr>
-          <w:ilvl w:val="0"/>
-          <w:numId w:val="1001"/>
-        </w:numPr>
-        <w:pStyle w:val="Compact"/>
-      </w:pPr>
-      <w:r>
-        <w:t xml:space="preserve">Host live coding sessions with partners, cross-pollinating user communities, and built demo applications such as a video transcription search (avsearch)</w:t>
-      </w:r>
-    </w:p>
-    <w:p>
-      <w:pPr>
-        <w:numPr>
-          <w:ilvl w:val="0"/>
-          <w:numId w:val="1001"/>
-        </w:numPr>
-        <w:pStyle w:val="Compact"/>
-      </w:pPr>
-      <w:r>
-        <w:t xml:space="preserve">Produced the Quick Start video embedded in the getting-started docs (811 views in its first month)</w:t>
-      </w:r>
-    </w:p>
-    <w:p>
-      <w:pPr>
-        <w:numPr>
-          <w:ilvl w:val="0"/>
-          <w:numId w:val="1001"/>
-        </w:numPr>
-        <w:pStyle w:val="Compact"/>
-      </w:pPr>
-      <w:r>
-        <w:t xml:space="preserve">Claimed Algolia’s library on Context7 and moved llms.txt to its canonical location so AI tools can read the docs</w:t>
-      </w:r>
-    </w:p>
-    <w:p>
-      <w:pPr>
-        <w:numPr>
-          <w:ilvl w:val="0"/>
-          <w:numId w:val="1001"/>
-        </w:numPr>
-        <w:pStyle w:val="Compact"/>
-      </w:pPr>
-      <w:r>
-        <w:t xml:space="preserve">Editor and coach for internal and external technical content, giving pre-publication feedback on blogs, tutorials and speaker sessions</w:t>
-      </w:r>
-    </w:p>
-    <w:p>
-      <w:pPr>
-        <w:numPr>
-          <w:ilvl w:val="0"/>
-          <w:numId w:val="1001"/>
-        </w:numPr>
-        <w:pStyle w:val="Compact"/>
-      </w:pPr>
-      <w:r>
-        <w:t xml:space="preserve">Spoke to Algolia’s Aspiring Managers Program on moving from IC to manager</w:t>
+        <w:t xml:space="preserve">April 2016 to August 2017</w:t>
+      </w:r>
+    </w:p>
+    <w:p>
+      <w:pPr>
+        <w:numPr>
+          <w:ilvl w:val="0"/>
+          <w:numId w:val="1004"/>
+        </w:numPr>
+        <w:pStyle w:val="Compact"/>
+      </w:pPr>
+      <w:r>
+        <w:t xml:space="preserve">Advised CISOs and security practitioners across North America on security posture, and on PCI, HIPAA and SOC compliance in the cloud</w:t>
+      </w:r>
+    </w:p>
+    <w:p>
+      <w:pPr>
+        <w:numPr>
+          <w:ilvl w:val="0"/>
+          <w:numId w:val="1004"/>
+        </w:numPr>
+        <w:pStyle w:val="Compact"/>
+      </w:pPr>
+      <w:r>
+        <w:t xml:space="preserve">Reviewed customer network topologies and created AWS security labs for bootcamps, summits and loft events</w:t>
       </w:r>
     </w:p>
     <w:p>
@@ -541,13 +699,13 @@
           <w:bCs/>
           <w:b/>
         </w:rPr>
-        <w:t xml:space="preserve">Senior Engineer, Developer Relations and Integrations</w:t>
-      </w:r>
-      <w:r>
-        <w:t xml:space="preserve"> </w:t>
-      </w:r>
-      <w:r>
-        <w:t xml:space="preserve">| Bold Penguin |</w:t>
+        <w:t xml:space="preserve">Senior Professional Services Consultant</w:t>
+      </w:r>
+      <w:r>
+        <w:t xml:space="preserve"> </w:t>
+      </w:r>
+      <w:r>
+        <w:t xml:space="preserve">| Amazon Web Services |</w:t>
       </w:r>
       <w:r>
         <w:t xml:space="preserve"> </w:t>
@@ -557,685 +715,479 @@
           <w:iCs/>
           <w:i/>
         </w:rPr>
-        <w:t xml:space="preserve">March 2019 to August 2021</w:t>
-      </w:r>
-    </w:p>
-    <w:p>
-      <w:pPr>
-        <w:numPr>
-          <w:ilvl w:val="0"/>
-          <w:numId w:val="1002"/>
-        </w:numPr>
-        <w:pStyle w:val="Compact"/>
-      </w:pPr>
-      <w:r>
-        <w:t xml:space="preserve">Built the Developers Portal that streamlined partner onboarding, and maintained the product documentation for integration partners from single agencies to large enterprises</w:t>
-      </w:r>
-    </w:p>
-    <w:p>
-      <w:pPr>
-        <w:numPr>
-          <w:ilvl w:val="0"/>
-          <w:numId w:val="1002"/>
-        </w:numPr>
-        <w:pStyle w:val="Compact"/>
-      </w:pPr>
-      <w:r>
-        <w:t xml:space="preserve">Advocated for partner-requested enhancements with product teams, improving API usability</w:t>
-      </w:r>
-    </w:p>
-    <w:p>
-      <w:pPr>
-        <w:numPr>
-          <w:ilvl w:val="0"/>
-          <w:numId w:val="1002"/>
-        </w:numPr>
-        <w:pStyle w:val="Compact"/>
-      </w:pPr>
-      <w:r>
-        <w:t xml:space="preserve">Wrote coding examples and best practices for integration partners</w:t>
-      </w:r>
-    </w:p>
-    <w:p>
-      <w:pPr>
-        <w:pStyle w:val="FirstParagraph"/>
+        <w:t xml:space="preserve">July 2013 to April 2016</w:t>
+      </w:r>
+    </w:p>
+    <w:p>
+      <w:pPr>
+        <w:numPr>
+          <w:ilvl w:val="0"/>
+          <w:numId w:val="1005"/>
+        </w:numPr>
+        <w:pStyle w:val="Compact"/>
+      </w:pPr>
+      <w:r>
+        <w:t xml:space="preserve">Migrated large enterprises to AWS and integrated with on-premises systems through secure, repeatable deployments</w:t>
+      </w:r>
+    </w:p>
+    <w:p>
+      <w:pPr>
+        <w:numPr>
+          <w:ilvl w:val="0"/>
+          <w:numId w:val="1005"/>
+        </w:numPr>
+        <w:pStyle w:val="Compact"/>
+      </w:pPr>
+      <w:r>
+        <w:t xml:space="preserve">Built PCI-compliant infrastructure with Elastic Beanstalk, Packer, Puppet and CloudFormation, and a CI/CD pipeline for IAM governance with CodePipeline, Ansible and CloudFormation</w:t>
+      </w:r>
+    </w:p>
+    <w:bookmarkEnd w:id="26"/>
+    <w:bookmarkStart w:id="31" w:name="selected-projects"/>
+    <w:p>
+      <w:pPr>
+        <w:pStyle w:val="Heading2"/>
+      </w:pPr>
+      <w:r>
+        <w:t xml:space="preserve">SELECTED PROJECTS</w:t>
+      </w:r>
+    </w:p>
+    <w:p>
+      <w:pPr>
+        <w:numPr>
+          <w:ilvl w:val="0"/>
+          <w:numId w:val="1006"/>
+        </w:numPr>
+        <w:pStyle w:val="Compact"/>
+      </w:pPr>
+      <w:hyperlink r:id="rId27">
+        <w:r>
+          <w:rPr>
+            <w:rStyle w:val="Hyperlink"/>
+            <w:bCs/>
+            <w:b/>
+          </w:rPr>
+          <w:t xml:space="preserve">Pokemon TCG Vending Machine Search</w:t>
+        </w:r>
+      </w:hyperlink>
+      <w:r>
+        <w:t xml:space="preserve">: conference-booth demo with React/InstantSearch, an Algolia Agent Studio chat agent with evals, a card scanner, and serverless APIs on Vercel and Supabase</w:t>
+      </w:r>
+    </w:p>
+    <w:p>
+      <w:pPr>
+        <w:numPr>
+          <w:ilvl w:val="0"/>
+          <w:numId w:val="1006"/>
+        </w:numPr>
+        <w:pStyle w:val="Compact"/>
+      </w:pPr>
+      <w:hyperlink r:id="rId28">
+        <w:r>
+          <w:rPr>
+            <w:rStyle w:val="Hyperlink"/>
+            <w:bCs/>
+            <w:b/>
+          </w:rPr>
+          <w:t xml:space="preserve">Agent Studio CLI</w:t>
+        </w:r>
+      </w:hyperlink>
+      <w:r>
+        <w:t xml:space="preserve">: command-line tool for Algolia Agent Studio, from idea to working tool in a week</w:t>
+      </w:r>
+    </w:p>
+    <w:p>
+      <w:pPr>
+        <w:numPr>
+          <w:ilvl w:val="0"/>
+          <w:numId w:val="1006"/>
+        </w:numPr>
+        <w:pStyle w:val="Compact"/>
+      </w:pPr>
+      <w:hyperlink r:id="rId29">
+        <w:r>
+          <w:rPr>
+            <w:rStyle w:val="Hyperlink"/>
+            <w:bCs/>
+            <w:b/>
+          </w:rPr>
+          <w:t xml:space="preserve">Video Transcription Search</w:t>
+        </w:r>
+      </w:hyperlink>
+      <w:r>
+        <w:t xml:space="preserve">: full-stack demo of video content indexing with real-time search insights</w:t>
+      </w:r>
+    </w:p>
+    <w:p>
+      <w:pPr>
+        <w:numPr>
+          <w:ilvl w:val="0"/>
+          <w:numId w:val="1006"/>
+        </w:numPr>
+        <w:pStyle w:val="Compact"/>
+      </w:pPr>
+      <w:hyperlink r:id="rId30">
+        <w:r>
+          <w:rPr>
+            <w:rStyle w:val="Hyperlink"/>
+            <w:bCs/>
+            <w:b/>
+          </w:rPr>
+          <w:t xml:space="preserve">Hello MCP</w:t>
+        </w:r>
+      </w:hyperlink>
+      <w:r>
+        <w:t xml:space="preserve">: minimal MCP server over Streamable HTTP, with a companion tutorial</w:t>
+      </w:r>
+    </w:p>
+    <w:bookmarkEnd w:id="31"/>
+    <w:bookmarkStart w:id="47" w:name="writing-and-speaking"/>
+    <w:p>
+      <w:pPr>
+        <w:pStyle w:val="Heading2"/>
+      </w:pPr>
+      <w:r>
+        <w:t xml:space="preserve">WRITING AND SPEAKING</w:t>
+      </w:r>
+    </w:p>
+    <w:p>
+      <w:pPr>
+        <w:numPr>
+          <w:ilvl w:val="0"/>
+          <w:numId w:val="1007"/>
+        </w:numPr>
+        <w:pStyle w:val="Compact"/>
       </w:pPr>
       <w:r>
         <w:rPr>
           <w:bCs/>
           <w:b/>
         </w:rPr>
-        <w:t xml:space="preserve">Senior Developer Advocate, AWS CloudFormation</w:t>
-      </w:r>
-      <w:r>
-        <w:t xml:space="preserve"> </w:t>
-      </w:r>
-      <w:r>
-        <w:t xml:space="preserve">| Amazon Web Services |</w:t>
-      </w:r>
-      <w:r>
-        <w:t xml:space="preserve"> </w:t>
-      </w:r>
-      <w:r>
-        <w:rPr>
-          <w:iCs/>
-          <w:i/>
-        </w:rPr>
-        <w:t xml:space="preserve">August 2017 to March 2019</w:t>
-      </w:r>
-    </w:p>
-    <w:p>
-      <w:pPr>
-        <w:numPr>
-          <w:ilvl w:val="0"/>
-          <w:numId w:val="1003"/>
-        </w:numPr>
-        <w:pStyle w:val="Compact"/>
-      </w:pPr>
-      <w:r>
-        <w:t xml:space="preserve">Reported to the service director and represented the developer community in service team planning, influencing the roadmap</w:t>
-      </w:r>
-    </w:p>
-    <w:p>
-      <w:pPr>
-        <w:numPr>
-          <w:ilvl w:val="0"/>
-          <w:numId w:val="1003"/>
-        </w:numPr>
-        <w:pStyle w:val="Compact"/>
-      </w:pPr>
-      <w:r>
-        <w:t xml:space="preserve">One of the two founding developers of</w:t>
-      </w:r>
-      <w:r>
-        <w:t xml:space="preserve"> </w:t>
-      </w:r>
-      <w:hyperlink r:id="rId25">
-        <w:r>
-          <w:rPr>
-            <w:rStyle w:val="Hyperlink"/>
-          </w:rPr>
-          <w:t xml:space="preserve">cfn-lint</w:t>
+        <w:t xml:space="preserve">Writing:</w:t>
+      </w:r>
+      <w:r>
+        <w:t xml:space="preserve"> </w:t>
+      </w:r>
+      <w:hyperlink r:id="rId32">
+        <w:r>
+          <w:rPr>
+            <w:rStyle w:val="Hyperlink"/>
+          </w:rPr>
+          <w:t xml:space="preserve">We rewrote the Algolia CLI for AI agents</w:t>
         </w:r>
       </w:hyperlink>
       <w:r>
-        <w:t xml:space="preserve">, the open source CloudFormation template linter (2,600+ GitHub stars), including commissioning its logo and launch stickers</w:t>
-      </w:r>
-    </w:p>
-    <w:p>
-      <w:pPr>
-        <w:numPr>
-          <w:ilvl w:val="0"/>
-          <w:numId w:val="1003"/>
-        </w:numPr>
-        <w:pStyle w:val="Compact"/>
-      </w:pPr>
-      <w:r>
-        <w:t xml:space="preserve">Maintained CloudFormation’s other open source repositories with an active contributor community</w:t>
-      </w:r>
-    </w:p>
-    <w:p>
-      <w:pPr>
-        <w:numPr>
-          <w:ilvl w:val="0"/>
-          <w:numId w:val="1003"/>
-        </w:numPr>
-        <w:pStyle w:val="Compact"/>
-      </w:pPr>
-      <w:r>
-        <w:t xml:space="preserve">Published best-practices content on the AWS management tools blog, including a guide to pre-commit validation with cfn-lint, and engaged enterprise customers at meetups and conferences on infrastructure as code</w:t>
-      </w:r>
-    </w:p>
-    <w:p>
-      <w:pPr>
-        <w:pStyle w:val="FirstParagraph"/>
+        <w:t xml:space="preserve"> </w:t>
+      </w:r>
+      <w:r>
+        <w:t xml:space="preserve">(2026),</w:t>
+      </w:r>
+      <w:r>
+        <w:t xml:space="preserve"> </w:t>
+      </w:r>
+      <w:hyperlink r:id="rId33">
+        <w:r>
+          <w:rPr>
+            <w:rStyle w:val="Hyperlink"/>
+          </w:rPr>
+          <w:t xml:space="preserve">Chat, meet the Searchbox</w:t>
+        </w:r>
+      </w:hyperlink>
+      <w:r>
+        <w:t xml:space="preserve"> </w:t>
+      </w:r>
+      <w:r>
+        <w:t xml:space="preserve">(2026),</w:t>
+      </w:r>
+      <w:r>
+        <w:t xml:space="preserve"> </w:t>
+      </w:r>
+      <w:hyperlink r:id="rId34">
+        <w:r>
+          <w:rPr>
+            <w:rStyle w:val="Hyperlink"/>
+          </w:rPr>
+          <w:t xml:space="preserve">The Agent Factory</w:t>
+        </w:r>
+      </w:hyperlink>
+      <w:r>
+        <w:t xml:space="preserve"> </w:t>
+      </w:r>
+      <w:r>
+        <w:t xml:space="preserve">(2026),</w:t>
+      </w:r>
+      <w:r>
+        <w:t xml:space="preserve"> </w:t>
+      </w:r>
+      <w:hyperlink r:id="rId35">
+        <w:r>
+          <w:rPr>
+            <w:rStyle w:val="Hyperlink"/>
+          </w:rPr>
+          <w:t xml:space="preserve">Building a JavaScript</w:t>
+        </w:r>
+        <w:r>
+          <w:rPr>
+            <w:rStyle w:val="Hyperlink"/>
+          </w:rPr>
+          <w:t xml:space="preserve"> </w:t>
+        </w:r>
+        <w:r>
+          <w:rPr>
+            <w:rStyle w:val="Hyperlink"/>
+          </w:rPr>
+          <w:t xml:space="preserve">“</w:t>
+        </w:r>
+        <w:r>
+          <w:rPr>
+            <w:rStyle w:val="Hyperlink"/>
+          </w:rPr>
+          <w:t xml:space="preserve">Hello, World</w:t>
+        </w:r>
+        <w:r>
+          <w:rPr>
+            <w:rStyle w:val="Hyperlink"/>
+          </w:rPr>
+          <w:t xml:space="preserve">”</w:t>
+        </w:r>
+        <w:r>
+          <w:rPr>
+            <w:rStyle w:val="Hyperlink"/>
+          </w:rPr>
+          <w:t xml:space="preserve"> </w:t>
+        </w:r>
+        <w:r>
+          <w:rPr>
+            <w:rStyle w:val="Hyperlink"/>
+          </w:rPr>
+          <w:t xml:space="preserve">MCP server</w:t>
+        </w:r>
+      </w:hyperlink>
+      <w:r>
+        <w:t xml:space="preserve"> </w:t>
+      </w:r>
+      <w:r>
+        <w:t xml:space="preserve">(my best-performing dev.to post since 2022),</w:t>
+      </w:r>
+      <w:r>
+        <w:t xml:space="preserve"> </w:t>
+      </w:r>
+      <w:hyperlink r:id="rId36">
+        <w:r>
+          <w:rPr>
+            <w:rStyle w:val="Hyperlink"/>
+          </w:rPr>
+          <w:t xml:space="preserve">Customizing Algolia React components with Tailwind classes</w:t>
+        </w:r>
+      </w:hyperlink>
+      <w:r>
+        <w:t xml:space="preserve">,</w:t>
+      </w:r>
+      <w:r>
+        <w:t xml:space="preserve"> </w:t>
+      </w:r>
+      <w:hyperlink r:id="rId37">
+        <w:r>
+          <w:rPr>
+            <w:rStyle w:val="Hyperlink"/>
+          </w:rPr>
+          <w:t xml:space="preserve">Feature Spotlight: Trends Models in Recommend</w:t>
+        </w:r>
+      </w:hyperlink>
+      <w:r>
+        <w:t xml:space="preserve">,</w:t>
+      </w:r>
+      <w:r>
+        <w:t xml:space="preserve"> </w:t>
+      </w:r>
+      <w:hyperlink r:id="rId38">
+        <w:r>
+          <w:rPr>
+            <w:rStyle w:val="Hyperlink"/>
+          </w:rPr>
+          <w:t xml:space="preserve">Git pre-commit validation of CloudFormation templates</w:t>
+        </w:r>
+      </w:hyperlink>
+      <w:r>
+        <w:t xml:space="preserve"> </w:t>
+      </w:r>
+      <w:r>
+        <w:t xml:space="preserve">(AWS). More at</w:t>
+      </w:r>
+      <w:r>
+        <w:t xml:space="preserve"> </w:t>
+      </w:r>
+      <w:hyperlink r:id="rId39">
+        <w:r>
+          <w:rPr>
+            <w:rStyle w:val="Hyperlink"/>
+          </w:rPr>
+          <w:t xml:space="preserve">dev.to/chuckm</w:t>
+        </w:r>
+      </w:hyperlink>
+    </w:p>
+    <w:p>
+      <w:pPr>
+        <w:numPr>
+          <w:ilvl w:val="0"/>
+          <w:numId w:val="1007"/>
+        </w:numPr>
+        <w:pStyle w:val="Compact"/>
       </w:pPr>
       <w:r>
         <w:rPr>
           <w:bCs/>
           <w:b/>
         </w:rPr>
-        <w:t xml:space="preserve">Security Solution Architect</w:t>
-      </w:r>
-      <w:r>
-        <w:t xml:space="preserve"> </w:t>
-      </w:r>
-      <w:r>
-        <w:t xml:space="preserve">| Amazon Web Services |</w:t>
-      </w:r>
-      <w:r>
-        <w:t xml:space="preserve"> </w:t>
-      </w:r>
-      <w:r>
-        <w:rPr>
-          <w:iCs/>
-          <w:i/>
-        </w:rPr>
-        <w:t xml:space="preserve">April 2016 to August 2017</w:t>
-      </w:r>
-    </w:p>
-    <w:p>
-      <w:pPr>
-        <w:numPr>
-          <w:ilvl w:val="0"/>
-          <w:numId w:val="1004"/>
-        </w:numPr>
-        <w:pStyle w:val="Compact"/>
-      </w:pPr>
-      <w:r>
-        <w:t xml:space="preserve">Advised CISOs and security practitioners across North America on security posture, and on PCI, HIPAA and SOC compliance in the cloud</w:t>
-      </w:r>
-    </w:p>
-    <w:p>
-      <w:pPr>
-        <w:numPr>
-          <w:ilvl w:val="0"/>
-          <w:numId w:val="1004"/>
-        </w:numPr>
-        <w:pStyle w:val="Compact"/>
-      </w:pPr>
-      <w:r>
-        <w:t xml:space="preserve">Reviewed customer network topologies and created AWS security labs for bootcamps, summits and loft events</w:t>
-      </w:r>
-    </w:p>
-    <w:p>
-      <w:pPr>
-        <w:pStyle w:val="FirstParagraph"/>
+        <w:t xml:space="preserve">Talks:</w:t>
+      </w:r>
+      <w:r>
+        <w:t xml:space="preserve"> </w:t>
+      </w:r>
+      <w:hyperlink r:id="rId40">
+        <w:r>
+          <w:rPr>
+            <w:rStyle w:val="Hyperlink"/>
+          </w:rPr>
+          <w:t xml:space="preserve">DevRelCon 2026, Blog While the Context is Fresh</w:t>
+        </w:r>
+      </w:hyperlink>
+      <w:r>
+        <w:t xml:space="preserve"> </w:t>
+      </w:r>
+      <w:r>
+        <w:t xml:space="preserve">·</w:t>
+      </w:r>
+      <w:r>
+        <w:t xml:space="preserve"> </w:t>
+      </w:r>
+      <w:hyperlink r:id="rId41">
+        <w:r>
+          <w:rPr>
+            <w:rStyle w:val="Hyperlink"/>
+          </w:rPr>
+          <w:t xml:space="preserve">Haystack US 2025 lightning talk, Agentic query understanding using search MCPs</w:t>
+        </w:r>
+      </w:hyperlink>
+      <w:r>
+        <w:t xml:space="preserve"> </w:t>
+      </w:r>
+      <w:r>
+        <w:t xml:space="preserve">·</w:t>
+      </w:r>
+      <w:r>
+        <w:t xml:space="preserve"> </w:t>
+      </w:r>
+      <w:hyperlink r:id="rId42">
+        <w:r>
+          <w:rPr>
+            <w:rStyle w:val="Hyperlink"/>
+          </w:rPr>
+          <w:t xml:space="preserve">AWS re:Invent 2018, Deployment Scenarios with AWS CloudFormation</w:t>
+        </w:r>
+      </w:hyperlink>
+      <w:r>
+        <w:t xml:space="preserve"> </w:t>
+      </w:r>
+      <w:r>
+        <w:t xml:space="preserve">(11,000+ views) ·</w:t>
+      </w:r>
+      <w:r>
+        <w:t xml:space="preserve"> </w:t>
+      </w:r>
+      <w:hyperlink r:id="rId43">
+        <w:r>
+          <w:rPr>
+            <w:rStyle w:val="Hyperlink"/>
+          </w:rPr>
+          <w:t xml:space="preserve">Search relevance panel, Finding out what’s best</w:t>
+        </w:r>
+      </w:hyperlink>
+    </w:p>
+    <w:p>
+      <w:pPr>
+        <w:numPr>
+          <w:ilvl w:val="0"/>
+          <w:numId w:val="1007"/>
+        </w:numPr>
+        <w:pStyle w:val="Compact"/>
       </w:pPr>
       <w:r>
         <w:rPr>
           <w:bCs/>
           <w:b/>
         </w:rPr>
-        <w:t xml:space="preserve">Senior Professional Services Consultant</w:t>
-      </w:r>
-      <w:r>
-        <w:t xml:space="preserve"> </w:t>
-      </w:r>
-      <w:r>
-        <w:t xml:space="preserve">| Amazon Web Services |</w:t>
-      </w:r>
-      <w:r>
-        <w:t xml:space="preserve"> </w:t>
-      </w:r>
-      <w:r>
-        <w:rPr>
-          <w:iCs/>
-          <w:i/>
-        </w:rPr>
-        <w:t xml:space="preserve">July 2013 to April 2016</w:t>
-      </w:r>
-    </w:p>
-    <w:p>
-      <w:pPr>
-        <w:numPr>
-          <w:ilvl w:val="0"/>
-          <w:numId w:val="1005"/>
-        </w:numPr>
-        <w:pStyle w:val="Compact"/>
-      </w:pPr>
-      <w:r>
-        <w:t xml:space="preserve">Migrated large enterprises to AWS and integrated with on-premises systems through secure, repeatable deployments</w:t>
-      </w:r>
-    </w:p>
-    <w:p>
-      <w:pPr>
-        <w:numPr>
-          <w:ilvl w:val="0"/>
-          <w:numId w:val="1005"/>
-        </w:numPr>
-        <w:pStyle w:val="Compact"/>
-      </w:pPr>
-      <w:r>
-        <w:t xml:space="preserve">Built PCI-compliant infrastructure with Elastic Beanstalk, Packer, Puppet and CloudFormation, and a CI/CD pipeline for IAM governance with CodePipeline, Ansible and CloudFormation</w:t>
-      </w:r>
-    </w:p>
-    <w:bookmarkEnd w:id="26"/>
-    <w:bookmarkStart w:id="31" w:name="selected-projects"/>
+        <w:t xml:space="preserve">Live coding and community:</w:t>
+      </w:r>
+      <w:r>
+        <w:t xml:space="preserve"> </w:t>
+      </w:r>
+      <w:hyperlink r:id="rId44">
+        <w:r>
+          <w:rPr>
+            <w:rStyle w:val="Hyperlink"/>
+          </w:rPr>
+          <w:t xml:space="preserve">Adding search insights to InstantSearch applications</w:t>
+        </w:r>
+      </w:hyperlink>
+      <w:r>
+        <w:t xml:space="preserve"> </w:t>
+      </w:r>
+      <w:r>
+        <w:t xml:space="preserve">(2,000+ views) ·</w:t>
+      </w:r>
+      <w:r>
+        <w:t xml:space="preserve"> </w:t>
+      </w:r>
+      <w:hyperlink r:id="rId45">
+        <w:r>
+          <w:rPr>
+            <w:rStyle w:val="Hyperlink"/>
+          </w:rPr>
+          <w:t xml:space="preserve">Fireside chat, Algolia-Hyvä integration on Magento 2</w:t>
+        </w:r>
+      </w:hyperlink>
+      <w:r>
+        <w:t xml:space="preserve"> </w:t>
+      </w:r>
+      <w:r>
+        <w:t xml:space="preserve">·</w:t>
+      </w:r>
+      <w:r>
+        <w:t xml:space="preserve"> </w:t>
+      </w:r>
+      <w:hyperlink r:id="rId46">
+        <w:r>
+          <w:rPr>
+            <w:rStyle w:val="Hyperlink"/>
+          </w:rPr>
+          <w:t xml:space="preserve">The WebDev Challenge, Future of AI-native UX</w:t>
+        </w:r>
+      </w:hyperlink>
+    </w:p>
+    <w:bookmarkEnd w:id="47"/>
+    <w:bookmarkStart w:id="48" w:name="education"/>
     <w:p>
       <w:pPr>
         <w:pStyle w:val="Heading2"/>
       </w:pPr>
       <w:r>
-        <w:t xml:space="preserve">SELECTED PROJECTS</w:t>
-      </w:r>
-    </w:p>
-    <w:p>
-      <w:pPr>
-        <w:numPr>
-          <w:ilvl w:val="0"/>
-          <w:numId w:val="1006"/>
-        </w:numPr>
-        <w:pStyle w:val="Compact"/>
-      </w:pPr>
-      <w:hyperlink r:id="rId27">
-        <w:r>
-          <w:rPr>
-            <w:rStyle w:val="Hyperlink"/>
-            <w:bCs/>
-            <w:b/>
-          </w:rPr>
-          <w:t xml:space="preserve">Pokemon TCG Vending Machine Search</w:t>
-        </w:r>
-      </w:hyperlink>
-      <w:r>
-        <w:t xml:space="preserve">: conference-booth demo with React/InstantSearch, an Algolia Agent Studio chat agent with evals, a card scanner, and serverless APIs on Vercel and Supabase</w:t>
-      </w:r>
-    </w:p>
-    <w:p>
-      <w:pPr>
-        <w:numPr>
-          <w:ilvl w:val="0"/>
-          <w:numId w:val="1006"/>
-        </w:numPr>
-        <w:pStyle w:val="Compact"/>
-      </w:pPr>
-      <w:hyperlink r:id="rId28">
-        <w:r>
-          <w:rPr>
-            <w:rStyle w:val="Hyperlink"/>
-            <w:bCs/>
-            <w:b/>
-          </w:rPr>
-          <w:t xml:space="preserve">Agent Studio CLI</w:t>
-        </w:r>
-      </w:hyperlink>
-      <w:r>
-        <w:t xml:space="preserve">: command-line tool for Algolia Agent Studio, from idea to working tool in a week</w:t>
-      </w:r>
-    </w:p>
-    <w:p>
-      <w:pPr>
-        <w:numPr>
-          <w:ilvl w:val="0"/>
-          <w:numId w:val="1006"/>
-        </w:numPr>
-        <w:pStyle w:val="Compact"/>
-      </w:pPr>
-      <w:hyperlink r:id="rId29">
-        <w:r>
-          <w:rPr>
-            <w:rStyle w:val="Hyperlink"/>
-            <w:bCs/>
-            <w:b/>
-          </w:rPr>
-          <w:t xml:space="preserve">Video Transcription Search</w:t>
-        </w:r>
-      </w:hyperlink>
-      <w:r>
-        <w:t xml:space="preserve">: full-stack demo of video content indexing with real-time search insights</w:t>
-      </w:r>
-    </w:p>
-    <w:p>
-      <w:pPr>
-        <w:numPr>
-          <w:ilvl w:val="0"/>
-          <w:numId w:val="1006"/>
-        </w:numPr>
-        <w:pStyle w:val="Compact"/>
-      </w:pPr>
-      <w:hyperlink r:id="rId30">
-        <w:r>
-          <w:rPr>
-            <w:rStyle w:val="Hyperlink"/>
-            <w:bCs/>
-            <w:b/>
-          </w:rPr>
-          <w:t xml:space="preserve">Hello MCP</w:t>
-        </w:r>
-      </w:hyperlink>
-      <w:r>
-        <w:t xml:space="preserve">: minimal MCP server over Streamable HTTP, with a companion tutorial</w:t>
-      </w:r>
-    </w:p>
-    <w:bookmarkEnd w:id="31"/>
-    <w:bookmarkStart w:id="47" w:name="writing-and-speaking"/>
-    <w:p>
-      <w:pPr>
-        <w:pStyle w:val="Heading2"/>
-      </w:pPr>
-      <w:r>
-        <w:t xml:space="preserve">WRITING AND SPEAKING</w:t>
-      </w:r>
-    </w:p>
-    <w:p>
-      <w:pPr>
-        <w:numPr>
-          <w:ilvl w:val="0"/>
-          <w:numId w:val="1007"/>
-        </w:numPr>
-        <w:pStyle w:val="Compact"/>
+        <w:t xml:space="preserve">EDUCATION</w:t>
+      </w:r>
+    </w:p>
+    <w:p>
+      <w:pPr>
+        <w:pStyle w:val="FirstParagraph"/>
       </w:pPr>
       <w:r>
         <w:rPr>
           <w:bCs/>
           <w:b/>
         </w:rPr>
-        <w:t xml:space="preserve">Writing:</w:t>
-      </w:r>
-      <w:r>
-        <w:t xml:space="preserve"> </w:t>
-      </w:r>
-      <w:hyperlink r:id="rId32">
-        <w:r>
-          <w:rPr>
-            <w:rStyle w:val="Hyperlink"/>
-          </w:rPr>
-          <w:t xml:space="preserve">We rewrote the Algolia CLI for AI agents</w:t>
-        </w:r>
-      </w:hyperlink>
-      <w:r>
-        <w:t xml:space="preserve"> </w:t>
-      </w:r>
-      <w:r>
-        <w:t xml:space="preserve">(2026),</w:t>
-      </w:r>
-      <w:r>
-        <w:t xml:space="preserve"> </w:t>
-      </w:r>
-      <w:hyperlink r:id="rId33">
-        <w:r>
-          <w:rPr>
-            <w:rStyle w:val="Hyperlink"/>
-          </w:rPr>
-          <w:t xml:space="preserve">Chat, meet the Searchbox</w:t>
-        </w:r>
-      </w:hyperlink>
-      <w:r>
-        <w:t xml:space="preserve"> </w:t>
-      </w:r>
-      <w:r>
-        <w:t xml:space="preserve">(2026),</w:t>
-      </w:r>
-      <w:r>
-        <w:t xml:space="preserve"> </w:t>
-      </w:r>
-      <w:hyperlink r:id="rId34">
-        <w:r>
-          <w:rPr>
-            <w:rStyle w:val="Hyperlink"/>
-          </w:rPr>
-          <w:t xml:space="preserve">The Agent Factory</w:t>
-        </w:r>
-      </w:hyperlink>
-      <w:r>
-        <w:t xml:space="preserve"> </w:t>
-      </w:r>
-      <w:r>
-        <w:t xml:space="preserve">(2026),</w:t>
-      </w:r>
-      <w:r>
-        <w:t xml:space="preserve"> </w:t>
-      </w:r>
-      <w:hyperlink r:id="rId35">
-        <w:r>
-          <w:rPr>
-            <w:rStyle w:val="Hyperlink"/>
-          </w:rPr>
-          <w:t xml:space="preserve">Building a JavaScript</w:t>
-        </w:r>
-        <w:r>
-          <w:rPr>
-            <w:rStyle w:val="Hyperlink"/>
-          </w:rPr>
-          <w:t xml:space="preserve"> </w:t>
-        </w:r>
-        <w:r>
-          <w:rPr>
-            <w:rStyle w:val="Hyperlink"/>
-          </w:rPr>
-          <w:t xml:space="preserve">“</w:t>
-        </w:r>
-        <w:r>
-          <w:rPr>
-            <w:rStyle w:val="Hyperlink"/>
-          </w:rPr>
-          <w:t xml:space="preserve">Hello, World</w:t>
-        </w:r>
-        <w:r>
-          <w:rPr>
-            <w:rStyle w:val="Hyperlink"/>
-          </w:rPr>
-          <w:t xml:space="preserve">”</w:t>
-        </w:r>
-        <w:r>
-          <w:rPr>
-            <w:rStyle w:val="Hyperlink"/>
-          </w:rPr>
-          <w:t xml:space="preserve"> </w:t>
-        </w:r>
-        <w:r>
-          <w:rPr>
-            <w:rStyle w:val="Hyperlink"/>
-          </w:rPr>
-          <w:t xml:space="preserve">MCP server</w:t>
-        </w:r>
-      </w:hyperlink>
-      <w:r>
-        <w:t xml:space="preserve"> </w:t>
-      </w:r>
-      <w:r>
-        <w:t xml:space="preserve">(398 views),</w:t>
-      </w:r>
-      <w:r>
-        <w:t xml:space="preserve"> </w:t>
-      </w:r>
-      <w:hyperlink r:id="rId36">
-        <w:r>
-          <w:rPr>
-            <w:rStyle w:val="Hyperlink"/>
-          </w:rPr>
-          <w:t xml:space="preserve">Customizing Algolia React components with Tailwind classes</w:t>
-        </w:r>
-      </w:hyperlink>
-      <w:r>
-        <w:t xml:space="preserve">,</w:t>
-      </w:r>
-      <w:r>
-        <w:t xml:space="preserve"> </w:t>
-      </w:r>
-      <w:hyperlink r:id="rId37">
-        <w:r>
-          <w:rPr>
-            <w:rStyle w:val="Hyperlink"/>
-          </w:rPr>
-          <w:t xml:space="preserve">Feature Spotlight: Trends Models in Recommend</w:t>
-        </w:r>
-      </w:hyperlink>
-      <w:r>
-        <w:t xml:space="preserve">,</w:t>
-      </w:r>
-      <w:r>
-        <w:t xml:space="preserve"> </w:t>
-      </w:r>
-      <w:hyperlink r:id="rId38">
-        <w:r>
-          <w:rPr>
-            <w:rStyle w:val="Hyperlink"/>
-          </w:rPr>
-          <w:t xml:space="preserve">Git pre-commit validation of CloudFormation templates</w:t>
-        </w:r>
-      </w:hyperlink>
-      <w:r>
-        <w:t xml:space="preserve"> </w:t>
-      </w:r>
-      <w:r>
-        <w:t xml:space="preserve">(AWS). More at</w:t>
-      </w:r>
-      <w:r>
-        <w:t xml:space="preserve"> </w:t>
-      </w:r>
-      <w:hyperlink r:id="rId39">
-        <w:r>
-          <w:rPr>
-            <w:rStyle w:val="Hyperlink"/>
-          </w:rPr>
-          <w:t xml:space="preserve">dev.to/chuckm</w:t>
-        </w:r>
-      </w:hyperlink>
-    </w:p>
-    <w:p>
-      <w:pPr>
-        <w:numPr>
-          <w:ilvl w:val="0"/>
-          <w:numId w:val="1007"/>
-        </w:numPr>
-        <w:pStyle w:val="Compact"/>
-      </w:pPr>
-      <w:r>
-        <w:rPr>
-          <w:bCs/>
-          <w:b/>
-        </w:rPr>
-        <w:t xml:space="preserve">Talks:</w:t>
-      </w:r>
-      <w:r>
-        <w:t xml:space="preserve"> </w:t>
-      </w:r>
-      <w:hyperlink r:id="rId40">
-        <w:r>
-          <w:rPr>
-            <w:rStyle w:val="Hyperlink"/>
-          </w:rPr>
-          <w:t xml:space="preserve">DevRelCon 2026, Blog While the Context is Fresh</w:t>
-        </w:r>
-      </w:hyperlink>
-      <w:r>
-        <w:t xml:space="preserve"> </w:t>
-      </w:r>
-      <w:r>
-        <w:t xml:space="preserve">·</w:t>
-      </w:r>
-      <w:r>
-        <w:t xml:space="preserve"> </w:t>
-      </w:r>
-      <w:hyperlink r:id="rId41">
-        <w:r>
-          <w:rPr>
-            <w:rStyle w:val="Hyperlink"/>
-          </w:rPr>
-          <w:t xml:space="preserve">Haystack US 2025 lightning talk, Agentic query understanding using search MCPs</w:t>
-        </w:r>
-      </w:hyperlink>
-      <w:r>
-        <w:t xml:space="preserve"> </w:t>
-      </w:r>
-      <w:r>
-        <w:t xml:space="preserve">·</w:t>
-      </w:r>
-      <w:r>
-        <w:t xml:space="preserve"> </w:t>
-      </w:r>
-      <w:hyperlink r:id="rId42">
-        <w:r>
-          <w:rPr>
-            <w:rStyle w:val="Hyperlink"/>
-          </w:rPr>
-          <w:t xml:space="preserve">AWS re:Invent 2018, Deployment Scenarios with AWS CloudFormation</w:t>
-        </w:r>
-      </w:hyperlink>
-      <w:r>
-        <w:t xml:space="preserve"> </w:t>
-      </w:r>
-      <w:r>
-        <w:t xml:space="preserve">(11,000+ views) ·</w:t>
-      </w:r>
-      <w:r>
-        <w:t xml:space="preserve"> </w:t>
-      </w:r>
-      <w:hyperlink r:id="rId43">
-        <w:r>
-          <w:rPr>
-            <w:rStyle w:val="Hyperlink"/>
-          </w:rPr>
-          <w:t xml:space="preserve">Search relevance panel, Finding out what’s best</w:t>
-        </w:r>
-      </w:hyperlink>
-    </w:p>
-    <w:p>
-      <w:pPr>
-        <w:numPr>
-          <w:ilvl w:val="0"/>
-          <w:numId w:val="1007"/>
-        </w:numPr>
-        <w:pStyle w:val="Compact"/>
-      </w:pPr>
-      <w:r>
-        <w:rPr>
-          <w:bCs/>
-          <w:b/>
-        </w:rPr>
-        <w:t xml:space="preserve">Live coding and community:</w:t>
-      </w:r>
-      <w:r>
-        <w:t xml:space="preserve"> </w:t>
-      </w:r>
-      <w:hyperlink r:id="rId44">
-        <w:r>
-          <w:rPr>
-            <w:rStyle w:val="Hyperlink"/>
-          </w:rPr>
-          <w:t xml:space="preserve">Adding search insights to InstantSearch applications</w:t>
-        </w:r>
-      </w:hyperlink>
-      <w:r>
-        <w:t xml:space="preserve"> </w:t>
-      </w:r>
-      <w:r>
-        <w:t xml:space="preserve">(2,000+ views) ·</w:t>
-      </w:r>
-      <w:r>
-        <w:t xml:space="preserve"> </w:t>
-      </w:r>
-      <w:hyperlink r:id="rId45">
-        <w:r>
-          <w:rPr>
-            <w:rStyle w:val="Hyperlink"/>
-          </w:rPr>
-          <w:t xml:space="preserve">Fireside chat, Algolia-Hyvä integration on Magento 2</w:t>
-        </w:r>
-      </w:hyperlink>
-      <w:r>
-        <w:t xml:space="preserve"> </w:t>
-      </w:r>
-      <w:r>
-        <w:t xml:space="preserve">·</w:t>
-      </w:r>
-      <w:r>
-        <w:t xml:space="preserve"> </w:t>
-      </w:r>
-      <w:hyperlink r:id="rId46">
-        <w:r>
-          <w:rPr>
-            <w:rStyle w:val="Hyperlink"/>
-          </w:rPr>
-          <w:t xml:space="preserve">The WebDev Challenge, Future of AI-native UX</w:t>
-        </w:r>
-      </w:hyperlink>
-    </w:p>
-    <w:bookmarkEnd w:id="47"/>
-    <w:bookmarkStart w:id="48" w:name="education"/>
-    <w:p>
-      <w:pPr>
-        <w:pStyle w:val="Heading2"/>
-      </w:pPr>
-      <w:r>
-        <w:t xml:space="preserve">EDUCATION</w:t>
-      </w:r>
-    </w:p>
-    <w:p>
-      <w:pPr>
-        <w:pStyle w:val="FirstParagraph"/>
-      </w:pPr>
-      <w:r>
-        <w:rPr>
-          <w:bCs/>
-          <w:b/>
-        </w:rPr>
         <w:t xml:space="preserve">Bachelor of Science</w:t>
       </w:r>
       <w:r>
-        <w:t xml:space="preserve">, Mathematics and Computer Science</w:t>
+        <w:t xml:space="preserve">, Mathematics and Computer Science (Cum Laude)</w:t>
       </w:r>
       <w:r>
         <w:br/>

</xml_diff>

<commit_message>
Rewrite summary around gap-closing tooling and add cfn-lint and TCG metrics
New summary built on the find-the-gap, build-the-tool point of view. Add cfn-lint PyPI downloads, the 733 cards claimed at TCG Search events, and hackathon sponsorship; drop the avsearch demo bullet; call the Bold Penguin portal a partner integration portal.

Co-Authored-By: Claude Sonnet 5.5 <noreply@anthropic.com>
</commit_message>
<xml_diff>
--- a/output/chuck_meyer_resume.docx
+++ b/output/chuck_meyer_resume.docx
@@ -71,7 +71,7 @@
         <w:pStyle w:val="FirstParagraph"/>
       </w:pPr>
       <w:r>
-        <w:t xml:space="preserve">Developer Relations leader who builds and scales developer communities for API-first platforms: a 2,000+ member Discord, a zero-downtime docs migration, and five years hosting Algolia DevCon. Currently focused on developer experience for AI agents, building conversational search with MCP and tool-calling agents and writing about agent-ready developer tooling. Deep security background from advising CISOs on cloud infrastructure and compliance.</w:t>
+        <w:t xml:space="preserve">Developer Relations leader for small, embedded teams. At each company I look for the biggest gap between the product and the developers using it, then build what closes it: cfn-lint, a CloudFormation linter now downloaded 11M+ times a month; a partner integration portal; and, at Algolia, tooling and docs that work for agents as well as people. Then I work alongside the community, through live coding, hackathons and demos, to show it works.</w:t>
       </w:r>
     </w:p>
     <w:bookmarkEnd w:id="22"/>
@@ -379,7 +379,7 @@
         </w:r>
       </w:hyperlink>
       <w:r>
-        <w:t xml:space="preserve">, and deployed it at eight conferences in six months, including Microsoft Build, Gartner, Adobe Summit, Shoptalk and eTail, each in a week or less</w:t>
+        <w:t xml:space="preserve">, and deployed it at eight conferences in six months, including Microsoft Build, Gartner, Adobe Summit, Shoptalk and eTail, each in a week or less, engaging booth visitors with 733 trading cards claimed</w:t>
       </w:r>
     </w:p>
     <w:p>
@@ -433,7 +433,7 @@
         <w:pStyle w:val="Compact"/>
       </w:pPr>
       <w:r>
-        <w:t xml:space="preserve">Host live coding sessions with partners, cross-pollinating user communities, and built demo applications such as a video transcription search (avsearch)</w:t>
+        <w:t xml:space="preserve">Host live coding sessions with partners, and sponsored and judged hackathons alongside dev.to, Code &amp; Coffee and Hackernoon</w:t>
       </w:r>
     </w:p>
     <w:p>
@@ -611,7 +611,7 @@
         </w:r>
       </w:hyperlink>
       <w:r>
-        <w:t xml:space="preserve">, the open source CloudFormation template linter (2,600+ GitHub stars), including commissioning its logo and launch stickers</w:t>
+        <w:t xml:space="preserve">, the open source CloudFormation template linter (2,600+ GitHub stars, 11M+ monthly PyPI downloads today), including commissioning its logo and launch stickers</w:t>
       </w:r>
     </w:p>
     <w:p>

</xml_diff>

<commit_message>
Restructure Algolia experience around gap-closing work
Cut from eleven bullets to six, describe the CLI post accurately as the agent-readiness write-up, and drop the editor/coach and Aspiring Managers bullets.

Co-Authored-By: Claude Sonnet 5.5 <noreply@anthropic.com>
</commit_message>
<xml_diff>
--- a/output/chuck_meyer_resume.docx
+++ b/output/chuck_meyer_resume.docx
@@ -2,7 +2,7 @@
 <file path=word/document.xml><?xml version="1.0" encoding="utf-8"?>
 <w:document xmlns:w="http://schemas.openxmlformats.org/wordprocessingml/2006/main" xmlns:m="http://schemas.openxmlformats.org/officeDocument/2006/math" xmlns:r="http://schemas.openxmlformats.org/officeDocument/2006/relationships" xmlns:o="urn:schemas-microsoft-com:office:office" xmlns:v="urn:schemas-microsoft-com:vml" xmlns:w10="urn:schemas-microsoft-com:office:word" xmlns:a="http://schemas.openxmlformats.org/drawingml/2006/main" xmlns:pic="http://schemas.openxmlformats.org/drawingml/2006/picture" xmlns:wp="http://schemas.openxmlformats.org/drawingml/2006/wordprocessingDrawing">
   <w:body>
-    <w:bookmarkStart w:id="49" w:name="charles-chuck-meyer"/>
+    <w:bookmarkStart w:id="48" w:name="charles-chuck-meyer"/>
     <w:p>
       <w:pPr>
         <w:pStyle w:val="Heading1"/>
@@ -245,7 +245,7 @@
       </w:r>
     </w:p>
     <w:bookmarkEnd w:id="23"/>
-    <w:bookmarkStart w:id="26" w:name="experience"/>
+    <w:bookmarkStart w:id="25" w:name="experience"/>
     <w:p>
       <w:pPr>
         <w:pStyle w:val="Heading2"/>
@@ -317,7 +317,7 @@
         <w:pStyle w:val="Compact"/>
       </w:pPr>
       <w:r>
-        <w:t xml:space="preserve">Lead the docs and developer advocacy teams (up to five direct reports: advocates, technical writers, developer marketers) for Algolia’s API-first search platform</w:t>
+        <w:t xml:space="preserve">Lead the docs and developer advocacy teams (up to five direct reports) for Algolia’s API-first search platform</w:t>
       </w:r>
     </w:p>
     <w:p>
@@ -329,7 +329,7 @@
         <w:pStyle w:val="Compact"/>
       </w:pPr>
       <w:r>
-        <w:t xml:space="preserve">Led the Algolia documentation migration from a homegrown platform to Mintlify with zero downtime</w:t>
+        <w:t xml:space="preserve">Led the documentation migration from a homegrown platform to Mintlify with zero downtime, then made the docs readable by agents with llms.txt and Algolia’s library on Context7</w:t>
       </w:r>
     </w:p>
     <w:p>
@@ -341,7 +341,7 @@
         <w:pStyle w:val="Compact"/>
       </w:pPr>
       <w:r>
-        <w:t xml:space="preserve">Launched the Algolia Discord from 0 to 2,000+ active developers in one year</w:t>
+        <w:t xml:space="preserve">Wrote the engineering post showing the rebuilt Algolia CLI is agent-ready, mapping its schema introspection, structured output, dry-run validation and scoped auth to published agent-first CLI design principles (a top-five Algolia engineering blog post for February to August 2026)</w:t>
       </w:r>
     </w:p>
     <w:p>
@@ -353,7 +353,7 @@
         <w:pStyle w:val="Compact"/>
       </w:pPr>
       <w:r>
-        <w:t xml:space="preserve">Host Algolia DevCon, the annual developer conference, for five consecutive years (2026 edition on October 1), plus quarterly developer livestreams with 200-500 concurrent attendees</w:t>
+        <w:t xml:space="preserve">Built TCG Search, a reusable agentic demo platform, and stood it up at eight conferences, including Microsoft Build, Gartner and Adobe Summit, each in a week or less, with 733 trading cards claimed by booth visitors</w:t>
       </w:r>
     </w:p>
     <w:p>
@@ -365,21 +365,7 @@
         <w:pStyle w:val="Compact"/>
       </w:pPr>
       <w:r>
-        <w:t xml:space="preserve">Built a reusable agentic demo platform,</w:t>
-      </w:r>
-      <w:r>
-        <w:t xml:space="preserve"> </w:t>
-      </w:r>
-      <w:hyperlink r:id="rId24">
-        <w:r>
-          <w:rPr>
-            <w:rStyle w:val="Hyperlink"/>
-          </w:rPr>
-          <w:t xml:space="preserve">TCG Search</w:t>
-        </w:r>
-      </w:hyperlink>
-      <w:r>
-        <w:t xml:space="preserve">, and deployed it at eight conferences in six months, including Microsoft Build, Gartner, Adobe Summit, Shoptalk and eTail, each in a week or less, engaging booth visitors with 733 trading cards claimed</w:t>
+        <w:t xml:space="preserve">Launched the Algolia Discord from 0 to 2,000+ developers in a year; host Algolia DevCon, the annual developer conference, for five years, plus quarterly livestreams of 200-500 attendees</w:t>
       </w:r>
     </w:p>
     <w:p>
@@ -391,97 +377,7 @@
         <w:pStyle w:val="Compact"/>
       </w:pPr>
       <w:r>
-        <w:t xml:space="preserve">Published agent-focused engineering content:</w:t>
-      </w:r>
-      <w:r>
-        <w:t xml:space="preserve"> </w:t>
-      </w:r>
-      <w:r>
-        <w:t xml:space="preserve">“</w:t>
-      </w:r>
-      <w:r>
-        <w:t xml:space="preserve">We rewrote the Algolia CLI for AI agents</w:t>
-      </w:r>
-      <w:r>
-        <w:t xml:space="preserve">”</w:t>
-      </w:r>
-      <w:r>
-        <w:t xml:space="preserve"> </w:t>
-      </w:r>
-      <w:r>
-        <w:t xml:space="preserve">(a top-five Algolia engineering blog post for February to August 2026) and</w:t>
-      </w:r>
-      <w:r>
-        <w:t xml:space="preserve"> </w:t>
-      </w:r>
-      <w:r>
-        <w:t xml:space="preserve">“</w:t>
-      </w:r>
-      <w:r>
-        <w:t xml:space="preserve">Chat, meet the Searchbox</w:t>
-      </w:r>
-      <w:r>
-        <w:t xml:space="preserve">”</w:t>
-      </w:r>
-    </w:p>
-    <w:p>
-      <w:pPr>
-        <w:numPr>
-          <w:ilvl w:val="0"/>
-          <w:numId w:val="1001"/>
-        </w:numPr>
-        <w:pStyle w:val="Compact"/>
-      </w:pPr>
-      <w:r>
-        <w:t xml:space="preserve">Host live coding sessions with partners, and sponsored and judged hackathons alongside dev.to, Code &amp; Coffee and Hackernoon</w:t>
-      </w:r>
-    </w:p>
-    <w:p>
-      <w:pPr>
-        <w:numPr>
-          <w:ilvl w:val="0"/>
-          <w:numId w:val="1001"/>
-        </w:numPr>
-        <w:pStyle w:val="Compact"/>
-      </w:pPr>
-      <w:r>
-        <w:t xml:space="preserve">Produced the Quick Start video embedded in the getting-started docs (more first-month views than any Algolia engineering blog post that half)</w:t>
-      </w:r>
-    </w:p>
-    <w:p>
-      <w:pPr>
-        <w:numPr>
-          <w:ilvl w:val="0"/>
-          <w:numId w:val="1001"/>
-        </w:numPr>
-        <w:pStyle w:val="Compact"/>
-      </w:pPr>
-      <w:r>
-        <w:t xml:space="preserve">Claimed Algolia’s library on Context7 and moved llms.txt to its canonical location so AI tools can read the docs</w:t>
-      </w:r>
-    </w:p>
-    <w:p>
-      <w:pPr>
-        <w:numPr>
-          <w:ilvl w:val="0"/>
-          <w:numId w:val="1001"/>
-        </w:numPr>
-        <w:pStyle w:val="Compact"/>
-      </w:pPr>
-      <w:r>
-        <w:t xml:space="preserve">Editor and coach for internal and external technical content, giving pre-publication feedback on blogs, tutorials and speaker sessions</w:t>
-      </w:r>
-    </w:p>
-    <w:p>
-      <w:pPr>
-        <w:numPr>
-          <w:ilvl w:val="0"/>
-          <w:numId w:val="1001"/>
-        </w:numPr>
-        <w:pStyle w:val="Compact"/>
-      </w:pPr>
-      <w:r>
-        <w:t xml:space="preserve">Spoke to Algolia’s Aspiring Managers Program on moving from IC to manager</w:t>
+        <w:t xml:space="preserve">Run live coding sessions, hackathons (with dev.to, Code &amp; Coffee and Hackernoon) and the Quick Start video embedded in the getting-started docs</w:t>
       </w:r>
     </w:p>
     <w:p>
@@ -602,7 +498,7 @@
       <w:r>
         <w:t xml:space="preserve"> </w:t>
       </w:r>
-      <w:hyperlink r:id="rId25">
+      <w:hyperlink r:id="rId24">
         <w:r>
           <w:rPr>
             <w:rStyle w:val="Hyperlink"/>
@@ -742,8 +638,8 @@
         <w:t xml:space="preserve">Built PCI-compliant infrastructure with Elastic Beanstalk, Packer, Puppet and CloudFormation, and a CI/CD pipeline for IAM governance with CodePipeline, Ansible and CloudFormation</w:t>
       </w:r>
     </w:p>
-    <w:bookmarkEnd w:id="26"/>
-    <w:bookmarkStart w:id="31" w:name="selected-projects"/>
+    <w:bookmarkEnd w:id="25"/>
+    <w:bookmarkStart w:id="30" w:name="selected-projects"/>
     <w:p>
       <w:pPr>
         <w:pStyle w:val="Heading2"/>
@@ -760,7 +656,7 @@
         </w:numPr>
         <w:pStyle w:val="Compact"/>
       </w:pPr>
-      <w:hyperlink r:id="rId27">
+      <w:hyperlink r:id="rId26">
         <w:r>
           <w:rPr>
             <w:rStyle w:val="Hyperlink"/>
@@ -782,7 +678,7 @@
         </w:numPr>
         <w:pStyle w:val="Compact"/>
       </w:pPr>
-      <w:hyperlink r:id="rId28">
+      <w:hyperlink r:id="rId27">
         <w:r>
           <w:rPr>
             <w:rStyle w:val="Hyperlink"/>
@@ -804,7 +700,7 @@
         </w:numPr>
         <w:pStyle w:val="Compact"/>
       </w:pPr>
-      <w:hyperlink r:id="rId29">
+      <w:hyperlink r:id="rId28">
         <w:r>
           <w:rPr>
             <w:rStyle w:val="Hyperlink"/>
@@ -826,7 +722,7 @@
         </w:numPr>
         <w:pStyle w:val="Compact"/>
       </w:pPr>
-      <w:hyperlink r:id="rId30">
+      <w:hyperlink r:id="rId29">
         <w:r>
           <w:rPr>
             <w:rStyle w:val="Hyperlink"/>
@@ -840,8 +736,8 @@
         <w:t xml:space="preserve">: minimal MCP server over Streamable HTTP, with a companion tutorial</w:t>
       </w:r>
     </w:p>
-    <w:bookmarkEnd w:id="31"/>
-    <w:bookmarkStart w:id="47" w:name="writing-and-speaking"/>
+    <w:bookmarkEnd w:id="30"/>
+    <w:bookmarkStart w:id="46" w:name="writing-and-speaking"/>
     <w:p>
       <w:pPr>
         <w:pStyle w:val="Heading2"/>
@@ -868,12 +764,29 @@
       <w:r>
         <w:t xml:space="preserve"> </w:t>
       </w:r>
+      <w:hyperlink r:id="rId31">
+        <w:r>
+          <w:rPr>
+            <w:rStyle w:val="Hyperlink"/>
+          </w:rPr>
+          <w:t xml:space="preserve">We rewrote the Algolia CLI for AI agents</w:t>
+        </w:r>
+      </w:hyperlink>
+      <w:r>
+        <w:t xml:space="preserve"> </w:t>
+      </w:r>
+      <w:r>
+        <w:t xml:space="preserve">(2026),</w:t>
+      </w:r>
+      <w:r>
+        <w:t xml:space="preserve"> </w:t>
+      </w:r>
       <w:hyperlink r:id="rId32">
         <w:r>
           <w:rPr>
             <w:rStyle w:val="Hyperlink"/>
           </w:rPr>
-          <w:t xml:space="preserve">We rewrote the Algolia CLI for AI agents</w:t>
+          <w:t xml:space="preserve">Chat, meet the Searchbox</w:t>
         </w:r>
       </w:hyperlink>
       <w:r>
@@ -890,7 +803,7 @@
           <w:rPr>
             <w:rStyle w:val="Hyperlink"/>
           </w:rPr>
-          <w:t xml:space="preserve">Chat, meet the Searchbox</w:t>
+          <w:t xml:space="preserve">The Agent Factory</w:t>
         </w:r>
       </w:hyperlink>
       <w:r>
@@ -907,14 +820,50 @@
           <w:rPr>
             <w:rStyle w:val="Hyperlink"/>
           </w:rPr>
-          <w:t xml:space="preserve">The Agent Factory</w:t>
+          <w:t xml:space="preserve">Building a JavaScript</w:t>
+        </w:r>
+        <w:r>
+          <w:rPr>
+            <w:rStyle w:val="Hyperlink"/>
+          </w:rPr>
+          <w:t xml:space="preserve"> </w:t>
+        </w:r>
+        <w:r>
+          <w:rPr>
+            <w:rStyle w:val="Hyperlink"/>
+          </w:rPr>
+          <w:t xml:space="preserve">“</w:t>
+        </w:r>
+        <w:r>
+          <w:rPr>
+            <w:rStyle w:val="Hyperlink"/>
+          </w:rPr>
+          <w:t xml:space="preserve">Hello, World</w:t>
+        </w:r>
+        <w:r>
+          <w:rPr>
+            <w:rStyle w:val="Hyperlink"/>
+          </w:rPr>
+          <w:t xml:space="preserve">”</w:t>
+        </w:r>
+        <w:r>
+          <w:rPr>
+            <w:rStyle w:val="Hyperlink"/>
+          </w:rPr>
+          <w:t xml:space="preserve"> </w:t>
+        </w:r>
+        <w:r>
+          <w:rPr>
+            <w:rStyle w:val="Hyperlink"/>
+          </w:rPr>
+          <w:t xml:space="preserve">MCP server</w:t>
         </w:r>
       </w:hyperlink>
       <w:r>
         <w:t xml:space="preserve"> </w:t>
       </w:r>
       <w:r>
-        <w:t xml:space="preserve">(2026),</w:t>
+        <w:t xml:space="preserve">(my best-performing dev.to post since 2022),</w:t>
       </w:r>
       <w:r>
         <w:t xml:space="preserve"> </w:t>
@@ -924,50 +873,11 @@
           <w:rPr>
             <w:rStyle w:val="Hyperlink"/>
           </w:rPr>
-          <w:t xml:space="preserve">Building a JavaScript</w:t>
-        </w:r>
-        <w:r>
-          <w:rPr>
-            <w:rStyle w:val="Hyperlink"/>
-          </w:rPr>
-          <w:t xml:space="preserve"> </w:t>
-        </w:r>
-        <w:r>
-          <w:rPr>
-            <w:rStyle w:val="Hyperlink"/>
-          </w:rPr>
-          <w:t xml:space="preserve">“</w:t>
-        </w:r>
-        <w:r>
-          <w:rPr>
-            <w:rStyle w:val="Hyperlink"/>
-          </w:rPr>
-          <w:t xml:space="preserve">Hello, World</w:t>
-        </w:r>
-        <w:r>
-          <w:rPr>
-            <w:rStyle w:val="Hyperlink"/>
-          </w:rPr>
-          <w:t xml:space="preserve">”</w:t>
-        </w:r>
-        <w:r>
-          <w:rPr>
-            <w:rStyle w:val="Hyperlink"/>
-          </w:rPr>
-          <w:t xml:space="preserve"> </w:t>
-        </w:r>
-        <w:r>
-          <w:rPr>
-            <w:rStyle w:val="Hyperlink"/>
-          </w:rPr>
-          <w:t xml:space="preserve">MCP server</w:t>
+          <w:t xml:space="preserve">Customizing Algolia React components with Tailwind classes</w:t>
         </w:r>
       </w:hyperlink>
       <w:r>
-        <w:t xml:space="preserve"> </w:t>
-      </w:r>
-      <w:r>
-        <w:t xml:space="preserve">(my best-performing dev.to post since 2022),</w:t>
+        <w:t xml:space="preserve">,</w:t>
       </w:r>
       <w:r>
         <w:t xml:space="preserve"> </w:t>
@@ -977,7 +887,7 @@
           <w:rPr>
             <w:rStyle w:val="Hyperlink"/>
           </w:rPr>
-          <w:t xml:space="preserve">Customizing Algolia React components with Tailwind classes</w:t>
+          <w:t xml:space="preserve">Feature Spotlight: Trends Models in Recommend</w:t>
         </w:r>
       </w:hyperlink>
       <w:r>
@@ -991,33 +901,19 @@
           <w:rPr>
             <w:rStyle w:val="Hyperlink"/>
           </w:rPr>
-          <w:t xml:space="preserve">Feature Spotlight: Trends Models in Recommend</w:t>
+          <w:t xml:space="preserve">Git pre-commit validation of CloudFormation templates</w:t>
         </w:r>
       </w:hyperlink>
       <w:r>
-        <w:t xml:space="preserve">,</w:t>
+        <w:t xml:space="preserve"> </w:t>
+      </w:r>
+      <w:r>
+        <w:t xml:space="preserve">(AWS). More at</w:t>
       </w:r>
       <w:r>
         <w:t xml:space="preserve"> </w:t>
       </w:r>
       <w:hyperlink r:id="rId38">
-        <w:r>
-          <w:rPr>
-            <w:rStyle w:val="Hyperlink"/>
-          </w:rPr>
-          <w:t xml:space="preserve">Git pre-commit validation of CloudFormation templates</w:t>
-        </w:r>
-      </w:hyperlink>
-      <w:r>
-        <w:t xml:space="preserve"> </w:t>
-      </w:r>
-      <w:r>
-        <w:t xml:space="preserve">(AWS). More at</w:t>
-      </w:r>
-      <w:r>
-        <w:t xml:space="preserve"> </w:t>
-      </w:r>
-      <w:hyperlink r:id="rId39">
         <w:r>
           <w:rPr>
             <w:rStyle w:val="Hyperlink"/>
@@ -1044,12 +940,29 @@
       <w:r>
         <w:t xml:space="preserve"> </w:t>
       </w:r>
+      <w:hyperlink r:id="rId39">
+        <w:r>
+          <w:rPr>
+            <w:rStyle w:val="Hyperlink"/>
+          </w:rPr>
+          <w:t xml:space="preserve">DevRelCon 2026, Blog While the Context is Fresh</w:t>
+        </w:r>
+      </w:hyperlink>
+      <w:r>
+        <w:t xml:space="preserve"> </w:t>
+      </w:r>
+      <w:r>
+        <w:t xml:space="preserve">·</w:t>
+      </w:r>
+      <w:r>
+        <w:t xml:space="preserve"> </w:t>
+      </w:r>
       <w:hyperlink r:id="rId40">
         <w:r>
           <w:rPr>
             <w:rStyle w:val="Hyperlink"/>
           </w:rPr>
-          <w:t xml:space="preserve">DevRelCon 2026, Blog While the Context is Fresh</w:t>
+          <w:t xml:space="preserve">Haystack US 2025 lightning talk, Agentic query understanding using search MCPs</w:t>
         </w:r>
       </w:hyperlink>
       <w:r>
@@ -1066,36 +979,19 @@
           <w:rPr>
             <w:rStyle w:val="Hyperlink"/>
           </w:rPr>
-          <w:t xml:space="preserve">Haystack US 2025 lightning talk, Agentic query understanding using search MCPs</w:t>
+          <w:t xml:space="preserve">AWS re:Invent 2018, Deployment Scenarios with AWS CloudFormation</w:t>
         </w:r>
       </w:hyperlink>
       <w:r>
         <w:t xml:space="preserve"> </w:t>
       </w:r>
       <w:r>
-        <w:t xml:space="preserve">·</w:t>
+        <w:t xml:space="preserve">(11,000+ views) ·</w:t>
       </w:r>
       <w:r>
         <w:t xml:space="preserve"> </w:t>
       </w:r>
       <w:hyperlink r:id="rId42">
-        <w:r>
-          <w:rPr>
-            <w:rStyle w:val="Hyperlink"/>
-          </w:rPr>
-          <w:t xml:space="preserve">AWS re:Invent 2018, Deployment Scenarios with AWS CloudFormation</w:t>
-        </w:r>
-      </w:hyperlink>
-      <w:r>
-        <w:t xml:space="preserve"> </w:t>
-      </w:r>
-      <w:r>
-        <w:t xml:space="preserve">(11,000+ views) ·</w:t>
-      </w:r>
-      <w:r>
-        <w:t xml:space="preserve"> </w:t>
-      </w:r>
-      <w:hyperlink r:id="rId43">
         <w:r>
           <w:rPr>
             <w:rStyle w:val="Hyperlink"/>
@@ -1122,19 +1018,36 @@
       <w:r>
         <w:t xml:space="preserve"> </w:t>
       </w:r>
+      <w:hyperlink r:id="rId43">
+        <w:r>
+          <w:rPr>
+            <w:rStyle w:val="Hyperlink"/>
+          </w:rPr>
+          <w:t xml:space="preserve">Adding search insights to InstantSearch applications</w:t>
+        </w:r>
+      </w:hyperlink>
+      <w:r>
+        <w:t xml:space="preserve"> </w:t>
+      </w:r>
+      <w:r>
+        <w:t xml:space="preserve">(2,000+ views) ·</w:t>
+      </w:r>
+      <w:r>
+        <w:t xml:space="preserve"> </w:t>
+      </w:r>
       <w:hyperlink r:id="rId44">
         <w:r>
           <w:rPr>
             <w:rStyle w:val="Hyperlink"/>
           </w:rPr>
-          <w:t xml:space="preserve">Adding search insights to InstantSearch applications</w:t>
+          <w:t xml:space="preserve">Fireside chat, Algolia-Hyvä integration on Magento 2</w:t>
         </w:r>
       </w:hyperlink>
       <w:r>
         <w:t xml:space="preserve"> </w:t>
       </w:r>
       <w:r>
-        <w:t xml:space="preserve">(2,000+ views) ·</w:t>
+        <w:t xml:space="preserve">·</w:t>
       </w:r>
       <w:r>
         <w:t xml:space="preserve"> </w:t>
@@ -1144,29 +1057,12 @@
           <w:rPr>
             <w:rStyle w:val="Hyperlink"/>
           </w:rPr>
-          <w:t xml:space="preserve">Fireside chat, Algolia-Hyvä integration on Magento 2</w:t>
+          <w:t xml:space="preserve">The WebDev Challenge, Future of AI-native UX</w:t>
         </w:r>
       </w:hyperlink>
-      <w:r>
-        <w:t xml:space="preserve"> </w:t>
-      </w:r>
-      <w:r>
-        <w:t xml:space="preserve">·</w:t>
-      </w:r>
-      <w:r>
-        <w:t xml:space="preserve"> </w:t>
-      </w:r>
-      <w:hyperlink r:id="rId46">
-        <w:r>
-          <w:rPr>
-            <w:rStyle w:val="Hyperlink"/>
-          </w:rPr>
-          <w:t xml:space="preserve">The WebDev Challenge, Future of AI-native UX</w:t>
-        </w:r>
-      </w:hyperlink>
-    </w:p>
-    <w:bookmarkEnd w:id="47"/>
-    <w:bookmarkStart w:id="48" w:name="education"/>
+    </w:p>
+    <w:bookmarkEnd w:id="46"/>
+    <w:bookmarkStart w:id="47" w:name="education"/>
     <w:p>
       <w:pPr>
         <w:pStyle w:val="Heading2"/>
@@ -1209,8 +1105,8 @@
         <w:t xml:space="preserve">Northern Kentucky University | 1997</w:t>
       </w:r>
     </w:p>
+    <w:bookmarkEnd w:id="47"/>
     <w:bookmarkEnd w:id="48"/>
-    <w:bookmarkEnd w:id="49"/>
     <w:sectPr/>
   </w:body>
 </w:document>

</xml_diff>

<commit_message>
Trim writing and speaking and explain the TCG Search retrieval story
Co-Authored-By: Claude Sonnet 5.5 <noreply@anthropic.com>
</commit_message>
<xml_diff>
--- a/output/chuck_meyer_resume.docx
+++ b/output/chuck_meyer_resume.docx
@@ -2,7 +2,7 @@
 <file path=word/document.xml><?xml version="1.0" encoding="utf-8"?>
 <w:document xmlns:w="http://schemas.openxmlformats.org/wordprocessingml/2006/main" xmlns:m="http://schemas.openxmlformats.org/officeDocument/2006/math" xmlns:r="http://schemas.openxmlformats.org/officeDocument/2006/relationships" xmlns:o="urn:schemas-microsoft-com:office:office" xmlns:v="urn:schemas-microsoft-com:vml" xmlns:w10="urn:schemas-microsoft-com:office:word" xmlns:a="http://schemas.openxmlformats.org/drawingml/2006/main" xmlns:pic="http://schemas.openxmlformats.org/drawingml/2006/picture" xmlns:wp="http://schemas.openxmlformats.org/drawingml/2006/wordprocessingDrawing">
   <w:body>
-    <w:bookmarkStart w:id="48" w:name="charles-chuck-meyer"/>
+    <w:bookmarkStart w:id="45" w:name="charles-chuck-meyer"/>
     <w:p>
       <w:pPr>
         <w:pStyle w:val="Heading1"/>
@@ -245,7 +245,7 @@
       </w:r>
     </w:p>
     <w:bookmarkEnd w:id="23"/>
-    <w:bookmarkStart w:id="25" w:name="experience"/>
+    <w:bookmarkStart w:id="26" w:name="experience"/>
     <w:p>
       <w:pPr>
         <w:pStyle w:val="Heading2"/>
@@ -353,7 +353,21 @@
         <w:pStyle w:val="Compact"/>
       </w:pPr>
       <w:r>
-        <w:t xml:space="preserve">Built TCG Search, a reusable agentic demo platform, and stood it up at eight conferences, including Microsoft Build, Gartner and Adobe Summit, each in a week or less, with 733 trading cards claimed by booth visitors</w:t>
+        <w:t xml:space="preserve">Built</w:t>
+      </w:r>
+      <w:r>
+        <w:t xml:space="preserve"> </w:t>
+      </w:r>
+      <w:hyperlink r:id="rId24">
+        <w:r>
+          <w:rPr>
+            <w:rStyle w:val="Hyperlink"/>
+          </w:rPr>
+          <w:t xml:space="preserve">TCG Search</w:t>
+        </w:r>
+      </w:hyperlink>
+      <w:r>
+        <w:t xml:space="preserve">, a reusable demo where a multi-modal agent answers from the same Algolia retrieval layer as site search, showing why embedded agents need fast retrieval; deployed at eight conferences (Microsoft Build, Gartner, Adobe Summit and more), each in a week or less, with 733 cards claimed</w:t>
       </w:r>
     </w:p>
     <w:p>
@@ -498,7 +512,7 @@
       <w:r>
         <w:t xml:space="preserve"> </w:t>
       </w:r>
-      <w:hyperlink r:id="rId24">
+      <w:hyperlink r:id="rId25">
         <w:r>
           <w:rPr>
             <w:rStyle w:val="Hyperlink"/>
@@ -638,8 +652,8 @@
         <w:t xml:space="preserve">Built PCI-compliant infrastructure with Elastic Beanstalk, Packer, Puppet and CloudFormation, and a CI/CD pipeline for IAM governance with CodePipeline, Ansible and CloudFormation</w:t>
       </w:r>
     </w:p>
-    <w:bookmarkEnd w:id="25"/>
-    <w:bookmarkStart w:id="30" w:name="selected-projects"/>
+    <w:bookmarkEnd w:id="26"/>
+    <w:bookmarkStart w:id="31" w:name="selected-projects"/>
     <w:p>
       <w:pPr>
         <w:pStyle w:val="Heading2"/>
@@ -656,7 +670,7 @@
         </w:numPr>
         <w:pStyle w:val="Compact"/>
       </w:pPr>
-      <w:hyperlink r:id="rId26">
+      <w:hyperlink r:id="rId27">
         <w:r>
           <w:rPr>
             <w:rStyle w:val="Hyperlink"/>
@@ -667,7 +681,7 @@
         </w:r>
       </w:hyperlink>
       <w:r>
-        <w:t xml:space="preserve">: conference-booth demo with React/InstantSearch, an Algolia Agent Studio chat agent with evals, a card scanner, and serverless APIs on Vercel and Supabase</w:t>
+        <w:t xml:space="preserve">: conference-booth demo of a multi-modal chat agent grounded in the same index that powers search, built with React/InstantSearch, Agent Studio with evals, a card scanner, and serverless APIs on Vercel and Supabase</w:t>
       </w:r>
     </w:p>
     <w:p>
@@ -678,7 +692,7 @@
         </w:numPr>
         <w:pStyle w:val="Compact"/>
       </w:pPr>
-      <w:hyperlink r:id="rId27">
+      <w:hyperlink r:id="rId28">
         <w:r>
           <w:rPr>
             <w:rStyle w:val="Hyperlink"/>
@@ -700,7 +714,7 @@
         </w:numPr>
         <w:pStyle w:val="Compact"/>
       </w:pPr>
-      <w:hyperlink r:id="rId28">
+      <w:hyperlink r:id="rId29">
         <w:r>
           <w:rPr>
             <w:rStyle w:val="Hyperlink"/>
@@ -722,7 +736,7 @@
         </w:numPr>
         <w:pStyle w:val="Compact"/>
       </w:pPr>
-      <w:hyperlink r:id="rId29">
+      <w:hyperlink r:id="rId30">
         <w:r>
           <w:rPr>
             <w:rStyle w:val="Hyperlink"/>
@@ -736,8 +750,8 @@
         <w:t xml:space="preserve">: minimal MCP server over Streamable HTTP, with a companion tutorial</w:t>
       </w:r>
     </w:p>
-    <w:bookmarkEnd w:id="30"/>
-    <w:bookmarkStart w:id="46" w:name="writing-and-speaking"/>
+    <w:bookmarkEnd w:id="31"/>
+    <w:bookmarkStart w:id="43" w:name="writing-and-speaking"/>
     <w:p>
       <w:pPr>
         <w:pStyle w:val="Heading2"/>
@@ -764,7 +778,7 @@
       <w:r>
         <w:t xml:space="preserve"> </w:t>
       </w:r>
-      <w:hyperlink r:id="rId31">
+      <w:hyperlink r:id="rId32">
         <w:r>
           <w:rPr>
             <w:rStyle w:val="Hyperlink"/>
@@ -773,15 +787,12 @@
         </w:r>
       </w:hyperlink>
       <w:r>
-        <w:t xml:space="preserve"> </w:t>
-      </w:r>
-      <w:r>
-        <w:t xml:space="preserve">(2026),</w:t>
-      </w:r>
-      <w:r>
-        <w:t xml:space="preserve"> </w:t>
-      </w:r>
-      <w:hyperlink r:id="rId32">
+        <w:t xml:space="preserve">,</w:t>
+      </w:r>
+      <w:r>
+        <w:t xml:space="preserve"> </w:t>
+      </w:r>
+      <w:hyperlink r:id="rId33">
         <w:r>
           <w:rPr>
             <w:rStyle w:val="Hyperlink"/>
@@ -790,15 +801,12 @@
         </w:r>
       </w:hyperlink>
       <w:r>
-        <w:t xml:space="preserve"> </w:t>
-      </w:r>
-      <w:r>
-        <w:t xml:space="preserve">(2026),</w:t>
-      </w:r>
-      <w:r>
-        <w:t xml:space="preserve"> </w:t>
-      </w:r>
-      <w:hyperlink r:id="rId33">
+        <w:t xml:space="preserve">,</w:t>
+      </w:r>
+      <w:r>
+        <w:t xml:space="preserve"> </w:t>
+      </w:r>
+      <w:hyperlink r:id="rId34">
         <w:r>
           <w:rPr>
             <w:rStyle w:val="Hyperlink"/>
@@ -807,15 +815,12 @@
         </w:r>
       </w:hyperlink>
       <w:r>
-        <w:t xml:space="preserve"> </w:t>
-      </w:r>
-      <w:r>
-        <w:t xml:space="preserve">(2026),</w:t>
-      </w:r>
-      <w:r>
-        <w:t xml:space="preserve"> </w:t>
-      </w:r>
-      <w:hyperlink r:id="rId34">
+        <w:t xml:space="preserve">,</w:t>
+      </w:r>
+      <w:r>
+        <w:t xml:space="preserve"> </w:t>
+      </w:r>
+      <w:hyperlink r:id="rId35">
         <w:r>
           <w:rPr>
             <w:rStyle w:val="Hyperlink"/>
@@ -868,52 +873,21 @@
       <w:r>
         <w:t xml:space="preserve"> </w:t>
       </w:r>
-      <w:hyperlink r:id="rId35">
-        <w:r>
-          <w:rPr>
-            <w:rStyle w:val="Hyperlink"/>
-          </w:rPr>
-          <w:t xml:space="preserve">Customizing Algolia React components with Tailwind classes</w:t>
+      <w:hyperlink r:id="rId36">
+        <w:r>
+          <w:rPr>
+            <w:rStyle w:val="Hyperlink"/>
+          </w:rPr>
+          <w:t xml:space="preserve">Git pre-commit validation of CloudFormation templates</w:t>
         </w:r>
       </w:hyperlink>
       <w:r>
-        <w:t xml:space="preserve">,</w:t>
-      </w:r>
-      <w:r>
-        <w:t xml:space="preserve"> </w:t>
-      </w:r>
-      <w:hyperlink r:id="rId36">
-        <w:r>
-          <w:rPr>
-            <w:rStyle w:val="Hyperlink"/>
-          </w:rPr>
-          <w:t xml:space="preserve">Feature Spotlight: Trends Models in Recommend</w:t>
-        </w:r>
-      </w:hyperlink>
-      <w:r>
-        <w:t xml:space="preserve">,</w:t>
+        <w:t xml:space="preserve">. More at</w:t>
       </w:r>
       <w:r>
         <w:t xml:space="preserve"> </w:t>
       </w:r>
       <w:hyperlink r:id="rId37">
-        <w:r>
-          <w:rPr>
-            <w:rStyle w:val="Hyperlink"/>
-          </w:rPr>
-          <w:t xml:space="preserve">Git pre-commit validation of CloudFormation templates</w:t>
-        </w:r>
-      </w:hyperlink>
-      <w:r>
-        <w:t xml:space="preserve"> </w:t>
-      </w:r>
-      <w:r>
-        <w:t xml:space="preserve">(AWS). More at</w:t>
-      </w:r>
-      <w:r>
-        <w:t xml:space="preserve"> </w:t>
-      </w:r>
-      <w:hyperlink r:id="rId38">
         <w:r>
           <w:rPr>
             <w:rStyle w:val="Hyperlink"/>
@@ -940,12 +914,29 @@
       <w:r>
         <w:t xml:space="preserve"> </w:t>
       </w:r>
+      <w:hyperlink r:id="rId38">
+        <w:r>
+          <w:rPr>
+            <w:rStyle w:val="Hyperlink"/>
+          </w:rPr>
+          <w:t xml:space="preserve">DevRelCon 2026, Blog While the Context is Fresh</w:t>
+        </w:r>
+      </w:hyperlink>
+      <w:r>
+        <w:t xml:space="preserve"> </w:t>
+      </w:r>
+      <w:r>
+        <w:t xml:space="preserve">·</w:t>
+      </w:r>
+      <w:r>
+        <w:t xml:space="preserve"> </w:t>
+      </w:r>
       <w:hyperlink r:id="rId39">
         <w:r>
           <w:rPr>
             <w:rStyle w:val="Hyperlink"/>
           </w:rPr>
-          <w:t xml:space="preserve">DevRelCon 2026, Blog While the Context is Fresh</w:t>
+          <w:t xml:space="preserve">Haystack US 2025, Agentic query understanding using search MCPs</w:t>
         </w:r>
       </w:hyperlink>
       <w:r>
@@ -962,43 +953,15 @@
           <w:rPr>
             <w:rStyle w:val="Hyperlink"/>
           </w:rPr>
-          <w:t xml:space="preserve">Haystack US 2025 lightning talk, Agentic query understanding using search MCPs</w:t>
+          <w:t xml:space="preserve">AWS re:Invent 2018, Deployment Scenarios with AWS CloudFormation</w:t>
         </w:r>
       </w:hyperlink>
       <w:r>
         <w:t xml:space="preserve"> </w:t>
       </w:r>
       <w:r>
-        <w:t xml:space="preserve">·</w:t>
-      </w:r>
-      <w:r>
-        <w:t xml:space="preserve"> </w:t>
-      </w:r>
-      <w:hyperlink r:id="rId41">
-        <w:r>
-          <w:rPr>
-            <w:rStyle w:val="Hyperlink"/>
-          </w:rPr>
-          <w:t xml:space="preserve">AWS re:Invent 2018, Deployment Scenarios with AWS CloudFormation</w:t>
-        </w:r>
-      </w:hyperlink>
-      <w:r>
-        <w:t xml:space="preserve"> </w:t>
-      </w:r>
-      <w:r>
-        <w:t xml:space="preserve">(11,000+ views) ·</w:t>
-      </w:r>
-      <w:r>
-        <w:t xml:space="preserve"> </w:t>
-      </w:r>
-      <w:hyperlink r:id="rId42">
-        <w:r>
-          <w:rPr>
-            <w:rStyle w:val="Hyperlink"/>
-          </w:rPr>
-          <w:t xml:space="preserve">Search relevance panel, Finding out what’s best</w:t>
-        </w:r>
-      </w:hyperlink>
+        <w:t xml:space="preserve">(11,000+ views)</w:t>
+      </w:r>
     </w:p>
     <w:p>
       <w:pPr>
@@ -1013,12 +976,12 @@
           <w:bCs/>
           <w:b/>
         </w:rPr>
-        <w:t xml:space="preserve">Live coding and community:</w:t>
-      </w:r>
-      <w:r>
-        <w:t xml:space="preserve"> </w:t>
-      </w:r>
-      <w:hyperlink r:id="rId43">
+        <w:t xml:space="preserve">Live coding:</w:t>
+      </w:r>
+      <w:r>
+        <w:t xml:space="preserve"> </w:t>
+      </w:r>
+      <w:hyperlink r:id="rId41">
         <w:r>
           <w:rPr>
             <w:rStyle w:val="Hyperlink"/>
@@ -1035,34 +998,17 @@
       <w:r>
         <w:t xml:space="preserve"> </w:t>
       </w:r>
-      <w:hyperlink r:id="rId44">
-        <w:r>
-          <w:rPr>
-            <w:rStyle w:val="Hyperlink"/>
-          </w:rPr>
-          <w:t xml:space="preserve">Fireside chat, Algolia-Hyvä integration on Magento 2</w:t>
+      <w:hyperlink r:id="rId42">
+        <w:r>
+          <w:rPr>
+            <w:rStyle w:val="Hyperlink"/>
+          </w:rPr>
+          <w:t xml:space="preserve">The WebDev Challenge, Future of AI-native UX</w:t>
         </w:r>
       </w:hyperlink>
-      <w:r>
-        <w:t xml:space="preserve"> </w:t>
-      </w:r>
-      <w:r>
-        <w:t xml:space="preserve">·</w:t>
-      </w:r>
-      <w:r>
-        <w:t xml:space="preserve"> </w:t>
-      </w:r>
-      <w:hyperlink r:id="rId45">
-        <w:r>
-          <w:rPr>
-            <w:rStyle w:val="Hyperlink"/>
-          </w:rPr>
-          <w:t xml:space="preserve">The WebDev Challenge, Future of AI-native UX</w:t>
-        </w:r>
-      </w:hyperlink>
-    </w:p>
-    <w:bookmarkEnd w:id="46"/>
-    <w:bookmarkStart w:id="47" w:name="education"/>
+    </w:p>
+    <w:bookmarkEnd w:id="43"/>
+    <w:bookmarkStart w:id="44" w:name="education"/>
     <w:p>
       <w:pPr>
         <w:pStyle w:val="Heading2"/>
@@ -1105,8 +1051,8 @@
         <w:t xml:space="preserve">Northern Kentucky University | 1997</w:t>
       </w:r>
     </w:p>
-    <w:bookmarkEnd w:id="47"/>
-    <w:bookmarkEnd w:id="48"/>
+    <w:bookmarkEnd w:id="44"/>
+    <w:bookmarkEnd w:id="45"/>
     <w:sectPr/>
   </w:body>
 </w:document>

</xml_diff>

<commit_message>
Put each writing and speaking item on its own line
Co-Authored-By: Claude Sonnet 5.5 <noreply@anthropic.com>
</commit_message>
<xml_diff>
--- a/output/chuck_meyer_resume.docx
+++ b/output/chuck_meyer_resume.docx
@@ -762,22 +762,24 @@
     </w:p>
     <w:p>
       <w:pPr>
-        <w:numPr>
-          <w:ilvl w:val="0"/>
-          <w:numId w:val="1007"/>
-        </w:numPr>
-        <w:pStyle w:val="Compact"/>
+        <w:pStyle w:val="FirstParagraph"/>
       </w:pPr>
       <w:r>
         <w:rPr>
           <w:bCs/>
           <w:b/>
         </w:rPr>
-        <w:t xml:space="preserve">Writing:</w:t>
-      </w:r>
-      <w:r>
-        <w:t xml:space="preserve"> </w:t>
-      </w:r>
+        <w:t xml:space="preserve">Writing</w:t>
+      </w:r>
+    </w:p>
+    <w:p>
+      <w:pPr>
+        <w:numPr>
+          <w:ilvl w:val="0"/>
+          <w:numId w:val="1007"/>
+        </w:numPr>
+        <w:pStyle w:val="Compact"/>
+      </w:pPr>
       <w:hyperlink r:id="rId32">
         <w:r>
           <w:rPr>
@@ -786,12 +788,15 @@
           <w:t xml:space="preserve">We rewrote the Algolia CLI for AI agents</w:t>
         </w:r>
       </w:hyperlink>
-      <w:r>
-        <w:t xml:space="preserve">,</w:t>
-      </w:r>
-      <w:r>
-        <w:t xml:space="preserve"> </w:t>
-      </w:r>
+    </w:p>
+    <w:p>
+      <w:pPr>
+        <w:numPr>
+          <w:ilvl w:val="0"/>
+          <w:numId w:val="1007"/>
+        </w:numPr>
+        <w:pStyle w:val="Compact"/>
+      </w:pPr>
       <w:hyperlink r:id="rId33">
         <w:r>
           <w:rPr>
@@ -800,12 +805,15 @@
           <w:t xml:space="preserve">Chat, meet the Searchbox</w:t>
         </w:r>
       </w:hyperlink>
-      <w:r>
-        <w:t xml:space="preserve">,</w:t>
-      </w:r>
-      <w:r>
-        <w:t xml:space="preserve"> </w:t>
-      </w:r>
+    </w:p>
+    <w:p>
+      <w:pPr>
+        <w:numPr>
+          <w:ilvl w:val="0"/>
+          <w:numId w:val="1007"/>
+        </w:numPr>
+        <w:pStyle w:val="Compact"/>
+      </w:pPr>
       <w:hyperlink r:id="rId34">
         <w:r>
           <w:rPr>
@@ -814,12 +822,15 @@
           <w:t xml:space="preserve">The Agent Factory</w:t>
         </w:r>
       </w:hyperlink>
-      <w:r>
-        <w:t xml:space="preserve">,</w:t>
-      </w:r>
-      <w:r>
-        <w:t xml:space="preserve"> </w:t>
-      </w:r>
+    </w:p>
+    <w:p>
+      <w:pPr>
+        <w:numPr>
+          <w:ilvl w:val="0"/>
+          <w:numId w:val="1007"/>
+        </w:numPr>
+        <w:pStyle w:val="Compact"/>
+      </w:pPr>
       <w:hyperlink r:id="rId35">
         <w:r>
           <w:rPr>
@@ -868,11 +879,17 @@
         <w:t xml:space="preserve"> </w:t>
       </w:r>
       <w:r>
-        <w:t xml:space="preserve">(my best-performing dev.to post since 2022),</w:t>
-      </w:r>
-      <w:r>
-        <w:t xml:space="preserve"> </w:t>
-      </w:r>
+        <w:t xml:space="preserve">(my best-performing dev.to post since 2022)</w:t>
+      </w:r>
+    </w:p>
+    <w:p>
+      <w:pPr>
+        <w:numPr>
+          <w:ilvl w:val="0"/>
+          <w:numId w:val="1007"/>
+        </w:numPr>
+        <w:pStyle w:val="Compact"/>
+      </w:pPr>
       <w:hyperlink r:id="rId36">
         <w:r>
           <w:rPr>
@@ -882,7 +899,10 @@
         </w:r>
       </w:hyperlink>
       <w:r>
-        <w:t xml:space="preserve">. More at</w:t>
+        <w:t xml:space="preserve"> </w:t>
+      </w:r>
+      <w:r>
+        <w:t xml:space="preserve">(AWS). More at</w:t>
       </w:r>
       <w:r>
         <w:t xml:space="preserve"> </w:t>
@@ -898,22 +918,24 @@
     </w:p>
     <w:p>
       <w:pPr>
-        <w:numPr>
-          <w:ilvl w:val="0"/>
-          <w:numId w:val="1007"/>
-        </w:numPr>
-        <w:pStyle w:val="Compact"/>
+        <w:pStyle w:val="FirstParagraph"/>
       </w:pPr>
       <w:r>
         <w:rPr>
           <w:bCs/>
           <w:b/>
         </w:rPr>
-        <w:t xml:space="preserve">Talks:</w:t>
-      </w:r>
-      <w:r>
-        <w:t xml:space="preserve"> </w:t>
-      </w:r>
+        <w:t xml:space="preserve">Speaking</w:t>
+      </w:r>
+    </w:p>
+    <w:p>
+      <w:pPr>
+        <w:numPr>
+          <w:ilvl w:val="0"/>
+          <w:numId w:val="1008"/>
+        </w:numPr>
+        <w:pStyle w:val="Compact"/>
+      </w:pPr>
       <w:hyperlink r:id="rId38">
         <w:r>
           <w:rPr>
@@ -922,15 +944,15 @@
           <w:t xml:space="preserve">DevRelCon 2026, Blog While the Context is Fresh</w:t>
         </w:r>
       </w:hyperlink>
-      <w:r>
-        <w:t xml:space="preserve"> </w:t>
-      </w:r>
-      <w:r>
-        <w:t xml:space="preserve">·</w:t>
-      </w:r>
-      <w:r>
-        <w:t xml:space="preserve"> </w:t>
-      </w:r>
+    </w:p>
+    <w:p>
+      <w:pPr>
+        <w:numPr>
+          <w:ilvl w:val="0"/>
+          <w:numId w:val="1008"/>
+        </w:numPr>
+        <w:pStyle w:val="Compact"/>
+      </w:pPr>
       <w:hyperlink r:id="rId39">
         <w:r>
           <w:rPr>
@@ -939,15 +961,15 @@
           <w:t xml:space="preserve">Haystack US 2025, Agentic query understanding using search MCPs</w:t>
         </w:r>
       </w:hyperlink>
-      <w:r>
-        <w:t xml:space="preserve"> </w:t>
-      </w:r>
-      <w:r>
-        <w:t xml:space="preserve">·</w:t>
-      </w:r>
-      <w:r>
-        <w:t xml:space="preserve"> </w:t>
-      </w:r>
+    </w:p>
+    <w:p>
+      <w:pPr>
+        <w:numPr>
+          <w:ilvl w:val="0"/>
+          <w:numId w:val="1008"/>
+        </w:numPr>
+        <w:pStyle w:val="Compact"/>
+      </w:pPr>
       <w:hyperlink r:id="rId40">
         <w:r>
           <w:rPr>
@@ -967,37 +989,33 @@
       <w:pPr>
         <w:numPr>
           <w:ilvl w:val="0"/>
-          <w:numId w:val="1007"/>
-        </w:numPr>
-        <w:pStyle w:val="Compact"/>
-      </w:pPr>
-      <w:r>
-        <w:rPr>
-          <w:bCs/>
-          <w:b/>
-        </w:rPr>
-        <w:t xml:space="preserve">Live coding:</w:t>
-      </w:r>
-      <w:r>
-        <w:t xml:space="preserve"> </w:t>
-      </w:r>
+          <w:numId w:val="1008"/>
+        </w:numPr>
+        <w:pStyle w:val="Compact"/>
+      </w:pPr>
       <w:hyperlink r:id="rId41">
         <w:r>
           <w:rPr>
             <w:rStyle w:val="Hyperlink"/>
           </w:rPr>
-          <w:t xml:space="preserve">Adding search insights to InstantSearch applications</w:t>
+          <w:t xml:space="preserve">Live coding: Adding search insights to InstantSearch applications</w:t>
         </w:r>
       </w:hyperlink>
       <w:r>
         <w:t xml:space="preserve"> </w:t>
       </w:r>
       <w:r>
-        <w:t xml:space="preserve">(2,000+ views) ·</w:t>
-      </w:r>
-      <w:r>
-        <w:t xml:space="preserve"> </w:t>
-      </w:r>
+        <w:t xml:space="preserve">(2,000+ views)</w:t>
+      </w:r>
+    </w:p>
+    <w:p>
+      <w:pPr>
+        <w:numPr>
+          <w:ilvl w:val="0"/>
+          <w:numId w:val="1008"/>
+        </w:numPr>
+        <w:pStyle w:val="Compact"/>
+      </w:pPr>
       <w:hyperlink r:id="rId42">
         <w:r>
           <w:rPr>
@@ -1257,6 +1275,9 @@
     <w:abstractNumId w:val="991"/>
   </w:num>
   <w:num w:numId="1007">
+    <w:abstractNumId w:val="991"/>
+  </w:num>
+  <w:num w:numId="1008">
     <w:abstractNumId w:val="991"/>
   </w:num>
 </w:numbering>

</xml_diff>

<commit_message>
Drop The Agent Factory from writing
Co-Authored-By: Claude Sonnet 5.5 <noreply@anthropic.com>
</commit_message>
<xml_diff>
--- a/output/chuck_meyer_resume.docx
+++ b/output/chuck_meyer_resume.docx
@@ -2,7 +2,7 @@
 <file path=word/document.xml><?xml version="1.0" encoding="utf-8"?>
 <w:document xmlns:w="http://schemas.openxmlformats.org/wordprocessingml/2006/main" xmlns:m="http://schemas.openxmlformats.org/officeDocument/2006/math" xmlns:r="http://schemas.openxmlformats.org/officeDocument/2006/relationships" xmlns:o="urn:schemas-microsoft-com:office:office" xmlns:v="urn:schemas-microsoft-com:vml" xmlns:w10="urn:schemas-microsoft-com:office:word" xmlns:a="http://schemas.openxmlformats.org/drawingml/2006/main" xmlns:pic="http://schemas.openxmlformats.org/drawingml/2006/picture" xmlns:wp="http://schemas.openxmlformats.org/drawingml/2006/wordprocessingDrawing">
   <w:body>
-    <w:bookmarkStart w:id="45" w:name="charles-chuck-meyer"/>
+    <w:bookmarkStart w:id="44" w:name="charles-chuck-meyer"/>
     <w:p>
       <w:pPr>
         <w:pStyle w:val="Heading1"/>
@@ -751,7 +751,7 @@
       </w:r>
     </w:p>
     <w:bookmarkEnd w:id="31"/>
-    <w:bookmarkStart w:id="43" w:name="writing-and-speaking"/>
+    <w:bookmarkStart w:id="42" w:name="writing-and-speaking"/>
     <w:p>
       <w:pPr>
         <w:pStyle w:val="Heading2"/>
@@ -819,9 +819,51 @@
           <w:rPr>
             <w:rStyle w:val="Hyperlink"/>
           </w:rPr>
-          <w:t xml:space="preserve">The Agent Factory</w:t>
+          <w:t xml:space="preserve">Building a JavaScript</w:t>
+        </w:r>
+        <w:r>
+          <w:rPr>
+            <w:rStyle w:val="Hyperlink"/>
+          </w:rPr>
+          <w:t xml:space="preserve"> </w:t>
+        </w:r>
+        <w:r>
+          <w:rPr>
+            <w:rStyle w:val="Hyperlink"/>
+          </w:rPr>
+          <w:t xml:space="preserve">“</w:t>
+        </w:r>
+        <w:r>
+          <w:rPr>
+            <w:rStyle w:val="Hyperlink"/>
+          </w:rPr>
+          <w:t xml:space="preserve">Hello, World</w:t>
+        </w:r>
+        <w:r>
+          <w:rPr>
+            <w:rStyle w:val="Hyperlink"/>
+          </w:rPr>
+          <w:t xml:space="preserve">”</w:t>
+        </w:r>
+        <w:r>
+          <w:rPr>
+            <w:rStyle w:val="Hyperlink"/>
+          </w:rPr>
+          <w:t xml:space="preserve"> </w:t>
+        </w:r>
+        <w:r>
+          <w:rPr>
+            <w:rStyle w:val="Hyperlink"/>
+          </w:rPr>
+          <w:t xml:space="preserve">MCP server</w:t>
         </w:r>
       </w:hyperlink>
+      <w:r>
+        <w:t xml:space="preserve"> </w:t>
+      </w:r>
+      <w:r>
+        <w:t xml:space="preserve">(my best-performing dev.to post since 2022)</w:t>
+      </w:r>
     </w:p>
     <w:p>
       <w:pPr>
@@ -836,78 +878,19 @@
           <w:rPr>
             <w:rStyle w:val="Hyperlink"/>
           </w:rPr>
-          <w:t xml:space="preserve">Building a JavaScript</w:t>
-        </w:r>
-        <w:r>
-          <w:rPr>
-            <w:rStyle w:val="Hyperlink"/>
-          </w:rPr>
-          <w:t xml:space="preserve"> </w:t>
-        </w:r>
-        <w:r>
-          <w:rPr>
-            <w:rStyle w:val="Hyperlink"/>
-          </w:rPr>
-          <w:t xml:space="preserve">“</w:t>
-        </w:r>
-        <w:r>
-          <w:rPr>
-            <w:rStyle w:val="Hyperlink"/>
-          </w:rPr>
-          <w:t xml:space="preserve">Hello, World</w:t>
-        </w:r>
-        <w:r>
-          <w:rPr>
-            <w:rStyle w:val="Hyperlink"/>
-          </w:rPr>
-          <w:t xml:space="preserve">”</w:t>
-        </w:r>
-        <w:r>
-          <w:rPr>
-            <w:rStyle w:val="Hyperlink"/>
-          </w:rPr>
-          <w:t xml:space="preserve"> </w:t>
-        </w:r>
-        <w:r>
-          <w:rPr>
-            <w:rStyle w:val="Hyperlink"/>
-          </w:rPr>
-          <w:t xml:space="preserve">MCP server</w:t>
+          <w:t xml:space="preserve">Git pre-commit validation of CloudFormation templates</w:t>
         </w:r>
       </w:hyperlink>
       <w:r>
         <w:t xml:space="preserve"> </w:t>
       </w:r>
       <w:r>
-        <w:t xml:space="preserve">(my best-performing dev.to post since 2022)</w:t>
-      </w:r>
-    </w:p>
-    <w:p>
-      <w:pPr>
-        <w:numPr>
-          <w:ilvl w:val="0"/>
-          <w:numId w:val="1007"/>
-        </w:numPr>
-        <w:pStyle w:val="Compact"/>
-      </w:pPr>
+        <w:t xml:space="preserve">(AWS). More at</w:t>
+      </w:r>
+      <w:r>
+        <w:t xml:space="preserve"> </w:t>
+      </w:r>
       <w:hyperlink r:id="rId36">
-        <w:r>
-          <w:rPr>
-            <w:rStyle w:val="Hyperlink"/>
-          </w:rPr>
-          <w:t xml:space="preserve">Git pre-commit validation of CloudFormation templates</w:t>
-        </w:r>
-      </w:hyperlink>
-      <w:r>
-        <w:t xml:space="preserve"> </w:t>
-      </w:r>
-      <w:r>
-        <w:t xml:space="preserve">(AWS). More at</w:t>
-      </w:r>
-      <w:r>
-        <w:t xml:space="preserve"> </w:t>
-      </w:r>
-      <w:hyperlink r:id="rId37">
         <w:r>
           <w:rPr>
             <w:rStyle w:val="Hyperlink"/>
@@ -936,12 +919,29 @@
         </w:numPr>
         <w:pStyle w:val="Compact"/>
       </w:pPr>
+      <w:hyperlink r:id="rId37">
+        <w:r>
+          <w:rPr>
+            <w:rStyle w:val="Hyperlink"/>
+          </w:rPr>
+          <w:t xml:space="preserve">DevRelCon 2026, Blog While the Context is Fresh</w:t>
+        </w:r>
+      </w:hyperlink>
+    </w:p>
+    <w:p>
+      <w:pPr>
+        <w:numPr>
+          <w:ilvl w:val="0"/>
+          <w:numId w:val="1008"/>
+        </w:numPr>
+        <w:pStyle w:val="Compact"/>
+      </w:pPr>
       <w:hyperlink r:id="rId38">
         <w:r>
           <w:rPr>
             <w:rStyle w:val="Hyperlink"/>
           </w:rPr>
-          <w:t xml:space="preserve">DevRelCon 2026, Blog While the Context is Fresh</w:t>
+          <w:t xml:space="preserve">Haystack US 2025, Agentic query understanding using search MCPs</w:t>
         </w:r>
       </w:hyperlink>
     </w:p>
@@ -958,9 +958,15 @@
           <w:rPr>
             <w:rStyle w:val="Hyperlink"/>
           </w:rPr>
-          <w:t xml:space="preserve">Haystack US 2025, Agentic query understanding using search MCPs</w:t>
+          <w:t xml:space="preserve">AWS re:Invent 2018, Deployment Scenarios with AWS CloudFormation</w:t>
         </w:r>
       </w:hyperlink>
+      <w:r>
+        <w:t xml:space="preserve"> </w:t>
+      </w:r>
+      <w:r>
+        <w:t xml:space="preserve">(11,000+ views)</w:t>
+      </w:r>
     </w:p>
     <w:p>
       <w:pPr>
@@ -975,14 +981,14 @@
           <w:rPr>
             <w:rStyle w:val="Hyperlink"/>
           </w:rPr>
-          <w:t xml:space="preserve">AWS re:Invent 2018, Deployment Scenarios with AWS CloudFormation</w:t>
+          <w:t xml:space="preserve">Live coding: Adding search insights to InstantSearch applications</w:t>
         </w:r>
       </w:hyperlink>
       <w:r>
         <w:t xml:space="preserve"> </w:t>
       </w:r>
       <w:r>
-        <w:t xml:space="preserve">(11,000+ views)</w:t>
+        <w:t xml:space="preserve">(2,000+ views)</w:t>
       </w:r>
     </w:p>
     <w:p>
@@ -998,35 +1004,12 @@
           <w:rPr>
             <w:rStyle w:val="Hyperlink"/>
           </w:rPr>
-          <w:t xml:space="preserve">Live coding: Adding search insights to InstantSearch applications</w:t>
+          <w:t xml:space="preserve">The WebDev Challenge, Future of AI-native UX</w:t>
         </w:r>
       </w:hyperlink>
-      <w:r>
-        <w:t xml:space="preserve"> </w:t>
-      </w:r>
-      <w:r>
-        <w:t xml:space="preserve">(2,000+ views)</w:t>
-      </w:r>
-    </w:p>
-    <w:p>
-      <w:pPr>
-        <w:numPr>
-          <w:ilvl w:val="0"/>
-          <w:numId w:val="1008"/>
-        </w:numPr>
-        <w:pStyle w:val="Compact"/>
-      </w:pPr>
-      <w:hyperlink r:id="rId42">
-        <w:r>
-          <w:rPr>
-            <w:rStyle w:val="Hyperlink"/>
-          </w:rPr>
-          <w:t xml:space="preserve">The WebDev Challenge, Future of AI-native UX</w:t>
-        </w:r>
-      </w:hyperlink>
-    </w:p>
-    <w:bookmarkEnd w:id="43"/>
-    <w:bookmarkStart w:id="44" w:name="education"/>
+    </w:p>
+    <w:bookmarkEnd w:id="42"/>
+    <w:bookmarkStart w:id="43" w:name="education"/>
     <w:p>
       <w:pPr>
         <w:pStyle w:val="Heading2"/>
@@ -1069,8 +1052,8 @@
         <w:t xml:space="preserve">Northern Kentucky University | 1997</w:t>
       </w:r>
     </w:p>
+    <w:bookmarkEnd w:id="43"/>
     <w:bookmarkEnd w:id="44"/>
-    <w:bookmarkEnd w:id="45"/>
     <w:sectPr/>
   </w:body>
 </w:document>

</xml_diff>

<commit_message>
Boast the Agent Studio CLI, tighten Algolia bullets, trim AWS roles
Add the Agent Studio CLI to the Algolia role, shorten the CLI post and TCG bullets, merge older AWS bullets, and drop Security & Compliance from competencies.

Co-Authored-By: Claude Sonnet 5.5 <noreply@anthropic.com>
</commit_message>
<xml_diff>
--- a/output/chuck_meyer_resume.docx
+++ b/output/chuck_meyer_resume.docx
@@ -227,43 +227,53 @@
         </w:rPr>
         <w:t xml:space="preserve">AWS</w:t>
       </w:r>
-      <w:r>
-        <w:t xml:space="preserve"> </w:t>
-      </w:r>
-      <w:r>
-        <w:t xml:space="preserve">·</w:t>
-      </w:r>
-      <w:r>
-        <w:t xml:space="preserve"> </w:t>
-      </w:r>
+    </w:p>
+    <w:bookmarkEnd w:id="23"/>
+    <w:bookmarkStart w:id="27" w:name="experience"/>
+    <w:p>
+      <w:pPr>
+        <w:pStyle w:val="Heading2"/>
+      </w:pPr>
+      <w:r>
+        <w:t xml:space="preserve">EXPERIENCE</w:t>
+      </w:r>
+    </w:p>
+    <w:p>
+      <w:pPr>
+        <w:pStyle w:val="FirstParagraph"/>
+      </w:pPr>
       <w:r>
         <w:rPr>
           <w:bCs/>
           <w:b/>
         </w:rPr>
-        <w:t xml:space="preserve">Security &amp; Compliance</w:t>
-      </w:r>
-    </w:p>
-    <w:bookmarkEnd w:id="23"/>
-    <w:bookmarkStart w:id="26" w:name="experience"/>
-    <w:p>
-      <w:pPr>
-        <w:pStyle w:val="Heading2"/>
-      </w:pPr>
-      <w:r>
-        <w:t xml:space="preserve">EXPERIENCE</w:t>
-      </w:r>
-    </w:p>
-    <w:p>
-      <w:pPr>
-        <w:pStyle w:val="FirstParagraph"/>
-      </w:pPr>
+        <w:t xml:space="preserve">Senior Manager, Developer Relations</w:t>
+      </w:r>
+      <w:r>
+        <w:t xml:space="preserve"> </w:t>
+      </w:r>
+      <w:r>
+        <w:t xml:space="preserve">| Algolia |</w:t>
+      </w:r>
+      <w:r>
+        <w:t xml:space="preserve"> </w:t>
+      </w:r>
+      <w:r>
+        <w:rPr>
+          <w:iCs/>
+          <w:i/>
+        </w:rPr>
+        <w:t xml:space="preserve">August 2025 to present</w:t>
+      </w:r>
+      <w:r>
+        <w:br/>
+      </w:r>
       <w:r>
         <w:rPr>
           <w:bCs/>
           <w:b/>
         </w:rPr>
-        <w:t xml:space="preserve">Senior Manager, Developer Relations</w:t>
+        <w:t xml:space="preserve">Lead Developer Advocate</w:t>
       </w:r>
       <w:r>
         <w:t xml:space="preserve"> </w:t>
@@ -279,23 +289,137 @@
           <w:iCs/>
           <w:i/>
         </w:rPr>
-        <w:t xml:space="preserve">August 2025 to present</w:t>
-      </w:r>
-      <w:r>
-        <w:br/>
-      </w:r>
+        <w:t xml:space="preserve">August 2021 to August 2025</w:t>
+      </w:r>
+    </w:p>
+    <w:p>
+      <w:pPr>
+        <w:numPr>
+          <w:ilvl w:val="0"/>
+          <w:numId w:val="1001"/>
+        </w:numPr>
+        <w:pStyle w:val="Compact"/>
+      </w:pPr>
+      <w:r>
+        <w:t xml:space="preserve">Lead the docs and developer advocacy teams (up to five direct reports) for Algolia’s API-first search platform</w:t>
+      </w:r>
+    </w:p>
+    <w:p>
+      <w:pPr>
+        <w:numPr>
+          <w:ilvl w:val="0"/>
+          <w:numId w:val="1001"/>
+        </w:numPr>
+        <w:pStyle w:val="Compact"/>
+      </w:pPr>
+      <w:r>
+        <w:t xml:space="preserve">Led the documentation migration from a homegrown platform to Mintlify with zero downtime, then made the docs readable by agents with llms.txt and Algolia’s library on Context7</w:t>
+      </w:r>
+    </w:p>
+    <w:p>
+      <w:pPr>
+        <w:numPr>
+          <w:ilvl w:val="0"/>
+          <w:numId w:val="1001"/>
+        </w:numPr>
+        <w:pStyle w:val="Compact"/>
+      </w:pPr>
+      <w:r>
+        <w:t xml:space="preserve">Wrote the engineering post mapping the rebuilt Algolia CLI’s agent-ready features (schema introspection, structured output, dry-run, scoped auth) to agent-first design principles, a top-five Algolia engineering post for February to August 2026</w:t>
+      </w:r>
+    </w:p>
+    <w:p>
+      <w:pPr>
+        <w:numPr>
+          <w:ilvl w:val="0"/>
+          <w:numId w:val="1001"/>
+        </w:numPr>
+        <w:pStyle w:val="Compact"/>
+      </w:pPr>
+      <w:r>
+        <w:t xml:space="preserve">Built the</w:t>
+      </w:r>
+      <w:r>
+        <w:t xml:space="preserve"> </w:t>
+      </w:r>
+      <w:hyperlink r:id="rId24">
+        <w:r>
+          <w:rPr>
+            <w:rStyle w:val="Hyperlink"/>
+          </w:rPr>
+          <w:t xml:space="preserve">Agent Studio CLI</w:t>
+        </w:r>
+      </w:hyperlink>
+      <w:r>
+        <w:t xml:space="preserve">, a tool for creating, snapshotting, updating and publishing Algolia agents from version-controlled config, from idea to working tool in a week</w:t>
+      </w:r>
+    </w:p>
+    <w:p>
+      <w:pPr>
+        <w:numPr>
+          <w:ilvl w:val="0"/>
+          <w:numId w:val="1001"/>
+        </w:numPr>
+        <w:pStyle w:val="Compact"/>
+      </w:pPr>
+      <w:r>
+        <w:t xml:space="preserve">Built</w:t>
+      </w:r>
+      <w:r>
+        <w:t xml:space="preserve"> </w:t>
+      </w:r>
+      <w:hyperlink r:id="rId25">
+        <w:r>
+          <w:rPr>
+            <w:rStyle w:val="Hyperlink"/>
+          </w:rPr>
+          <w:t xml:space="preserve">TCG Search</w:t>
+        </w:r>
+      </w:hyperlink>
+      <w:r>
+        <w:t xml:space="preserve">, a reusable booth demo where a multi-modal agent answers from the same Algolia index as site search, showing why embedded agents need fast retrieval; deployed at eight conferences, including Microsoft Build, Gartner and Adobe Summit, each in a week or less, with 733 cards claimed</w:t>
+      </w:r>
+    </w:p>
+    <w:p>
+      <w:pPr>
+        <w:numPr>
+          <w:ilvl w:val="0"/>
+          <w:numId w:val="1001"/>
+        </w:numPr>
+        <w:pStyle w:val="Compact"/>
+      </w:pPr>
+      <w:r>
+        <w:t xml:space="preserve">Launched the Algolia Discord from 0 to 2,000+ developers in a year; host Algolia DevCon, the annual developer conference, for five years, plus quarterly livestreams of 200-500 attendees</w:t>
+      </w:r>
+    </w:p>
+    <w:p>
+      <w:pPr>
+        <w:numPr>
+          <w:ilvl w:val="0"/>
+          <w:numId w:val="1001"/>
+        </w:numPr>
+        <w:pStyle w:val="Compact"/>
+      </w:pPr>
+      <w:r>
+        <w:t xml:space="preserve">Run live coding sessions, hackathons (with dev.to, Code &amp; Coffee and Hackernoon) and the Quick Start video embedded in the getting-started docs</w:t>
+      </w:r>
+    </w:p>
+    <w:p>
+      <w:pPr>
+        <w:pStyle w:val="FirstParagraph"/>
+      </w:pPr>
       <w:r>
         <w:rPr>
           <w:bCs/>
           <w:b/>
         </w:rPr>
-        <w:t xml:space="preserve">Lead Developer Advocate</w:t>
-      </w:r>
-      <w:r>
-        <w:t xml:space="preserve"> </w:t>
-      </w:r>
-      <w:r>
-        <w:t xml:space="preserve">| Algolia |</w:t>
+        <w:t xml:space="preserve">Senior Engineer, Developer Relations and Integrations</w:t>
+      </w:r>
+      <w:r>
+        <w:t xml:space="preserve"> </w:t>
+      </w:r>
+      <w:r>
+        <w:t xml:space="preserve">| Bold Penguin |</w:t>
       </w:r>
       <w:r>
         <w:t xml:space="preserve"> </w:t>
@@ -305,93 +429,43 @@
           <w:iCs/>
           <w:i/>
         </w:rPr>
-        <w:t xml:space="preserve">August 2021 to August 2025</w:t>
-      </w:r>
-    </w:p>
-    <w:p>
-      <w:pPr>
-        <w:numPr>
-          <w:ilvl w:val="0"/>
-          <w:numId w:val="1001"/>
-        </w:numPr>
-        <w:pStyle w:val="Compact"/>
-      </w:pPr>
-      <w:r>
-        <w:t xml:space="preserve">Lead the docs and developer advocacy teams (up to five direct reports) for Algolia’s API-first search platform</w:t>
-      </w:r>
-    </w:p>
-    <w:p>
-      <w:pPr>
-        <w:numPr>
-          <w:ilvl w:val="0"/>
-          <w:numId w:val="1001"/>
-        </w:numPr>
-        <w:pStyle w:val="Compact"/>
-      </w:pPr>
-      <w:r>
-        <w:t xml:space="preserve">Led the documentation migration from a homegrown platform to Mintlify with zero downtime, then made the docs readable by agents with llms.txt and Algolia’s library on Context7</w:t>
-      </w:r>
-    </w:p>
-    <w:p>
-      <w:pPr>
-        <w:numPr>
-          <w:ilvl w:val="0"/>
-          <w:numId w:val="1001"/>
-        </w:numPr>
-        <w:pStyle w:val="Compact"/>
-      </w:pPr>
-      <w:r>
-        <w:t xml:space="preserve">Wrote the engineering post showing the rebuilt Algolia CLI is agent-ready, mapping its schema introspection, structured output, dry-run validation and scoped auth to published agent-first CLI design principles (a top-five Algolia engineering blog post for February to August 2026)</w:t>
-      </w:r>
-    </w:p>
-    <w:p>
-      <w:pPr>
-        <w:numPr>
-          <w:ilvl w:val="0"/>
-          <w:numId w:val="1001"/>
-        </w:numPr>
-        <w:pStyle w:val="Compact"/>
-      </w:pPr>
-      <w:r>
-        <w:t xml:space="preserve">Built</w:t>
-      </w:r>
-      <w:r>
-        <w:t xml:space="preserve"> </w:t>
-      </w:r>
-      <w:hyperlink r:id="rId24">
-        <w:r>
-          <w:rPr>
-            <w:rStyle w:val="Hyperlink"/>
-          </w:rPr>
-          <w:t xml:space="preserve">TCG Search</w:t>
-        </w:r>
-      </w:hyperlink>
-      <w:r>
-        <w:t xml:space="preserve">, a reusable demo where a multi-modal agent answers from the same Algolia retrieval layer as site search, showing why embedded agents need fast retrieval; deployed at eight conferences (Microsoft Build, Gartner, Adobe Summit and more), each in a week or less, with 733 cards claimed</w:t>
-      </w:r>
-    </w:p>
-    <w:p>
-      <w:pPr>
-        <w:numPr>
-          <w:ilvl w:val="0"/>
-          <w:numId w:val="1001"/>
-        </w:numPr>
-        <w:pStyle w:val="Compact"/>
-      </w:pPr>
-      <w:r>
-        <w:t xml:space="preserve">Launched the Algolia Discord from 0 to 2,000+ developers in a year; host Algolia DevCon, the annual developer conference, for five years, plus quarterly livestreams of 200-500 attendees</w:t>
-      </w:r>
-    </w:p>
-    <w:p>
-      <w:pPr>
-        <w:numPr>
-          <w:ilvl w:val="0"/>
-          <w:numId w:val="1001"/>
-        </w:numPr>
-        <w:pStyle w:val="Compact"/>
-      </w:pPr>
-      <w:r>
-        <w:t xml:space="preserve">Run live coding sessions, hackathons (with dev.to, Code &amp; Coffee and Hackernoon) and the Quick Start video embedded in the getting-started docs</w:t>
+        <w:t xml:space="preserve">March 2019 to August 2021</w:t>
+      </w:r>
+    </w:p>
+    <w:p>
+      <w:pPr>
+        <w:numPr>
+          <w:ilvl w:val="0"/>
+          <w:numId w:val="1002"/>
+        </w:numPr>
+        <w:pStyle w:val="Compact"/>
+      </w:pPr>
+      <w:r>
+        <w:t xml:space="preserve">Built the Developers Portal that streamlined partner onboarding, and maintained the product documentation for integration partners from single agencies to large enterprises</w:t>
+      </w:r>
+    </w:p>
+    <w:p>
+      <w:pPr>
+        <w:numPr>
+          <w:ilvl w:val="0"/>
+          <w:numId w:val="1002"/>
+        </w:numPr>
+        <w:pStyle w:val="Compact"/>
+      </w:pPr>
+      <w:r>
+        <w:t xml:space="preserve">Advocated for partner-requested enhancements with product teams, improving API usability</w:t>
+      </w:r>
+    </w:p>
+    <w:p>
+      <w:pPr>
+        <w:numPr>
+          <w:ilvl w:val="0"/>
+          <w:numId w:val="1002"/>
+        </w:numPr>
+        <w:pStyle w:val="Compact"/>
+      </w:pPr>
+      <w:r>
+        <w:t xml:space="preserve">Wrote coding examples and best practices for integration partners</w:t>
       </w:r>
     </w:p>
     <w:p>
@@ -403,13 +477,13 @@
           <w:bCs/>
           <w:b/>
         </w:rPr>
-        <w:t xml:space="preserve">Senior Engineer, Developer Relations and Integrations</w:t>
-      </w:r>
-      <w:r>
-        <w:t xml:space="preserve"> </w:t>
-      </w:r>
-      <w:r>
-        <w:t xml:space="preserve">| Bold Penguin |</w:t>
+        <w:t xml:space="preserve">Senior Developer Advocate, AWS CloudFormation</w:t>
+      </w:r>
+      <w:r>
+        <w:t xml:space="preserve"> </w:t>
+      </w:r>
+      <w:r>
+        <w:t xml:space="preserve">| Amazon Web Services |</w:t>
       </w:r>
       <w:r>
         <w:t xml:space="preserve"> </w:t>
@@ -419,43 +493,57 @@
           <w:iCs/>
           <w:i/>
         </w:rPr>
-        <w:t xml:space="preserve">March 2019 to August 2021</w:t>
-      </w:r>
-    </w:p>
-    <w:p>
-      <w:pPr>
-        <w:numPr>
-          <w:ilvl w:val="0"/>
-          <w:numId w:val="1002"/>
-        </w:numPr>
-        <w:pStyle w:val="Compact"/>
-      </w:pPr>
-      <w:r>
-        <w:t xml:space="preserve">Built the Developers Portal that streamlined partner onboarding, and maintained the product documentation for integration partners from single agencies to large enterprises</w:t>
-      </w:r>
-    </w:p>
-    <w:p>
-      <w:pPr>
-        <w:numPr>
-          <w:ilvl w:val="0"/>
-          <w:numId w:val="1002"/>
-        </w:numPr>
-        <w:pStyle w:val="Compact"/>
-      </w:pPr>
-      <w:r>
-        <w:t xml:space="preserve">Advocated for partner-requested enhancements with product teams, improving API usability</w:t>
-      </w:r>
-    </w:p>
-    <w:p>
-      <w:pPr>
-        <w:numPr>
-          <w:ilvl w:val="0"/>
-          <w:numId w:val="1002"/>
-        </w:numPr>
-        <w:pStyle w:val="Compact"/>
-      </w:pPr>
-      <w:r>
-        <w:t xml:space="preserve">Wrote coding examples and best practices for integration partners</w:t>
+        <w:t xml:space="preserve">August 2017 to March 2019</w:t>
+      </w:r>
+    </w:p>
+    <w:p>
+      <w:pPr>
+        <w:numPr>
+          <w:ilvl w:val="0"/>
+          <w:numId w:val="1003"/>
+        </w:numPr>
+        <w:pStyle w:val="Compact"/>
+      </w:pPr>
+      <w:r>
+        <w:t xml:space="preserve">Reported to the service director and represented the developer community in service team planning, influencing the roadmap</w:t>
+      </w:r>
+    </w:p>
+    <w:p>
+      <w:pPr>
+        <w:numPr>
+          <w:ilvl w:val="0"/>
+          <w:numId w:val="1003"/>
+        </w:numPr>
+        <w:pStyle w:val="Compact"/>
+      </w:pPr>
+      <w:r>
+        <w:t xml:space="preserve">One of the two founding developers of</w:t>
+      </w:r>
+      <w:r>
+        <w:t xml:space="preserve"> </w:t>
+      </w:r>
+      <w:hyperlink r:id="rId26">
+        <w:r>
+          <w:rPr>
+            <w:rStyle w:val="Hyperlink"/>
+          </w:rPr>
+          <w:t xml:space="preserve">cfn-lint</w:t>
+        </w:r>
+      </w:hyperlink>
+      <w:r>
+        <w:t xml:space="preserve">, the open source CloudFormation template linter (2,600+ GitHub stars, 11M+ monthly PyPI downloads today), including commissioning its logo and launch stickers</w:t>
+      </w:r>
+    </w:p>
+    <w:p>
+      <w:pPr>
+        <w:numPr>
+          <w:ilvl w:val="0"/>
+          <w:numId w:val="1003"/>
+        </w:numPr>
+        <w:pStyle w:val="Compact"/>
+      </w:pPr>
+      <w:r>
+        <w:t xml:space="preserve">Maintained CloudFormation’s other open source repositories, published best-practices content on the AWS management tools blog (including a guide to pre-commit validation with cfn-lint), and engaged enterprise customers at meetups and conferences</w:t>
       </w:r>
     </w:p>
     <w:p>
@@ -467,7 +555,7 @@
           <w:bCs/>
           <w:b/>
         </w:rPr>
-        <w:t xml:space="preserve">Senior Developer Advocate, AWS CloudFormation</w:t>
+        <w:t xml:space="preserve">Security Solution Architect</w:t>
       </w:r>
       <w:r>
         <w:t xml:space="preserve"> </w:t>
@@ -483,69 +571,19 @@
           <w:iCs/>
           <w:i/>
         </w:rPr>
-        <w:t xml:space="preserve">August 2017 to March 2019</w:t>
-      </w:r>
-    </w:p>
-    <w:p>
-      <w:pPr>
-        <w:numPr>
-          <w:ilvl w:val="0"/>
-          <w:numId w:val="1003"/>
-        </w:numPr>
-        <w:pStyle w:val="Compact"/>
-      </w:pPr>
-      <w:r>
-        <w:t xml:space="preserve">Reported to the service director and represented the developer community in service team planning, influencing the roadmap</w:t>
-      </w:r>
-    </w:p>
-    <w:p>
-      <w:pPr>
-        <w:numPr>
-          <w:ilvl w:val="0"/>
-          <w:numId w:val="1003"/>
-        </w:numPr>
-        <w:pStyle w:val="Compact"/>
-      </w:pPr>
-      <w:r>
-        <w:t xml:space="preserve">One of the two founding developers of</w:t>
-      </w:r>
-      <w:r>
-        <w:t xml:space="preserve"> </w:t>
-      </w:r>
-      <w:hyperlink r:id="rId25">
-        <w:r>
-          <w:rPr>
-            <w:rStyle w:val="Hyperlink"/>
-          </w:rPr>
-          <w:t xml:space="preserve">cfn-lint</w:t>
-        </w:r>
-      </w:hyperlink>
-      <w:r>
-        <w:t xml:space="preserve">, the open source CloudFormation template linter (2,600+ GitHub stars, 11M+ monthly PyPI downloads today), including commissioning its logo and launch stickers</w:t>
-      </w:r>
-    </w:p>
-    <w:p>
-      <w:pPr>
-        <w:numPr>
-          <w:ilvl w:val="0"/>
-          <w:numId w:val="1003"/>
-        </w:numPr>
-        <w:pStyle w:val="Compact"/>
-      </w:pPr>
-      <w:r>
-        <w:t xml:space="preserve">Maintained CloudFormation’s other open source repositories with an active contributor community</w:t>
-      </w:r>
-    </w:p>
-    <w:p>
-      <w:pPr>
-        <w:numPr>
-          <w:ilvl w:val="0"/>
-          <w:numId w:val="1003"/>
-        </w:numPr>
-        <w:pStyle w:val="Compact"/>
-      </w:pPr>
-      <w:r>
-        <w:t xml:space="preserve">Published best-practices content on the AWS management tools blog, including a guide to pre-commit validation with cfn-lint, and engaged enterprise customers at meetups and conferences on infrastructure as code</w:t>
+        <w:t xml:space="preserve">April 2016 to August 2017</w:t>
+      </w:r>
+    </w:p>
+    <w:p>
+      <w:pPr>
+        <w:numPr>
+          <w:ilvl w:val="0"/>
+          <w:numId w:val="1004"/>
+        </w:numPr>
+        <w:pStyle w:val="Compact"/>
+      </w:pPr>
+      <w:r>
+        <w:t xml:space="preserve">Advised CISOs and security teams across North America on cloud security posture and PCI, HIPAA and SOC compliance, and created AWS security labs for bootcamps and summits</w:t>
       </w:r>
     </w:p>
     <w:p>
@@ -557,7 +595,7 @@
           <w:bCs/>
           <w:b/>
         </w:rPr>
-        <w:t xml:space="preserve">Security Solution Architect</w:t>
+        <w:t xml:space="preserve">Senior Professional Services Consultant</w:t>
       </w:r>
       <w:r>
         <w:t xml:space="preserve"> </w:t>
@@ -573,58 +611,6 @@
           <w:iCs/>
           <w:i/>
         </w:rPr>
-        <w:t xml:space="preserve">April 2016 to August 2017</w:t>
-      </w:r>
-    </w:p>
-    <w:p>
-      <w:pPr>
-        <w:numPr>
-          <w:ilvl w:val="0"/>
-          <w:numId w:val="1004"/>
-        </w:numPr>
-        <w:pStyle w:val="Compact"/>
-      </w:pPr>
-      <w:r>
-        <w:t xml:space="preserve">Advised CISOs and security practitioners across North America on security posture, and on PCI, HIPAA and SOC compliance in the cloud</w:t>
-      </w:r>
-    </w:p>
-    <w:p>
-      <w:pPr>
-        <w:numPr>
-          <w:ilvl w:val="0"/>
-          <w:numId w:val="1004"/>
-        </w:numPr>
-        <w:pStyle w:val="Compact"/>
-      </w:pPr>
-      <w:r>
-        <w:t xml:space="preserve">Reviewed customer network topologies and created AWS security labs for bootcamps, summits and loft events</w:t>
-      </w:r>
-    </w:p>
-    <w:p>
-      <w:pPr>
-        <w:pStyle w:val="FirstParagraph"/>
-      </w:pPr>
-      <w:r>
-        <w:rPr>
-          <w:bCs/>
-          <w:b/>
-        </w:rPr>
-        <w:t xml:space="preserve">Senior Professional Services Consultant</w:t>
-      </w:r>
-      <w:r>
-        <w:t xml:space="preserve"> </w:t>
-      </w:r>
-      <w:r>
-        <w:t xml:space="preserve">| Amazon Web Services |</w:t>
-      </w:r>
-      <w:r>
-        <w:t xml:space="preserve"> </w:t>
-      </w:r>
-      <w:r>
-        <w:rPr>
-          <w:iCs/>
-          <w:i/>
-        </w:rPr>
         <w:t xml:space="preserve">July 2013 to April 2016</w:t>
       </w:r>
     </w:p>
@@ -637,22 +623,10 @@
         <w:pStyle w:val="Compact"/>
       </w:pPr>
       <w:r>
-        <w:t xml:space="preserve">Migrated large enterprises to AWS and integrated with on-premises systems through secure, repeatable deployments</w:t>
-      </w:r>
-    </w:p>
-    <w:p>
-      <w:pPr>
-        <w:numPr>
-          <w:ilvl w:val="0"/>
-          <w:numId w:val="1005"/>
-        </w:numPr>
-        <w:pStyle w:val="Compact"/>
-      </w:pPr>
-      <w:r>
-        <w:t xml:space="preserve">Built PCI-compliant infrastructure with Elastic Beanstalk, Packer, Puppet and CloudFormation, and a CI/CD pipeline for IAM governance with CodePipeline, Ansible and CloudFormation</w:t>
-      </w:r>
-    </w:p>
-    <w:bookmarkEnd w:id="26"/>
+        <w:t xml:space="preserve">Migrated large enterprises to AWS through secure, repeatable CI/CD, including PCI-compliant infrastructure and IAM governance pipelines</w:t>
+      </w:r>
+    </w:p>
+    <w:bookmarkEnd w:id="27"/>
     <w:bookmarkStart w:id="31" w:name="selected-projects"/>
     <w:p>
       <w:pPr>
@@ -670,7 +644,7 @@
         </w:numPr>
         <w:pStyle w:val="Compact"/>
       </w:pPr>
-      <w:hyperlink r:id="rId27">
+      <w:hyperlink r:id="rId28">
         <w:r>
           <w:rPr>
             <w:rStyle w:val="Hyperlink"/>
@@ -692,7 +666,7 @@
         </w:numPr>
         <w:pStyle w:val="Compact"/>
       </w:pPr>
-      <w:hyperlink r:id="rId28">
+      <w:hyperlink r:id="rId24">
         <w:r>
           <w:rPr>
             <w:rStyle w:val="Hyperlink"/>
@@ -703,7 +677,22 @@
         </w:r>
       </w:hyperlink>
       <w:r>
-        <w:t xml:space="preserve">: command-line tool for Algolia Agent Studio, from idea to working tool in a week</w:t>
+        <w:t xml:space="preserve">: command-line tool to create, snapshot, update and publish Agent Studio agents from version-controlled config, with</w:t>
+      </w:r>
+      <w:r>
+        <w:t xml:space="preserve"> </w:t>
+      </w:r>
+      <w:r>
+        <w:rPr>
+          <w:rStyle w:val="VerbatimChar"/>
+        </w:rPr>
+        <w:t xml:space="preserve">--json</w:t>
+      </w:r>
+      <w:r>
+        <w:t xml:space="preserve"> </w:t>
+      </w:r>
+      <w:r>
+        <w:t xml:space="preserve">output for scripts and agents</w:t>
       </w:r>
     </w:p>
     <w:p>

</xml_diff>

<commit_message>
Rewrite Bold Penguin bullets around the docs gap and onboarding time
Co-Authored-By: Claude Sonnet 5.5 <noreply@anthropic.com>
</commit_message>
<xml_diff>
--- a/output/chuck_meyer_resume.docx
+++ b/output/chuck_meyer_resume.docx
@@ -441,7 +441,7 @@
         <w:pStyle w:val="Compact"/>
       </w:pPr>
       <w:r>
-        <w:t xml:space="preserve">Built the Developers Portal that streamlined partner onboarding, and maintained the product documentation for integration partners from single agencies to large enterprises</w:t>
+        <w:t xml:space="preserve">Took partner documentation from nothing (a few snippets emailed to partners) to a published reference for the Exchange API, generated from an OpenAPI spec</w:t>
       </w:r>
     </w:p>
     <w:p>
@@ -453,7 +453,7 @@
         <w:pStyle w:val="Compact"/>
       </w:pPr>
       <w:r>
-        <w:t xml:space="preserve">Advocated for partner-requested enhancements with product teams, improving API usability</w:t>
+        <w:t xml:space="preserve">Built the code samples, integration guides and Developers Portal that let partners from single agencies to large enterprises integrate with less hand-holding, cutting the typical Exchange onboarding call from about 90 to 30 minutes</w:t>
       </w:r>
     </w:p>
     <w:p>
@@ -465,7 +465,7 @@
         <w:pStyle w:val="Compact"/>
       </w:pPr>
       <w:r>
-        <w:t xml:space="preserve">Wrote coding examples and best practices for integration partners</w:t>
+        <w:t xml:space="preserve">Advocated for partner-requested API enhancements with product teams, improving usability</w:t>
       </w:r>
     </w:p>
     <w:p>

</xml_diff>

<commit_message>
Split run-on bullets and tighten TCG, CLI and summary wording
Co-Authored-By: Claude Sonnet 5.5 <noreply@anthropic.com>
</commit_message>
<xml_diff>
--- a/output/chuck_meyer_resume.docx
+++ b/output/chuck_meyer_resume.docx
@@ -71,7 +71,7 @@
         <w:pStyle w:val="FirstParagraph"/>
       </w:pPr>
       <w:r>
-        <w:t xml:space="preserve">Developer Relations leader for small, embedded teams. At each company I look for the biggest gap between the product and the developers using it, then build what closes it: cfn-lint, a CloudFormation linter now downloaded 11M+ times a month; a partner integration portal; and, at Algolia, tooling and docs that work for agents as well as people. Then I work alongside the community, through live coding, hackathons and demos, to show it works.</w:t>
+        <w:t xml:space="preserve">Developer Relations leader for small, embedded teams. At each company I look for the biggest gap between the product and the developers using it, then build what closes it. That’s cfn-lint, a CloudFormation linter now downloaded 11M+ times a month; a partner integration portal that cut onboarding calls from about 90 to 30 minutes; and, at Algolia, tooling and docs that work for agents as well as people. Then I work alongside the community, through live coding, hackathons and demos, to show it works.</w:t>
       </w:r>
     </w:p>
     <w:bookmarkEnd w:id="22"/>
@@ -325,7 +325,7 @@
         <w:pStyle w:val="Compact"/>
       </w:pPr>
       <w:r>
-        <w:t xml:space="preserve">Wrote the engineering post mapping the rebuilt Algolia CLI’s agent-ready features (schema introspection, structured output, dry-run, scoped auth) to agent-first design principles, a top-five Algolia engineering post for February to August 2026</w:t>
+        <w:t xml:space="preserve">Wrote the post mapping the rebuilt Algolia CLI to agent-first design principles, a top-five Algolia engineering post for February to August 2026</w:t>
       </w:r>
     </w:p>
     <w:p>
@@ -351,7 +351,7 @@
         </w:r>
       </w:hyperlink>
       <w:r>
-        <w:t xml:space="preserve">, a tool for creating, snapshotting, updating and publishing Algolia agents from version-controlled config, from idea to working tool in a week</w:t>
+        <w:t xml:space="preserve">, a tool for creating, snapshotting, updating and publishing Algolia agents from version-controlled config, in a week</w:t>
       </w:r>
     </w:p>
     <w:p>
@@ -377,7 +377,7 @@
         </w:r>
       </w:hyperlink>
       <w:r>
-        <w:t xml:space="preserve">, a reusable booth demo where a multi-modal agent answers from the same Algolia index as site search, showing why embedded agents need fast retrieval; deployed at eight conferences, including Microsoft Build, Gartner and Adobe Summit, each in a week or less, with 733 cards claimed</w:t>
+        <w:t xml:space="preserve">, a booth demo where a multi-modal agent answers from the same Algolia index as site search, showing why embedded agents need fast retrieval</w:t>
       </w:r>
     </w:p>
     <w:p>
@@ -389,7 +389,31 @@
         <w:pStyle w:val="Compact"/>
       </w:pPr>
       <w:r>
-        <w:t xml:space="preserve">Launched the Algolia Discord from 0 to 2,000+ developers in a year; host Algolia DevCon, the annual developer conference, for five years, plus quarterly livestreams of 200-500 attendees</w:t>
+        <w:t xml:space="preserve">Deployed it at eight conferences, including Microsoft Build, Gartner and Adobe Summit, with 733 total cards claimed</w:t>
+      </w:r>
+    </w:p>
+    <w:p>
+      <w:pPr>
+        <w:numPr>
+          <w:ilvl w:val="0"/>
+          <w:numId w:val="1001"/>
+        </w:numPr>
+        <w:pStyle w:val="Compact"/>
+      </w:pPr>
+      <w:r>
+        <w:t xml:space="preserve">Launched the Algolia Discord from 0 to 2,000+ developers in a year</w:t>
+      </w:r>
+    </w:p>
+    <w:p>
+      <w:pPr>
+        <w:numPr>
+          <w:ilvl w:val="0"/>
+          <w:numId w:val="1001"/>
+        </w:numPr>
+        <w:pStyle w:val="Compact"/>
+      </w:pPr>
+      <w:r>
+        <w:t xml:space="preserve">Host Algolia DevCon, the annual developer conference, for five years, plus quarterly livestreams of 200-500 attendees</w:t>
       </w:r>
     </w:p>
     <w:p>
@@ -453,7 +477,19 @@
         <w:pStyle w:val="Compact"/>
       </w:pPr>
       <w:r>
-        <w:t xml:space="preserve">Built the code samples, integration guides and Developers Portal that let partners from single agencies to large enterprises integrate with less hand-holding, cutting the typical Exchange onboarding call from about 90 to 30 minutes</w:t>
+        <w:t xml:space="preserve">Built the code samples, integration guides and Developers Portal for partners from single agencies to large enterprises</w:t>
+      </w:r>
+    </w:p>
+    <w:p>
+      <w:pPr>
+        <w:numPr>
+          <w:ilvl w:val="0"/>
+          <w:numId w:val="1002"/>
+        </w:numPr>
+        <w:pStyle w:val="Compact"/>
+      </w:pPr>
+      <w:r>
+        <w:t xml:space="preserve">Cut the typical Exchange onboarding call from about 90 to 30 minutes</w:t>
       </w:r>
     </w:p>
     <w:p>
@@ -531,7 +567,7 @@
         </w:r>
       </w:hyperlink>
       <w:r>
-        <w:t xml:space="preserve">, the open source CloudFormation template linter (2,600+ GitHub stars, 11M+ monthly PyPI downloads today), including commissioning its logo and launch stickers</w:t>
+        <w:t xml:space="preserve">, the open source CloudFormation template linter now at 2,600+ GitHub stars and 11M+ monthly PyPI downloads; commissioned its logo and launch stickers</w:t>
       </w:r>
     </w:p>
     <w:p>
@@ -543,7 +579,19 @@
         <w:pStyle w:val="Compact"/>
       </w:pPr>
       <w:r>
-        <w:t xml:space="preserve">Maintained CloudFormation’s other open source repositories, published best-practices content on the AWS management tools blog (including a guide to pre-commit validation with cfn-lint), and engaged enterprise customers at meetups and conferences</w:t>
+        <w:t xml:space="preserve">Maintained CloudFormation’s other open source repositories with an active contributor community</w:t>
+      </w:r>
+    </w:p>
+    <w:p>
+      <w:pPr>
+        <w:numPr>
+          <w:ilvl w:val="0"/>
+          <w:numId w:val="1003"/>
+        </w:numPr>
+        <w:pStyle w:val="Compact"/>
+      </w:pPr>
+      <w:r>
+        <w:t xml:space="preserve">Published best-practices content on the AWS management tools blog, including a guide to pre-commit validation with cfn-lint, and engaged enterprise customers at meetups and conferences</w:t>
       </w:r>
     </w:p>
     <w:p>
@@ -655,7 +703,7 @@
         </w:r>
       </w:hyperlink>
       <w:r>
-        <w:t xml:space="preserve">: conference-booth demo of a multi-modal chat agent grounded in the same index that powers search, built with React/InstantSearch, Agent Studio with evals, a card scanner, and serverless APIs on Vercel and Supabase</w:t>
+        <w:t xml:space="preserve">: React/InstantSearch app with an Agent Studio chat agent and evals, a card scanner, and Vercel and Supabase APIs</w:t>
       </w:r>
     </w:p>
     <w:p>
@@ -677,7 +725,7 @@
         </w:r>
       </w:hyperlink>
       <w:r>
-        <w:t xml:space="preserve">: command-line tool to create, snapshot, update and publish Agent Studio agents from version-controlled config, with</w:t>
+        <w:t xml:space="preserve">: command-line tool for creating and publishing Agent Studio agents, with</w:t>
       </w:r>
       <w:r>
         <w:t xml:space="preserve"> </w:t>
@@ -692,7 +740,7 @@
         <w:t xml:space="preserve"> </w:t>
       </w:r>
       <w:r>
-        <w:t xml:space="preserve">output for scripts and agents</w:t>
+        <w:t xml:space="preserve">output</w:t>
       </w:r>
     </w:p>
     <w:p>

</xml_diff>

<commit_message>
Put TCG Search deployments and cards claimed in sub-bullets
Co-Authored-By: Claude Sonnet 5.5 <noreply@anthropic.com>
</commit_message>
<xml_diff>
--- a/output/chuck_meyer_resume.docx
+++ b/output/chuck_meyer_resume.docx
@@ -383,13 +383,25 @@
     <w:p>
       <w:pPr>
         <w:numPr>
-          <w:ilvl w:val="0"/>
-          <w:numId w:val="1001"/>
-        </w:numPr>
-        <w:pStyle w:val="Compact"/>
-      </w:pPr>
-      <w:r>
-        <w:t xml:space="preserve">Deployed it at eight conferences, including Microsoft Build, Gartner and Adobe Summit, with 733 total cards claimed</w:t>
+          <w:ilvl w:val="1"/>
+          <w:numId w:val="1002"/>
+        </w:numPr>
+        <w:pStyle w:val="Compact"/>
+      </w:pPr>
+      <w:r>
+        <w:t xml:space="preserve">Deployed at eight conferences (Microsoft Build, Gartner, Adobe Summit, eTail)</w:t>
+      </w:r>
+    </w:p>
+    <w:p>
+      <w:pPr>
+        <w:numPr>
+          <w:ilvl w:val="1"/>
+          <w:numId w:val="1002"/>
+        </w:numPr>
+        <w:pStyle w:val="Compact"/>
+      </w:pPr>
+      <w:r>
+        <w:t xml:space="preserve">733 total cards claimed</w:t>
       </w:r>
     </w:p>
     <w:p>
@@ -460,7 +472,7 @@
       <w:pPr>
         <w:numPr>
           <w:ilvl w:val="0"/>
-          <w:numId w:val="1002"/>
+          <w:numId w:val="1003"/>
         </w:numPr>
         <w:pStyle w:val="Compact"/>
       </w:pPr>
@@ -472,7 +484,7 @@
       <w:pPr>
         <w:numPr>
           <w:ilvl w:val="0"/>
-          <w:numId w:val="1002"/>
+          <w:numId w:val="1003"/>
         </w:numPr>
         <w:pStyle w:val="Compact"/>
       </w:pPr>
@@ -484,7 +496,7 @@
       <w:pPr>
         <w:numPr>
           <w:ilvl w:val="0"/>
-          <w:numId w:val="1002"/>
+          <w:numId w:val="1003"/>
         </w:numPr>
         <w:pStyle w:val="Compact"/>
       </w:pPr>
@@ -496,7 +508,7 @@
       <w:pPr>
         <w:numPr>
           <w:ilvl w:val="0"/>
-          <w:numId w:val="1002"/>
+          <w:numId w:val="1003"/>
         </w:numPr>
         <w:pStyle w:val="Compact"/>
       </w:pPr>
@@ -536,7 +548,7 @@
       <w:pPr>
         <w:numPr>
           <w:ilvl w:val="0"/>
-          <w:numId w:val="1003"/>
+          <w:numId w:val="1004"/>
         </w:numPr>
         <w:pStyle w:val="Compact"/>
       </w:pPr>
@@ -548,7 +560,7 @@
       <w:pPr>
         <w:numPr>
           <w:ilvl w:val="0"/>
-          <w:numId w:val="1003"/>
+          <w:numId w:val="1004"/>
         </w:numPr>
         <w:pStyle w:val="Compact"/>
       </w:pPr>
@@ -574,7 +586,7 @@
       <w:pPr>
         <w:numPr>
           <w:ilvl w:val="0"/>
-          <w:numId w:val="1003"/>
+          <w:numId w:val="1004"/>
         </w:numPr>
         <w:pStyle w:val="Compact"/>
       </w:pPr>
@@ -586,7 +598,7 @@
       <w:pPr>
         <w:numPr>
           <w:ilvl w:val="0"/>
-          <w:numId w:val="1003"/>
+          <w:numId w:val="1004"/>
         </w:numPr>
         <w:pStyle w:val="Compact"/>
       </w:pPr>
@@ -626,7 +638,7 @@
       <w:pPr>
         <w:numPr>
           <w:ilvl w:val="0"/>
-          <w:numId w:val="1004"/>
+          <w:numId w:val="1005"/>
         </w:numPr>
         <w:pStyle w:val="Compact"/>
       </w:pPr>
@@ -666,7 +678,7 @@
       <w:pPr>
         <w:numPr>
           <w:ilvl w:val="0"/>
-          <w:numId w:val="1005"/>
+          <w:numId w:val="1006"/>
         </w:numPr>
         <w:pStyle w:val="Compact"/>
       </w:pPr>
@@ -688,7 +700,7 @@
       <w:pPr>
         <w:numPr>
           <w:ilvl w:val="0"/>
-          <w:numId w:val="1006"/>
+          <w:numId w:val="1007"/>
         </w:numPr>
         <w:pStyle w:val="Compact"/>
       </w:pPr>
@@ -710,7 +722,7 @@
       <w:pPr>
         <w:numPr>
           <w:ilvl w:val="0"/>
-          <w:numId w:val="1006"/>
+          <w:numId w:val="1007"/>
         </w:numPr>
         <w:pStyle w:val="Compact"/>
       </w:pPr>
@@ -747,7 +759,7 @@
       <w:pPr>
         <w:numPr>
           <w:ilvl w:val="0"/>
-          <w:numId w:val="1006"/>
+          <w:numId w:val="1007"/>
         </w:numPr>
         <w:pStyle w:val="Compact"/>
       </w:pPr>
@@ -769,7 +781,7 @@
       <w:pPr>
         <w:numPr>
           <w:ilvl w:val="0"/>
-          <w:numId w:val="1006"/>
+          <w:numId w:val="1007"/>
         </w:numPr>
         <w:pStyle w:val="Compact"/>
       </w:pPr>
@@ -813,7 +825,7 @@
       <w:pPr>
         <w:numPr>
           <w:ilvl w:val="0"/>
-          <w:numId w:val="1007"/>
+          <w:numId w:val="1008"/>
         </w:numPr>
         <w:pStyle w:val="Compact"/>
       </w:pPr>
@@ -830,7 +842,7 @@
       <w:pPr>
         <w:numPr>
           <w:ilvl w:val="0"/>
-          <w:numId w:val="1007"/>
+          <w:numId w:val="1008"/>
         </w:numPr>
         <w:pStyle w:val="Compact"/>
       </w:pPr>
@@ -847,7 +859,7 @@
       <w:pPr>
         <w:numPr>
           <w:ilvl w:val="0"/>
-          <w:numId w:val="1007"/>
+          <w:numId w:val="1008"/>
         </w:numPr>
         <w:pStyle w:val="Compact"/>
       </w:pPr>
@@ -906,7 +918,7 @@
       <w:pPr>
         <w:numPr>
           <w:ilvl w:val="0"/>
-          <w:numId w:val="1007"/>
+          <w:numId w:val="1008"/>
         </w:numPr>
         <w:pStyle w:val="Compact"/>
       </w:pPr>
@@ -952,7 +964,7 @@
       <w:pPr>
         <w:numPr>
           <w:ilvl w:val="0"/>
-          <w:numId w:val="1008"/>
+          <w:numId w:val="1009"/>
         </w:numPr>
         <w:pStyle w:val="Compact"/>
       </w:pPr>
@@ -969,7 +981,7 @@
       <w:pPr>
         <w:numPr>
           <w:ilvl w:val="0"/>
-          <w:numId w:val="1008"/>
+          <w:numId w:val="1009"/>
         </w:numPr>
         <w:pStyle w:val="Compact"/>
       </w:pPr>
@@ -986,7 +998,7 @@
       <w:pPr>
         <w:numPr>
           <w:ilvl w:val="0"/>
-          <w:numId w:val="1008"/>
+          <w:numId w:val="1009"/>
         </w:numPr>
         <w:pStyle w:val="Compact"/>
       </w:pPr>
@@ -1009,7 +1021,7 @@
       <w:pPr>
         <w:numPr>
           <w:ilvl w:val="0"/>
-          <w:numId w:val="1008"/>
+          <w:numId w:val="1009"/>
         </w:numPr>
         <w:pStyle w:val="Compact"/>
       </w:pPr>
@@ -1032,7 +1044,7 @@
       <w:pPr>
         <w:numPr>
           <w:ilvl w:val="0"/>
-          <w:numId w:val="1008"/>
+          <w:numId w:val="1009"/>
         </w:numPr>
         <w:pStyle w:val="Compact"/>
       </w:pPr>
@@ -1298,6 +1310,9 @@
     <w:abstractNumId w:val="991"/>
   </w:num>
   <w:num w:numId="1008">
+    <w:abstractNumId w:val="991"/>
+  </w:num>
+  <w:num w:numId="1009">
     <w:abstractNumId w:val="991"/>
   </w:num>
 </w:numbering>

</xml_diff>

<commit_message>
Drop other CloudFormation open source repos bullet
Co-Authored-By: Claude Sonnet 5.5 <noreply@anthropic.com>
</commit_message>
<xml_diff>
--- a/output/chuck_meyer_resume.docx
+++ b/output/chuck_meyer_resume.docx
@@ -580,18 +580,6 @@
       </w:hyperlink>
       <w:r>
         <w:t xml:space="preserve">, the open source CloudFormation template linter now at 2,600+ GitHub stars and 11M+ monthly PyPI downloads; commissioned its logo and launch stickers</w:t>
-      </w:r>
-    </w:p>
-    <w:p>
-      <w:pPr>
-        <w:numPr>
-          <w:ilvl w:val="0"/>
-          <w:numId w:val="1004"/>
-        </w:numPr>
-        <w:pStyle w:val="Compact"/>
-      </w:pPr>
-      <w:r>
-        <w:t xml:space="preserve">Maintained CloudFormation’s other open source repositories with an active contributor community</w:t>
       </w:r>
     </w:p>
     <w:p>

</xml_diff>

<commit_message>
Split live coding and video bullets
Co-Authored-By: Claude Sonnet 5.5 <noreply@anthropic.com>
</commit_message>
<xml_diff>
--- a/output/chuck_meyer_resume.docx
+++ b/output/chuck_meyer_resume.docx
@@ -437,7 +437,19 @@
         <w:pStyle w:val="Compact"/>
       </w:pPr>
       <w:r>
-        <w:t xml:space="preserve">Run live coding sessions, hackathons (with dev.to, Code &amp; Coffee and Hackernoon) and the Quick Start video embedded in the getting-started docs</w:t>
+        <w:t xml:space="preserve">Run live coding sessions and hackathons (with dev.to, Code &amp; Coffee and Hackernoon)</w:t>
+      </w:r>
+    </w:p>
+    <w:p>
+      <w:pPr>
+        <w:numPr>
+          <w:ilvl w:val="0"/>
+          <w:numId w:val="1001"/>
+        </w:numPr>
+        <w:pStyle w:val="Compact"/>
+      </w:pPr>
+      <w:r>
+        <w:t xml:space="preserve">Produced developer videos, including the Quick Start video embedded in the getting-started docs</w:t>
       </w:r>
     </w:p>
     <w:p>

</xml_diff>

<commit_message>
Add Pokemon, drop duplicate projects and dev.to link, reword AWS roadmap line
Co-Authored-By: Claude Sonnet 5.5 <noreply@anthropic.com>
</commit_message>
<xml_diff>
--- a/output/chuck_meyer_resume.docx
+++ b/output/chuck_meyer_resume.docx
@@ -2,7 +2,7 @@
 <file path=word/document.xml><?xml version="1.0" encoding="utf-8"?>
 <w:document xmlns:w="http://schemas.openxmlformats.org/wordprocessingml/2006/main" xmlns:m="http://schemas.openxmlformats.org/officeDocument/2006/math" xmlns:r="http://schemas.openxmlformats.org/officeDocument/2006/relationships" xmlns:o="urn:schemas-microsoft-com:office:office" xmlns:v="urn:schemas-microsoft-com:vml" xmlns:w10="urn:schemas-microsoft-com:office:word" xmlns:a="http://schemas.openxmlformats.org/drawingml/2006/main" xmlns:pic="http://schemas.openxmlformats.org/drawingml/2006/picture" xmlns:wp="http://schemas.openxmlformats.org/drawingml/2006/wordprocessingDrawing">
   <w:body>
-    <w:bookmarkStart w:id="44" w:name="charles-chuck-meyer"/>
+    <w:bookmarkStart w:id="42" w:name="charles-chuck-meyer"/>
     <w:p>
       <w:pPr>
         <w:pStyle w:val="Heading1"/>
@@ -351,7 +351,7 @@
         </w:r>
       </w:hyperlink>
       <w:r>
-        <w:t xml:space="preserve">, a tool for creating, snapshotting, updating and publishing Algolia agents from version-controlled config, in a week</w:t>
+        <w:t xml:space="preserve">, a tool for creating, snapshotting, updating and publishing Algolia agents from version-controlled config</w:t>
       </w:r>
     </w:p>
     <w:p>
@@ -377,7 +377,7 @@
         </w:r>
       </w:hyperlink>
       <w:r>
-        <w:t xml:space="preserve">, a booth demo where a multi-modal agent answers from the same Algolia index as site search, showing why embedded agents need fast retrieval</w:t>
+        <w:t xml:space="preserve">, a Pokemon-card vending machine booth demo where a multi-modal agent answers from the same Algolia index as site search, showing why embedded agents need fast retrieval</w:t>
       </w:r>
     </w:p>
     <w:p>
@@ -565,7 +565,7 @@
         <w:pStyle w:val="Compact"/>
       </w:pPr>
       <w:r>
-        <w:t xml:space="preserve">Reported to the service director and represented the developer community in service team planning, influencing the roadmap</w:t>
+        <w:t xml:space="preserve">Reported to the service director and represented the developer community in service team planning, prioritizing service support</w:t>
       </w:r>
     </w:p>
     <w:p>
@@ -687,7 +687,7 @@
       </w:r>
     </w:p>
     <w:bookmarkEnd w:id="27"/>
-    <w:bookmarkStart w:id="31" w:name="selected-projects"/>
+    <w:bookmarkStart w:id="30" w:name="selected-projects"/>
     <w:p>
       <w:pPr>
         <w:pStyle w:val="Heading2"/>
@@ -705,65 +705,6 @@
         <w:pStyle w:val="Compact"/>
       </w:pPr>
       <w:hyperlink r:id="rId28">
-        <w:r>
-          <w:rPr>
-            <w:rStyle w:val="Hyperlink"/>
-            <w:bCs/>
-            <w:b/>
-          </w:rPr>
-          <w:t xml:space="preserve">Pokemon TCG Vending Machine Search</w:t>
-        </w:r>
-      </w:hyperlink>
-      <w:r>
-        <w:t xml:space="preserve">: React/InstantSearch app with an Agent Studio chat agent and evals, a card scanner, and Vercel and Supabase APIs</w:t>
-      </w:r>
-    </w:p>
-    <w:p>
-      <w:pPr>
-        <w:numPr>
-          <w:ilvl w:val="0"/>
-          <w:numId w:val="1007"/>
-        </w:numPr>
-        <w:pStyle w:val="Compact"/>
-      </w:pPr>
-      <w:hyperlink r:id="rId24">
-        <w:r>
-          <w:rPr>
-            <w:rStyle w:val="Hyperlink"/>
-            <w:bCs/>
-            <w:b/>
-          </w:rPr>
-          <w:t xml:space="preserve">Agent Studio CLI</w:t>
-        </w:r>
-      </w:hyperlink>
-      <w:r>
-        <w:t xml:space="preserve">: command-line tool for creating and publishing Agent Studio agents, with</w:t>
-      </w:r>
-      <w:r>
-        <w:t xml:space="preserve"> </w:t>
-      </w:r>
-      <w:r>
-        <w:rPr>
-          <w:rStyle w:val="VerbatimChar"/>
-        </w:rPr>
-        <w:t xml:space="preserve">--json</w:t>
-      </w:r>
-      <w:r>
-        <w:t xml:space="preserve"> </w:t>
-      </w:r>
-      <w:r>
-        <w:t xml:space="preserve">output</w:t>
-      </w:r>
-    </w:p>
-    <w:p>
-      <w:pPr>
-        <w:numPr>
-          <w:ilvl w:val="0"/>
-          <w:numId w:val="1007"/>
-        </w:numPr>
-        <w:pStyle w:val="Compact"/>
-      </w:pPr>
-      <w:hyperlink r:id="rId29">
         <w:r>
           <w:rPr>
             <w:rStyle w:val="Hyperlink"/>
@@ -785,7 +726,7 @@
         </w:numPr>
         <w:pStyle w:val="Compact"/>
       </w:pPr>
-      <w:hyperlink r:id="rId30">
+      <w:hyperlink r:id="rId29">
         <w:r>
           <w:rPr>
             <w:rStyle w:val="Hyperlink"/>
@@ -799,8 +740,8 @@
         <w:t xml:space="preserve">: minimal MCP server over Streamable HTTP, with a companion tutorial</w:t>
       </w:r>
     </w:p>
-    <w:bookmarkEnd w:id="31"/>
-    <w:bookmarkStart w:id="42" w:name="writing-and-speaking"/>
+    <w:bookmarkEnd w:id="30"/>
+    <w:bookmarkStart w:id="40" w:name="writing-and-speaking"/>
     <w:p>
       <w:pPr>
         <w:pStyle w:val="Heading2"/>
@@ -829,7 +770,7 @@
         </w:numPr>
         <w:pStyle w:val="Compact"/>
       </w:pPr>
-      <w:hyperlink r:id="rId32">
+      <w:hyperlink r:id="rId31">
         <w:r>
           <w:rPr>
             <w:rStyle w:val="Hyperlink"/>
@@ -846,7 +787,7 @@
         </w:numPr>
         <w:pStyle w:val="Compact"/>
       </w:pPr>
-      <w:hyperlink r:id="rId33">
+      <w:hyperlink r:id="rId32">
         <w:r>
           <w:rPr>
             <w:rStyle w:val="Hyperlink"/>
@@ -863,7 +804,7 @@
         </w:numPr>
         <w:pStyle w:val="Compact"/>
       </w:pPr>
-      <w:hyperlink r:id="rId34">
+      <w:hyperlink r:id="rId33">
         <w:r>
           <w:rPr>
             <w:rStyle w:val="Hyperlink"/>
@@ -922,7 +863,7 @@
         </w:numPr>
         <w:pStyle w:val="Compact"/>
       </w:pPr>
-      <w:hyperlink r:id="rId35">
+      <w:hyperlink r:id="rId34">
         <w:r>
           <w:rPr>
             <w:rStyle w:val="Hyperlink"/>
@@ -934,19 +875,8 @@
         <w:t xml:space="preserve"> </w:t>
       </w:r>
       <w:r>
-        <w:t xml:space="preserve">(AWS). More at</w:t>
-      </w:r>
-      <w:r>
-        <w:t xml:space="preserve"> </w:t>
-      </w:r>
-      <w:hyperlink r:id="rId36">
-        <w:r>
-          <w:rPr>
-            <w:rStyle w:val="Hyperlink"/>
-          </w:rPr>
-          <w:t xml:space="preserve">dev.to/chuckm</w:t>
-        </w:r>
-      </w:hyperlink>
+        <w:t xml:space="preserve">(AWS)</w:t>
+      </w:r>
     </w:p>
     <w:p>
       <w:pPr>
@@ -968,7 +898,7 @@
         </w:numPr>
         <w:pStyle w:val="Compact"/>
       </w:pPr>
-      <w:hyperlink r:id="rId37">
+      <w:hyperlink r:id="rId35">
         <w:r>
           <w:rPr>
             <w:rStyle w:val="Hyperlink"/>
@@ -985,7 +915,7 @@
         </w:numPr>
         <w:pStyle w:val="Compact"/>
       </w:pPr>
-      <w:hyperlink r:id="rId38">
+      <w:hyperlink r:id="rId36">
         <w:r>
           <w:rPr>
             <w:rStyle w:val="Hyperlink"/>
@@ -1002,7 +932,7 @@
         </w:numPr>
         <w:pStyle w:val="Compact"/>
       </w:pPr>
-      <w:hyperlink r:id="rId39">
+      <w:hyperlink r:id="rId37">
         <w:r>
           <w:rPr>
             <w:rStyle w:val="Hyperlink"/>
@@ -1025,7 +955,7 @@
         </w:numPr>
         <w:pStyle w:val="Compact"/>
       </w:pPr>
-      <w:hyperlink r:id="rId40">
+      <w:hyperlink r:id="rId38">
         <w:r>
           <w:rPr>
             <w:rStyle w:val="Hyperlink"/>
@@ -1048,7 +978,7 @@
         </w:numPr>
         <w:pStyle w:val="Compact"/>
       </w:pPr>
-      <w:hyperlink r:id="rId41">
+      <w:hyperlink r:id="rId39">
         <w:r>
           <w:rPr>
             <w:rStyle w:val="Hyperlink"/>
@@ -1057,8 +987,8 @@
         </w:r>
       </w:hyperlink>
     </w:p>
-    <w:bookmarkEnd w:id="42"/>
-    <w:bookmarkStart w:id="43" w:name="education"/>
+    <w:bookmarkEnd w:id="40"/>
+    <w:bookmarkStart w:id="41" w:name="education"/>
     <w:p>
       <w:pPr>
         <w:pStyle w:val="Heading2"/>
@@ -1101,8 +1031,8 @@
         <w:t xml:space="preserve">Northern Kentucky University | 1997</w:t>
       </w:r>
     </w:p>
-    <w:bookmarkEnd w:id="43"/>
-    <w:bookmarkEnd w:id="44"/>
+    <w:bookmarkEnd w:id="41"/>
+    <w:bookmarkEnd w:id="42"/>
     <w:sectPr/>
   </w:body>
 </w:document>

</xml_diff>

<commit_message>
Restore TCG Search and Agent Studio CLI under Selected Projects
Co-Authored-By: Claude Sonnet 5.5 <noreply@anthropic.com>
</commit_message>
<xml_diff>
--- a/output/chuck_meyer_resume.docx
+++ b/output/chuck_meyer_resume.docx
@@ -2,7 +2,7 @@
 <file path=word/document.xml><?xml version="1.0" encoding="utf-8"?>
 <w:document xmlns:w="http://schemas.openxmlformats.org/wordprocessingml/2006/main" xmlns:m="http://schemas.openxmlformats.org/officeDocument/2006/math" xmlns:r="http://schemas.openxmlformats.org/officeDocument/2006/relationships" xmlns:o="urn:schemas-microsoft-com:office:office" xmlns:v="urn:schemas-microsoft-com:vml" xmlns:w10="urn:schemas-microsoft-com:office:word" xmlns:a="http://schemas.openxmlformats.org/drawingml/2006/main" xmlns:pic="http://schemas.openxmlformats.org/drawingml/2006/picture" xmlns:wp="http://schemas.openxmlformats.org/drawingml/2006/wordprocessingDrawing">
   <w:body>
-    <w:bookmarkStart w:id="42" w:name="charles-chuck-meyer"/>
+    <w:bookmarkStart w:id="43" w:name="charles-chuck-meyer"/>
     <w:p>
       <w:pPr>
         <w:pStyle w:val="Heading1"/>
@@ -687,7 +687,7 @@
       </w:r>
     </w:p>
     <w:bookmarkEnd w:id="27"/>
-    <w:bookmarkStart w:id="30" w:name="selected-projects"/>
+    <w:bookmarkStart w:id="31" w:name="selected-projects"/>
     <w:p>
       <w:pPr>
         <w:pStyle w:val="Heading2"/>
@@ -705,6 +705,65 @@
         <w:pStyle w:val="Compact"/>
       </w:pPr>
       <w:hyperlink r:id="rId28">
+        <w:r>
+          <w:rPr>
+            <w:rStyle w:val="Hyperlink"/>
+            <w:bCs/>
+            <w:b/>
+          </w:rPr>
+          <w:t xml:space="preserve">Pokemon TCG Vending Machine Search</w:t>
+        </w:r>
+      </w:hyperlink>
+      <w:r>
+        <w:t xml:space="preserve">: React/InstantSearch app with an Agent Studio chat agent and evals, a card scanner, and Vercel and Supabase APIs</w:t>
+      </w:r>
+    </w:p>
+    <w:p>
+      <w:pPr>
+        <w:numPr>
+          <w:ilvl w:val="0"/>
+          <w:numId w:val="1007"/>
+        </w:numPr>
+        <w:pStyle w:val="Compact"/>
+      </w:pPr>
+      <w:hyperlink r:id="rId24">
+        <w:r>
+          <w:rPr>
+            <w:rStyle w:val="Hyperlink"/>
+            <w:bCs/>
+            <w:b/>
+          </w:rPr>
+          <w:t xml:space="preserve">Agent Studio CLI</w:t>
+        </w:r>
+      </w:hyperlink>
+      <w:r>
+        <w:t xml:space="preserve">: command-line tool for creating and publishing Agent Studio agents, with</w:t>
+      </w:r>
+      <w:r>
+        <w:t xml:space="preserve"> </w:t>
+      </w:r>
+      <w:r>
+        <w:rPr>
+          <w:rStyle w:val="VerbatimChar"/>
+        </w:rPr>
+        <w:t xml:space="preserve">--json</w:t>
+      </w:r>
+      <w:r>
+        <w:t xml:space="preserve"> </w:t>
+      </w:r>
+      <w:r>
+        <w:t xml:space="preserve">output</w:t>
+      </w:r>
+    </w:p>
+    <w:p>
+      <w:pPr>
+        <w:numPr>
+          <w:ilvl w:val="0"/>
+          <w:numId w:val="1007"/>
+        </w:numPr>
+        <w:pStyle w:val="Compact"/>
+      </w:pPr>
+      <w:hyperlink r:id="rId29">
         <w:r>
           <w:rPr>
             <w:rStyle w:val="Hyperlink"/>
@@ -726,7 +785,7 @@
         </w:numPr>
         <w:pStyle w:val="Compact"/>
       </w:pPr>
-      <w:hyperlink r:id="rId29">
+      <w:hyperlink r:id="rId30">
         <w:r>
           <w:rPr>
             <w:rStyle w:val="Hyperlink"/>
@@ -740,8 +799,8 @@
         <w:t xml:space="preserve">: minimal MCP server over Streamable HTTP, with a companion tutorial</w:t>
       </w:r>
     </w:p>
-    <w:bookmarkEnd w:id="30"/>
-    <w:bookmarkStart w:id="40" w:name="writing-and-speaking"/>
+    <w:bookmarkEnd w:id="31"/>
+    <w:bookmarkStart w:id="41" w:name="writing-and-speaking"/>
     <w:p>
       <w:pPr>
         <w:pStyle w:val="Heading2"/>
@@ -770,7 +829,7 @@
         </w:numPr>
         <w:pStyle w:val="Compact"/>
       </w:pPr>
-      <w:hyperlink r:id="rId31">
+      <w:hyperlink r:id="rId32">
         <w:r>
           <w:rPr>
             <w:rStyle w:val="Hyperlink"/>
@@ -787,7 +846,7 @@
         </w:numPr>
         <w:pStyle w:val="Compact"/>
       </w:pPr>
-      <w:hyperlink r:id="rId32">
+      <w:hyperlink r:id="rId33">
         <w:r>
           <w:rPr>
             <w:rStyle w:val="Hyperlink"/>
@@ -804,7 +863,7 @@
         </w:numPr>
         <w:pStyle w:val="Compact"/>
       </w:pPr>
-      <w:hyperlink r:id="rId33">
+      <w:hyperlink r:id="rId34">
         <w:r>
           <w:rPr>
             <w:rStyle w:val="Hyperlink"/>
@@ -863,7 +922,7 @@
         </w:numPr>
         <w:pStyle w:val="Compact"/>
       </w:pPr>
-      <w:hyperlink r:id="rId34">
+      <w:hyperlink r:id="rId35">
         <w:r>
           <w:rPr>
             <w:rStyle w:val="Hyperlink"/>
@@ -898,7 +957,7 @@
         </w:numPr>
         <w:pStyle w:val="Compact"/>
       </w:pPr>
-      <w:hyperlink r:id="rId35">
+      <w:hyperlink r:id="rId36">
         <w:r>
           <w:rPr>
             <w:rStyle w:val="Hyperlink"/>
@@ -915,7 +974,7 @@
         </w:numPr>
         <w:pStyle w:val="Compact"/>
       </w:pPr>
-      <w:hyperlink r:id="rId36">
+      <w:hyperlink r:id="rId37">
         <w:r>
           <w:rPr>
             <w:rStyle w:val="Hyperlink"/>
@@ -932,7 +991,7 @@
         </w:numPr>
         <w:pStyle w:val="Compact"/>
       </w:pPr>
-      <w:hyperlink r:id="rId37">
+      <w:hyperlink r:id="rId38">
         <w:r>
           <w:rPr>
             <w:rStyle w:val="Hyperlink"/>
@@ -955,7 +1014,7 @@
         </w:numPr>
         <w:pStyle w:val="Compact"/>
       </w:pPr>
-      <w:hyperlink r:id="rId38">
+      <w:hyperlink r:id="rId39">
         <w:r>
           <w:rPr>
             <w:rStyle w:val="Hyperlink"/>
@@ -978,7 +1037,7 @@
         </w:numPr>
         <w:pStyle w:val="Compact"/>
       </w:pPr>
-      <w:hyperlink r:id="rId39">
+      <w:hyperlink r:id="rId40">
         <w:r>
           <w:rPr>
             <w:rStyle w:val="Hyperlink"/>
@@ -987,8 +1046,8 @@
         </w:r>
       </w:hyperlink>
     </w:p>
-    <w:bookmarkEnd w:id="40"/>
-    <w:bookmarkStart w:id="41" w:name="education"/>
+    <w:bookmarkEnd w:id="41"/>
+    <w:bookmarkStart w:id="42" w:name="education"/>
     <w:p>
       <w:pPr>
         <w:pStyle w:val="Heading2"/>
@@ -1031,8 +1090,8 @@
         <w:t xml:space="preserve">Northern Kentucky University | 1997</w:t>
       </w:r>
     </w:p>
-    <w:bookmarkEnd w:id="41"/>
     <w:bookmarkEnd w:id="42"/>
+    <w:bookmarkEnd w:id="43"/>
     <w:sectPr/>
   </w:body>
 </w:document>

</xml_diff>

<commit_message>
Add years to writing, use Pokémon accent, sharpen summary ending
Co-Authored-By: Claude Sonnet 5.5 <noreply@anthropic.com>
</commit_message>
<xml_diff>
--- a/output/chuck_meyer_resume.docx
+++ b/output/chuck_meyer_resume.docx
@@ -71,7 +71,7 @@
         <w:pStyle w:val="FirstParagraph"/>
       </w:pPr>
       <w:r>
-        <w:t xml:space="preserve">Developer Relations leader for small, embedded teams. At each company I look for the biggest gap between the product and the developers using it, then build what closes it. That’s cfn-lint, a CloudFormation linter now downloaded 11M+ times a month; a partner integration portal that cut onboarding calls from about 90 to 30 minutes; and, at Algolia, tooling and docs that work for agents as well as people. Then I work alongside the community, through live coding, hackathons and demos, to show it works.</w:t>
+        <w:t xml:space="preserve">Developer Relations leader for small, embedded teams. At each company I look for the biggest gap between the product and the developers using it, then build what closes it. That’s cfn-lint, a CloudFormation linter now downloaded 11M+ times a month; a partner integration portal that cut onboarding calls from about 90 to 30 minutes; and, at Algolia, tooling and docs that work for agents as well as people. Then I prove it in the open, working alongside the community through live coding, hackathons and demos.</w:t>
       </w:r>
     </w:p>
     <w:bookmarkEnd w:id="22"/>
@@ -377,7 +377,7 @@
         </w:r>
       </w:hyperlink>
       <w:r>
-        <w:t xml:space="preserve">, a Pokemon-card vending machine booth demo where a multi-modal agent answers from the same Algolia index as site search, showing why embedded agents need fast retrieval</w:t>
+        <w:t xml:space="preserve">, a Pokémon-card vending machine booth demo where a multi-modal agent answers from the same Algolia index as site search, showing why embedded agents need fast retrieval</w:t>
       </w:r>
     </w:p>
     <w:p>
@@ -711,7 +711,7 @@
             <w:bCs/>
             <w:b/>
           </w:rPr>
-          <w:t xml:space="preserve">Pokemon TCG Vending Machine Search</w:t>
+          <w:t xml:space="preserve">Pokémon TCG Vending Machine Search</w:t>
         </w:r>
       </w:hyperlink>
       <w:r>
@@ -837,6 +837,12 @@
           <w:t xml:space="preserve">We rewrote the Algolia CLI for AI agents</w:t>
         </w:r>
       </w:hyperlink>
+      <w:r>
+        <w:t xml:space="preserve"> </w:t>
+      </w:r>
+      <w:r>
+        <w:t xml:space="preserve">(2026)</w:t>
+      </w:r>
     </w:p>
     <w:p>
       <w:pPr>
@@ -854,6 +860,12 @@
           <w:t xml:space="preserve">Chat, meet the Searchbox</w:t>
         </w:r>
       </w:hyperlink>
+      <w:r>
+        <w:t xml:space="preserve"> </w:t>
+      </w:r>
+      <w:r>
+        <w:t xml:space="preserve">(2026)</w:t>
+      </w:r>
     </w:p>
     <w:p>
       <w:pPr>
@@ -911,7 +923,7 @@
         <w:t xml:space="preserve"> </w:t>
       </w:r>
       <w:r>
-        <w:t xml:space="preserve">(my best-performing dev.to post since 2022)</w:t>
+        <w:t xml:space="preserve">(2026, my best-performing dev.to post since 2022)</w:t>
       </w:r>
     </w:p>
     <w:p>
@@ -934,7 +946,7 @@
         <w:t xml:space="preserve"> </w:t>
       </w:r>
       <w:r>
-        <w:t xml:space="preserve">(AWS)</w:t>
+        <w:t xml:space="preserve">(AWS, 2019)</w:t>
       </w:r>
     </w:p>
     <w:p>

</xml_diff>

<commit_message>
Name player-coach in the summary and tighten its Algolia bullet
Co-Authored-By: Claude Sonnet 5.5 <noreply@anthropic.com>
</commit_message>
<xml_diff>
--- a/output/chuck_meyer_resume.docx
+++ b/output/chuck_meyer_resume.docx
@@ -71,7 +71,7 @@
         <w:pStyle w:val="FirstParagraph"/>
       </w:pPr>
       <w:r>
-        <w:t xml:space="preserve">Developer Relations leader for small, embedded teams. At each company I look for the biggest gap between the product and the developers using it, then build what closes it. That’s cfn-lint, a CloudFormation linter now downloaded 11M+ times a month; a partner integration portal that cut onboarding calls from about 90 to 30 minutes; and, at Algolia, tooling and docs that work for agents as well as people. Then I prove it in the open, working alongside the community through live coding, hackathons and demos.</w:t>
+        <w:t xml:space="preserve">Player-coach Developer Relations leader for small, embedded teams. At each company I look for the biggest gap between the product and the developers using it, then build what closes it. That’s cfn-lint, a CloudFormation linter now downloaded 11M+ times a month; a partner integration portal that cut onboarding calls from about 90 to 30 minutes; and, at Algolia, tooling and docs that work for agents as well as people. Then I prove it in the open, working alongside the community through live coding, hackathons and demos.</w:t>
       </w:r>
     </w:p>
     <w:bookmarkEnd w:id="22"/>
@@ -301,7 +301,7 @@
         <w:pStyle w:val="Compact"/>
       </w:pPr>
       <w:r>
-        <w:t xml:space="preserve">Player-coach for the docs and developer advocacy teams (up to five reports) under Algolia’s Growth team: weekly 1:1s, content reviews and coaching, quarterly planning and reporting, and the annual review cycle, while shipping the work below</w:t>
+        <w:t xml:space="preserve">Player-coach for the docs and developer advocacy teams (up to five reports) under Algolia’s Growth team: weekly 1:1s, content reviews and coaching, quarterly planning and reporting, and the annual review cycle, building alongside the team on docs, agent tooling and demos</w:t>
       </w:r>
     </w:p>
     <w:p>

</xml_diff>

<commit_message>
Use Chuck Meyer as the resume name
Co-Authored-By: Claude Sonnet 5.5 <noreply@anthropic.com>
</commit_message>
<xml_diff>
--- a/output/chuck_meyer_resume.docx
+++ b/output/chuck_meyer_resume.docx
@@ -2,13 +2,13 @@
 <file path=word/document.xml><?xml version="1.0" encoding="utf-8"?>
 <w:document xmlns:w="http://schemas.openxmlformats.org/wordprocessingml/2006/main" xmlns:m="http://schemas.openxmlformats.org/officeDocument/2006/math" xmlns:r="http://schemas.openxmlformats.org/officeDocument/2006/relationships" xmlns:o="urn:schemas-microsoft-com:office:office" xmlns:v="urn:schemas-microsoft-com:vml" xmlns:w10="urn:schemas-microsoft-com:office:word" xmlns:a="http://schemas.openxmlformats.org/drawingml/2006/main" xmlns:pic="http://schemas.openxmlformats.org/drawingml/2006/picture" xmlns:wp="http://schemas.openxmlformats.org/drawingml/2006/wordprocessingDrawing">
   <w:body>
-    <w:bookmarkStart w:id="43" w:name="charles-chuck-meyer"/>
+    <w:bookmarkStart w:id="43" w:name="chuck-meyer"/>
     <w:p>
       <w:pPr>
         <w:pStyle w:val="Heading1"/>
       </w:pPr>
       <w:r>
-        <w:t xml:space="preserve">CHARLES (CHUCK) MEYER</w:t>
+        <w:t xml:space="preserve">CHUCK MEYER</w:t>
       </w:r>
     </w:p>
     <w:p>

</xml_diff>